<commit_message>
fix: corregir bloque Opción 2 que aparecía siempre en escrito de liquidación
- Agregar {%p if opción_2 %} / {%p endif %} en la plantilla Word
- Quitar endif huérfano que rompía el condicional
- Agregar ctx['opción_2'] en schemas.py para controlar la variable

Co-Authored-By: Claude Sonnet 4.6 <noreply@anthropic.com>
</commit_message>
<xml_diff>
--- a/datos/escritos_liquidacion/Modelo_Escrito_liquidacion.docx
+++ b/datos/escritos_liquidacion/Modelo_Escrito_liquidacion.docx
@@ -2589,28 +2589,50 @@
           <w:bCs/>
         </w:rPr>
       </w:pPr>
-      <w:r>
-        <w:rPr>
-          <w:b/>
-          <w:bCs/>
-        </w:rPr>
-        <w:t xml:space="preserve">{% </w:t>
-      </w:r>
-      <w:proofErr w:type="spellStart"/>
-      <w:r>
-        <w:rPr>
-          <w:b/>
-          <w:bCs/>
-        </w:rPr>
-        <w:t>endif</w:t>
-      </w:r>
-      <w:proofErr w:type="spellEnd"/>
-      <w:r>
-        <w:rPr>
-          <w:b/>
-          <w:bCs/>
-        </w:rPr>
-        <w:t xml:space="preserve"> %} </w:t>
+      <w:proofErr w:type="spellStart"/>
+      <w:proofErr w:type="spellEnd"/>
+      <w:proofErr w:type="spellStart"/>
+      <w:proofErr w:type="spellEnd"/>
+      <w:r>
+        <w:rPr>
+          <w:sz w:val="2"/>
+          <w:szCs w:val="2"/>
+          <w:color w:val="FFFFFF"/>
+        </w:rPr>
+        <w:t>{%p if opción_2 %}</w:t>
+      </w:r>
+    </w:p>
+    <w:p>
+      <w:pPr>
+        <w:autoSpaceDE w:val="0"/>
+        <w:autoSpaceDN w:val="0"/>
+        <w:adjustRightInd w:val="0"/>
+        <w:ind w:firstLine="1134"/>
+        <w:jc w:val="both"/>
+        <w:rPr>
+          <w:b/>
+          <w:bCs/>
+        </w:rPr>
+      </w:pPr>
+      <w:r>
+        <w:rPr>
+          <w:b/>
+          <w:bCs/>
+        </w:rPr>
+      </w:r>
+      <w:proofErr w:type="spellStart"/>
+      <w:r>
+        <w:rPr>
+          <w:b/>
+          <w:bCs/>
+        </w:rPr>
+      </w:r>
+      <w:proofErr w:type="spellEnd"/>
+      <w:r>
+        <w:rPr>
+          <w:b/>
+          <w:bCs/>
+        </w:rPr>
       </w:r>
       <w:r>
         <w:rPr>
@@ -3184,6 +3206,22 @@
         <w:adjustRightInd w:val="0"/>
         <w:jc w:val="both"/>
       </w:pPr>
+    </w:p>
+    <w:p>
+      <w:pPr>
+        <w:autoSpaceDE w:val="0"/>
+        <w:autoSpaceDN w:val="0"/>
+        <w:adjustRightInd w:val="0"/>
+        <w:jc w:val="both"/>
+      </w:pPr>
+      <w:r>
+        <w:rPr>
+          <w:sz w:val="2"/>
+          <w:szCs w:val="2"/>
+          <w:color w:val="FFFFFF"/>
+        </w:rPr>
+        <w:t>{%p endif %}</w:t>
+      </w:r>
     </w:p>
     <w:p>
       <w:pPr>

</xml_diff>

<commit_message>
fix: limpiar condicional duplicado de Opción 2 en plantilla de liquidación
Co-Authored-By: Claude Sonnet 4.6 <noreply@anthropic.com>
</commit_message>
<xml_diff>
--- a/datos/escritos_liquidacion/Modelo_Escrito_liquidacion.docx
+++ b/datos/escritos_liquidacion/Modelo_Escrito_liquidacion.docx
@@ -21,46 +21,44 @@
           <w:bCs/>
           <w:u w:val="single"/>
         </w:rPr>
-        <w:t>{%</w:t>
-      </w:r>
-      <w:proofErr w:type="spellStart"/>
-      <w:r>
+        <w:t>{%if impugnación%}</w:t>
+      </w:r>
+    </w:p>
+    <w:p>
+      <w:pPr>
+        <w:autoSpaceDE w:val="0"/>
+        <w:autoSpaceDN w:val="0"/>
+        <w:adjustRightInd w:val="0"/>
+        <w:jc w:val="both"/>
         <w:rPr>
           <w:b/>
           <w:bCs/>
           <w:u w:val="single"/>
         </w:rPr>
-        <w:t>if</w:t>
-      </w:r>
-      <w:proofErr w:type="spellEnd"/>
+      </w:pPr>
       <w:r>
         <w:rPr>
           <w:b/>
           <w:bCs/>
           <w:u w:val="single"/>
         </w:rPr>
-        <w:t xml:space="preserve"> impugnación%}</w:t>
-      </w:r>
-    </w:p>
-    <w:p>
-      <w:pPr>
-        <w:autoSpaceDE w:val="0"/>
-        <w:autoSpaceDN w:val="0"/>
-        <w:adjustRightInd w:val="0"/>
-        <w:jc w:val="both"/>
+        <w:t>Impugno</w:t>
+      </w:r>
+      <w:r>
         <w:rPr>
           <w:b/>
           <w:bCs/>
           <w:u w:val="single"/>
         </w:rPr>
-      </w:pPr>
+        <w:t xml:space="preserve">. </w:t>
+      </w:r>
       <w:r>
         <w:rPr>
           <w:b/>
           <w:bCs/>
           <w:u w:val="single"/>
         </w:rPr>
-        <w:t>Impugno</w:t>
+        <w:t>A</w:t>
       </w:r>
       <w:r>
         <w:rPr>
@@ -68,7 +66,7 @@
           <w:bCs/>
           <w:u w:val="single"/>
         </w:rPr>
-        <w:t xml:space="preserve">. </w:t>
+        <w:t>djunto planilla de liquidación</w:t>
       </w:r>
       <w:r>
         <w:rPr>
@@ -76,23 +74,28 @@
           <w:bCs/>
           <w:u w:val="single"/>
         </w:rPr>
-        <w:t>A</w:t>
-      </w:r>
-      <w:r>
+        <w:t xml:space="preserve"> por diferencias</w:t>
+      </w:r>
+    </w:p>
+    <w:p>
+      <w:pPr>
+        <w:autoSpaceDE w:val="0"/>
+        <w:autoSpaceDN w:val="0"/>
+        <w:adjustRightInd w:val="0"/>
+        <w:jc w:val="both"/>
         <w:rPr>
           <w:b/>
           <w:bCs/>
           <w:u w:val="single"/>
         </w:rPr>
-        <w:t>djunto planilla de liquidación</w:t>
-      </w:r>
+      </w:pPr>
       <w:r>
         <w:rPr>
           <w:b/>
           <w:bCs/>
           <w:u w:val="single"/>
         </w:rPr>
-        <w:t xml:space="preserve"> por diferencias</w:t>
+        <w:t>{% endif %}</w:t>
       </w:r>
     </w:p>
     <w:p>
@@ -113,365 +116,225 @@
           <w:bCs/>
           <w:u w:val="single"/>
         </w:rPr>
-        <w:t xml:space="preserve">{% </w:t>
-      </w:r>
-      <w:proofErr w:type="spellStart"/>
-      <w:r>
+        <w:t>{%if readecuación%}</w:t>
+      </w:r>
+    </w:p>
+    <w:p>
+      <w:pPr>
+        <w:autoSpaceDE w:val="0"/>
+        <w:autoSpaceDN w:val="0"/>
+        <w:adjustRightInd w:val="0"/>
+        <w:jc w:val="both"/>
         <w:rPr>
           <w:b/>
           <w:bCs/>
           <w:u w:val="single"/>
         </w:rPr>
-        <w:t>endif</w:t>
-      </w:r>
-      <w:proofErr w:type="spellEnd"/>
+      </w:pPr>
       <w:r>
         <w:rPr>
           <w:b/>
           <w:bCs/>
           <w:u w:val="single"/>
         </w:rPr>
-        <w:t xml:space="preserve"> %}</w:t>
-      </w:r>
-    </w:p>
-    <w:p>
-      <w:pPr>
-        <w:autoSpaceDE w:val="0"/>
-        <w:autoSpaceDN w:val="0"/>
-        <w:adjustRightInd w:val="0"/>
-        <w:jc w:val="both"/>
+        <w:t>Readecuo. Adjunto planilla de liquidación por diferencias</w:t>
+      </w:r>
+    </w:p>
+    <w:p>
+      <w:pPr>
+        <w:autoSpaceDE w:val="0"/>
+        <w:autoSpaceDN w:val="0"/>
+        <w:adjustRightInd w:val="0"/>
+        <w:jc w:val="both"/>
+      </w:pPr>
+      <w:r>
+        <w:t>{% endif %}</w:t>
+      </w:r>
+    </w:p>
+    <w:p>
+      <w:pPr>
+        <w:autoSpaceDE w:val="0"/>
+        <w:autoSpaceDN w:val="0"/>
+        <w:adjustRightInd w:val="0"/>
+        <w:jc w:val="both"/>
+      </w:pPr>
+      <w:r>
+        <w:t>{%if primera_vez%}</w:t>
+      </w:r>
+    </w:p>
+    <w:p>
+      <w:pPr>
+        <w:autoSpaceDE w:val="0"/>
+        <w:autoSpaceDN w:val="0"/>
+        <w:adjustRightInd w:val="0"/>
+        <w:jc w:val="both"/>
+      </w:pPr>
+      <w:r>
         <w:rPr>
           <w:b/>
           <w:bCs/>
           <w:u w:val="single"/>
         </w:rPr>
-      </w:pPr>
-      <w:r>
-        <w:rPr>
-          <w:b/>
-          <w:bCs/>
-          <w:u w:val="single"/>
-        </w:rPr>
-        <w:t>{%</w:t>
-      </w:r>
-      <w:proofErr w:type="spellStart"/>
-      <w:r>
-        <w:rPr>
-          <w:b/>
-          <w:bCs/>
-          <w:u w:val="single"/>
-        </w:rPr>
-        <w:t>if</w:t>
-      </w:r>
-      <w:proofErr w:type="spellEnd"/>
-      <w:r>
-        <w:rPr>
-          <w:b/>
-          <w:bCs/>
-          <w:u w:val="single"/>
-        </w:rPr>
-        <w:t xml:space="preserve"> readecuación%}</w:t>
-      </w:r>
-    </w:p>
-    <w:p>
-      <w:pPr>
-        <w:autoSpaceDE w:val="0"/>
-        <w:autoSpaceDN w:val="0"/>
-        <w:adjustRightInd w:val="0"/>
-        <w:jc w:val="both"/>
-        <w:rPr>
-          <w:b/>
-          <w:bCs/>
-          <w:u w:val="single"/>
-        </w:rPr>
-      </w:pPr>
-      <w:r>
-        <w:rPr>
-          <w:b/>
-          <w:bCs/>
-          <w:u w:val="single"/>
-        </w:rPr>
-        <w:t>Readecuo. Adjunto planilla de liquidación por diferencias</w:t>
-      </w:r>
-    </w:p>
-    <w:p>
-      <w:pPr>
-        <w:autoSpaceDE w:val="0"/>
-        <w:autoSpaceDN w:val="0"/>
-        <w:adjustRightInd w:val="0"/>
-        <w:jc w:val="both"/>
-      </w:pPr>
-      <w:r>
-        <w:t xml:space="preserve">{% </w:t>
-      </w:r>
-      <w:proofErr w:type="spellStart"/>
-      <w:r>
-        <w:t>endif</w:t>
-      </w:r>
-      <w:proofErr w:type="spellEnd"/>
-      <w:r>
-        <w:t xml:space="preserve"> %}</w:t>
-      </w:r>
-    </w:p>
-    <w:p>
-      <w:pPr>
-        <w:autoSpaceDE w:val="0"/>
-        <w:autoSpaceDN w:val="0"/>
-        <w:adjustRightInd w:val="0"/>
-        <w:jc w:val="both"/>
-      </w:pPr>
-      <w:r>
-        <w:t>{%</w:t>
-      </w:r>
-      <w:proofErr w:type="spellStart"/>
-      <w:r>
-        <w:t>if</w:t>
-      </w:r>
-      <w:proofErr w:type="spellEnd"/>
+        <w:t>Adjunto planilla de liquidación por diferencias</w:t>
+      </w:r>
+    </w:p>
+    <w:p>
+      <w:pPr>
+        <w:autoSpaceDE w:val="0"/>
+        <w:autoSpaceDN w:val="0"/>
+        <w:adjustRightInd w:val="0"/>
+        <w:jc w:val="both"/>
+      </w:pPr>
+      <w:r>
+        <w:t>{% endif %}</w:t>
+      </w:r>
+    </w:p>
+    <w:p>
+      <w:pPr>
+        <w:autoSpaceDE w:val="0"/>
+        <w:autoSpaceDN w:val="0"/>
+        <w:adjustRightInd w:val="0"/>
+        <w:jc w:val="both"/>
+      </w:pPr>
+    </w:p>
+    <w:p>
+      <w:pPr>
+        <w:autoSpaceDE w:val="0"/>
+        <w:autoSpaceDN w:val="0"/>
+        <w:adjustRightInd w:val="0"/>
+        <w:jc w:val="both"/>
+      </w:pPr>
+      <w:r>
+        <w:t>Señor Juez:</w:t>
+      </w:r>
+    </w:p>
+    <w:p>
+      <w:pPr>
+        <w:autoSpaceDE w:val="0"/>
+        <w:autoSpaceDN w:val="0"/>
+        <w:adjustRightInd w:val="0"/>
+        <w:ind w:firstLine="1134"/>
+        <w:jc w:val="both"/>
+      </w:pPr>
+      <w:r>
+        <w:t>Julia Tamara Toyos</w:t>
+      </w:r>
+      <w:r>
+        <w:t xml:space="preserve">, en mi carácter de </w:t>
+      </w:r>
+      <w:r>
+        <w:t>apoderada</w:t>
+      </w:r>
+      <w:r>
+        <w:t xml:space="preserve"> de la parte actora, con</w:t>
+      </w:r>
+      <w:r>
+        <w:t>stituyendo</w:t>
+      </w:r>
       <w:r>
         <w:t xml:space="preserve"> </w:t>
       </w:r>
-      <w:proofErr w:type="spellStart"/>
-      <w:r>
-        <w:t>primera_vez</w:t>
-      </w:r>
-      <w:proofErr w:type="spellEnd"/>
-      <w:r>
-        <w:t>%}</w:t>
-      </w:r>
-    </w:p>
-    <w:p>
-      <w:pPr>
-        <w:autoSpaceDE w:val="0"/>
-        <w:autoSpaceDN w:val="0"/>
-        <w:adjustRightInd w:val="0"/>
-        <w:jc w:val="both"/>
-      </w:pPr>
-      <w:r>
-        <w:rPr>
-          <w:b/>
-          <w:bCs/>
-          <w:u w:val="single"/>
-        </w:rPr>
-        <w:t>Adjunto planilla de liquidación por diferencias</w:t>
-      </w:r>
-    </w:p>
-    <w:p>
-      <w:pPr>
-        <w:autoSpaceDE w:val="0"/>
-        <w:autoSpaceDN w:val="0"/>
-        <w:adjustRightInd w:val="0"/>
-        <w:jc w:val="both"/>
-      </w:pPr>
-      <w:r>
-        <w:t xml:space="preserve">{% </w:t>
-      </w:r>
-      <w:proofErr w:type="spellStart"/>
-      <w:r>
-        <w:t>endif</w:t>
-      </w:r>
-      <w:proofErr w:type="spellEnd"/>
-      <w:r>
-        <w:t xml:space="preserve"> %}</w:t>
-      </w:r>
-    </w:p>
-    <w:p>
-      <w:pPr>
-        <w:autoSpaceDE w:val="0"/>
-        <w:autoSpaceDN w:val="0"/>
-        <w:adjustRightInd w:val="0"/>
-        <w:jc w:val="both"/>
-      </w:pPr>
-    </w:p>
-    <w:p>
-      <w:pPr>
-        <w:autoSpaceDE w:val="0"/>
-        <w:autoSpaceDN w:val="0"/>
-        <w:adjustRightInd w:val="0"/>
-        <w:jc w:val="both"/>
-      </w:pPr>
-      <w:r>
-        <w:t>Señor Juez:</w:t>
-      </w:r>
-    </w:p>
-    <w:p>
-      <w:pPr>
-        <w:autoSpaceDE w:val="0"/>
-        <w:autoSpaceDN w:val="0"/>
-        <w:adjustRightInd w:val="0"/>
-        <w:ind w:firstLine="1134"/>
-        <w:jc w:val="both"/>
-      </w:pPr>
-      <w:r>
-        <w:t>Julia Tamara Toyos</w:t>
-      </w:r>
-      <w:r>
-        <w:t xml:space="preserve">, en mi carácter de </w:t>
-      </w:r>
-      <w:r>
-        <w:t>apoderada</w:t>
-      </w:r>
-      <w:r>
-        <w:t xml:space="preserve"> de la parte actora, con</w:t>
-      </w:r>
-      <w:r>
-        <w:t>stituyendo</w:t>
+      <w:r>
+        <w:t xml:space="preserve">domicilio legal </w:t>
+      </w:r>
+      <w:r>
+        <w:t>en</w:t>
       </w:r>
       <w:r>
         <w:t xml:space="preserve"> </w:t>
       </w:r>
       <w:r>
-        <w:t xml:space="preserve">domicilio legal </w:t>
-      </w:r>
-      <w:r>
-        <w:t>en</w:t>
+        <w:t xml:space="preserve">calle </w:t>
+      </w:r>
+      <w:r>
+        <w:t xml:space="preserve">Belgrano </w:t>
+      </w:r>
+      <w:r>
+        <w:t xml:space="preserve">Nº </w:t>
+      </w:r>
+      <w:r>
+        <w:t>1188</w:t>
+      </w:r>
+      <w:r>
+        <w:t xml:space="preserve"> de esta ciudad de Salta</w:t>
+      </w:r>
+      <w:r>
+        <w:t xml:space="preserve">, domicilio electrónico registrado bajo el </w:t>
+      </w:r>
+      <w:r>
+        <w:t>CUIL</w:t>
+      </w:r>
+      <w:r>
+        <w:t xml:space="preserve"> 27</w:t>
+      </w:r>
+      <w:r>
+        <w:t>-</w:t>
+      </w:r>
+      <w:r>
+        <w:t>26685280</w:t>
+      </w:r>
+      <w:r>
+        <w:t>-</w:t>
+      </w:r>
+      <w:r>
+        <w:t>6</w:t>
       </w:r>
       <w:r>
         <w:t xml:space="preserve"> </w:t>
       </w:r>
       <w:r>
-        <w:t xml:space="preserve">calle </w:t>
-      </w:r>
-      <w:r>
-        <w:t xml:space="preserve">Belgrano </w:t>
-      </w:r>
-      <w:proofErr w:type="spellStart"/>
-      <w:r>
-        <w:t>Nº</w:t>
-      </w:r>
-      <w:proofErr w:type="spellEnd"/>
-      <w:r>
+        <w:t xml:space="preserve">en autos caratulados </w:t>
+      </w:r>
+      <w:r>
+        <w:rPr>
+          <w:b/>
+          <w:bCs/>
+        </w:rPr>
+        <w:t>“</w:t>
+      </w:r>
+      <w:r>
+        <w:rPr>
+          <w:b/>
+          <w:bCs/>
+        </w:rPr>
+        <w:t>{{nombre_caratula}}</w:t>
+      </w:r>
+      <w:r>
+        <w:rPr>
+          <w:b/>
+          <w:bCs/>
+        </w:rPr>
+        <w:t>”</w:t>
+      </w:r>
+      <w:r>
+        <w:rPr>
+          <w:b/>
+          <w:bCs/>
+        </w:rPr>
         <w:t xml:space="preserve"> </w:t>
       </w:r>
       <w:r>
-        <w:t>1188</w:t>
-      </w:r>
-      <w:r>
-        <w:t xml:space="preserve"> de esta ciudad de Salta</w:t>
-      </w:r>
-      <w:r>
-        <w:t xml:space="preserve">, domicilio electrónico registrado bajo el </w:t>
-      </w:r>
-      <w:r>
-        <w:t>CUIL</w:t>
-      </w:r>
-      <w:r>
-        <w:t xml:space="preserve"> 27</w:t>
-      </w:r>
-      <w:r>
-        <w:t>-</w:t>
-      </w:r>
-      <w:r>
-        <w:t>26685280</w:t>
-      </w:r>
-      <w:r>
-        <w:t>-</w:t>
-      </w:r>
-      <w:r>
-        <w:t>6</w:t>
-      </w:r>
-      <w:r>
-        <w:t xml:space="preserve"> </w:t>
-      </w:r>
-      <w:r>
-        <w:t xml:space="preserve">en autos caratulados </w:t>
-      </w:r>
-      <w:r>
-        <w:rPr>
-          <w:b/>
-          <w:bCs/>
-        </w:rPr>
-        <w:t>“</w:t>
-      </w:r>
-      <w:r>
-        <w:rPr>
-          <w:b/>
-          <w:bCs/>
-        </w:rPr>
-        <w:t>{{</w:t>
-      </w:r>
-      <w:proofErr w:type="spellStart"/>
-      <w:r>
-        <w:rPr>
-          <w:b/>
-          <w:bCs/>
-        </w:rPr>
-        <w:t>nombre_caratula</w:t>
-      </w:r>
-      <w:proofErr w:type="spellEnd"/>
-      <w:r>
-        <w:rPr>
-          <w:b/>
-          <w:bCs/>
-        </w:rPr>
-        <w:t>}}</w:t>
-      </w:r>
-      <w:r>
-        <w:rPr>
-          <w:b/>
-          <w:bCs/>
-        </w:rPr>
-        <w:t>”</w:t>
-      </w:r>
-      <w:r>
-        <w:rPr>
-          <w:b/>
-          <w:bCs/>
-        </w:rPr>
-        <w:t xml:space="preserve"> </w:t>
-      </w:r>
-      <w:proofErr w:type="spellStart"/>
-      <w:r>
         <w:rPr>
           <w:b/>
           <w:bCs/>
         </w:rPr>
         <w:t>Expte</w:t>
       </w:r>
-      <w:proofErr w:type="spellEnd"/>
-      <w:r>
-        <w:t xml:space="preserve">. </w:t>
-      </w:r>
-      <w:proofErr w:type="spellStart"/>
-      <w:r>
-        <w:t>Nº</w:t>
-      </w:r>
-      <w:proofErr w:type="spellEnd"/>
-      <w:r>
-        <w:t xml:space="preserve"> </w:t>
-      </w:r>
-      <w:r>
-        <w:t>{{</w:t>
-      </w:r>
-      <w:proofErr w:type="spellStart"/>
-      <w:r>
-        <w:t>numero_expte</w:t>
-      </w:r>
-      <w:proofErr w:type="spellEnd"/>
-      <w:proofErr w:type="gramStart"/>
-      <w:r>
-        <w:t>}}</w:t>
+      <w:r>
+        <w:t xml:space="preserve">. Nº </w:t>
+      </w:r>
+      <w:r>
+        <w:t>{{numero_expte}}</w:t>
       </w:r>
       <w:r>
         <w:t>/</w:t>
       </w:r>
-      <w:proofErr w:type="gramEnd"/>
-      <w:r>
-        <w:t>{{</w:t>
-      </w:r>
-      <w:proofErr w:type="spellStart"/>
-      <w:r>
-        <w:t>año_expte</w:t>
-      </w:r>
-      <w:proofErr w:type="spellEnd"/>
-      <w:proofErr w:type="gramStart"/>
-      <w:r>
-        <w:t>}}</w:t>
+      <w:r>
+        <w:t>{{año_expte}}</w:t>
       </w:r>
       <w:r>
         <w:t>a</w:t>
       </w:r>
-      <w:proofErr w:type="gramEnd"/>
       <w:r>
         <w:t xml:space="preserve"> V.S. muy respetuosamente digo:</w:t>
       </w:r>
@@ -504,7 +367,6 @@
       <w:r>
         <w:t xml:space="preserve"> </w:t>
       </w:r>
-      <w:proofErr w:type="gramStart"/>
       <w:r>
         <w:rPr>
           <w:b/>
@@ -517,31 +379,7 @@
           <w:b/>
           <w:bCs/>
         </w:rPr>
-        <w:t xml:space="preserve">  {</w:t>
-      </w:r>
-      <w:proofErr w:type="gramEnd"/>
-      <w:r>
-        <w:rPr>
-          <w:b/>
-          <w:bCs/>
-        </w:rPr>
-        <w:t>%</w:t>
-      </w:r>
-      <w:proofErr w:type="spellStart"/>
-      <w:r>
-        <w:rPr>
-          <w:b/>
-          <w:bCs/>
-        </w:rPr>
-        <w:t>if</w:t>
-      </w:r>
-      <w:proofErr w:type="spellEnd"/>
-      <w:r>
-        <w:rPr>
-          <w:b/>
-          <w:bCs/>
-        </w:rPr>
-        <w:t xml:space="preserve"> impugnación%}</w:t>
+        <w:t xml:space="preserve">  {%if impugnación%}</w:t>
       </w:r>
     </w:p>
     <w:p>
@@ -559,15 +397,7 @@
         <w:t>Impugno planilla presentada por el organismo previsional.</w:t>
       </w:r>
       <w:r>
-        <w:t xml:space="preserve"> {% </w:t>
-      </w:r>
-      <w:proofErr w:type="spellStart"/>
-      <w:r>
-        <w:t>endif</w:t>
-      </w:r>
-      <w:proofErr w:type="spellEnd"/>
-      <w:r>
-        <w:t xml:space="preserve"> %}</w:t>
+        <w:t xml:space="preserve"> {% endif %}</w:t>
       </w:r>
     </w:p>
     <w:p>
@@ -673,21 +503,7 @@
         <w:rPr>
           <w:lang w:val="es-AR"/>
         </w:rPr>
-        <w:t xml:space="preserve">Se intime a la demandada a reajustar correctamente el haber previsional conforme los parámetros fijados en la sentencia firme, bajo apercibimiento de aplicar astreintes en caso de incumplimiento, conforme las facultades </w:t>
-      </w:r>
-      <w:proofErr w:type="spellStart"/>
-      <w:r>
-        <w:rPr>
-          <w:lang w:val="es-AR"/>
-        </w:rPr>
-        <w:t>ordenatorias</w:t>
-      </w:r>
-      <w:proofErr w:type="spellEnd"/>
-      <w:r>
-        <w:rPr>
-          <w:lang w:val="es-AR"/>
-        </w:rPr>
-        <w:t xml:space="preserve"> y sancionatorias de V.S., atento al incumplimiento reiterado y sistemático en el cumplimiento integral de la manda judicial.</w:t>
+        <w:t>Se intime a la demandada a reajustar correctamente el haber previsional conforme los parámetros fijados en la sentencia firme, bajo apercibimiento de aplicar astreintes en caso de incumplimiento, conforme las facultades ordenatorias y sancionatorias de V.S., atento al incumplimiento reiterado y sistemático en el cumplimiento integral de la manda judicial.</w:t>
       </w:r>
     </w:p>
     <w:p>
@@ -724,23 +540,7 @@
         <w:t>Solicito se actualice la liquidación a la fecha de su aprobación, conforme a la tasa fijada en la sentencia (tasa pasiva comunicada 14290 del Banco Central de la República Argentina), teniendo en cuenta el período inflacionario transcurrido mientras se tramitaba el proceso y la demora ocasionada por el incumplimiento sistemático de la ANSES en cumplir integralmente con la manda judicial.</w:t>
       </w:r>
       <w:r>
-        <w:t xml:space="preserve"> {%</w:t>
-      </w:r>
-      <w:proofErr w:type="spellStart"/>
-      <w:r>
-        <w:t>if</w:t>
-      </w:r>
-      <w:proofErr w:type="spellEnd"/>
-      <w:r>
-        <w:t xml:space="preserve"> </w:t>
-      </w:r>
-      <w:proofErr w:type="spellStart"/>
-      <w:r>
-        <w:t>inconstitucionalidad_si</w:t>
-      </w:r>
-      <w:proofErr w:type="spellEnd"/>
-      <w:r>
-        <w:t>%}</w:t>
+        <w:t xml:space="preserve"> {%if inconstitucionalidad_si%}</w:t>
       </w:r>
     </w:p>
     <w:p>
@@ -764,133 +564,7 @@
           <w:bCs/>
           <w:lang w:val="es-AR"/>
         </w:rPr>
-        <w:t xml:space="preserve"> Planteo de inconstitucionalidad: Dejo planteada la inconstitucionalidad de la Ley {%</w:t>
-      </w:r>
-      <w:proofErr w:type="spellStart"/>
-      <w:r>
-        <w:rPr>
-          <w:b/>
-          <w:bCs/>
-          <w:lang w:val="es-AR"/>
-        </w:rPr>
-        <w:t>if</w:t>
-      </w:r>
-      <w:proofErr w:type="spellEnd"/>
-      <w:r>
-        <w:rPr>
-          <w:b/>
-          <w:bCs/>
-          <w:lang w:val="es-AR"/>
-        </w:rPr>
-        <w:t xml:space="preserve"> inconstitucionalidad_27426_si%} 27.426, {% </w:t>
-      </w:r>
-      <w:proofErr w:type="spellStart"/>
-      <w:r>
-        <w:rPr>
-          <w:b/>
-          <w:bCs/>
-          <w:lang w:val="es-AR"/>
-        </w:rPr>
-        <w:t>endif</w:t>
-      </w:r>
-      <w:proofErr w:type="spellEnd"/>
-      <w:r>
-        <w:rPr>
-          <w:b/>
-          <w:bCs/>
-          <w:lang w:val="es-AR"/>
-        </w:rPr>
-        <w:t xml:space="preserve"> %} {%</w:t>
-      </w:r>
-      <w:proofErr w:type="spellStart"/>
-      <w:r>
-        <w:rPr>
-          <w:b/>
-          <w:bCs/>
-          <w:lang w:val="es-AR"/>
-        </w:rPr>
-        <w:t>if</w:t>
-      </w:r>
-      <w:proofErr w:type="spellEnd"/>
-      <w:r>
-        <w:rPr>
-          <w:b/>
-          <w:bCs/>
-          <w:lang w:val="es-AR"/>
-        </w:rPr>
-        <w:t xml:space="preserve"> inconstitucionalidad_27541_si%} 27.541, {% </w:t>
-      </w:r>
-      <w:proofErr w:type="spellStart"/>
-      <w:r>
-        <w:rPr>
-          <w:b/>
-          <w:bCs/>
-          <w:lang w:val="es-AR"/>
-        </w:rPr>
-        <w:t>endif</w:t>
-      </w:r>
-      <w:proofErr w:type="spellEnd"/>
-      <w:r>
-        <w:rPr>
-          <w:b/>
-          <w:bCs/>
-          <w:lang w:val="es-AR"/>
-        </w:rPr>
-        <w:t xml:space="preserve"> %} {%</w:t>
-      </w:r>
-      <w:proofErr w:type="spellStart"/>
-      <w:r>
-        <w:rPr>
-          <w:b/>
-          <w:bCs/>
-          <w:lang w:val="es-AR"/>
-        </w:rPr>
-        <w:t>if</w:t>
-      </w:r>
-      <w:proofErr w:type="spellEnd"/>
-      <w:r>
-        <w:rPr>
-          <w:b/>
-          <w:bCs/>
-          <w:lang w:val="es-AR"/>
-        </w:rPr>
-        <w:t xml:space="preserve"> inconstitucionalidad_27609_si%} 27.609 {% </w:t>
-      </w:r>
-      <w:proofErr w:type="spellStart"/>
-      <w:r>
-        <w:rPr>
-          <w:b/>
-          <w:bCs/>
-          <w:lang w:val="es-AR"/>
-        </w:rPr>
-        <w:t>endif</w:t>
-      </w:r>
-      <w:proofErr w:type="spellEnd"/>
-      <w:r>
-        <w:rPr>
-          <w:b/>
-          <w:bCs/>
-          <w:lang w:val="es-AR"/>
-        </w:rPr>
-        <w:t xml:space="preserve"> %} {%</w:t>
-      </w:r>
-      <w:proofErr w:type="spellStart"/>
-      <w:r>
-        <w:rPr>
-          <w:b/>
-          <w:bCs/>
-          <w:lang w:val="es-AR"/>
-        </w:rPr>
-        <w:t>if</w:t>
-      </w:r>
-      <w:proofErr w:type="spellEnd"/>
-      <w:r>
-        <w:rPr>
-          <w:b/>
-          <w:bCs/>
-          <w:lang w:val="es-AR"/>
-        </w:rPr>
-        <w:t xml:space="preserve"> inconstitucionalidad_decreto_274_si%} del Decreto </w:t>
+        <w:t xml:space="preserve"> Planteo de inconstitucionalidad: Dejo planteada la inconstitucionalidad de la Ley {%if inconstitucionalidad_27426_si%} 27.426, {% endif %} {%if inconstitucionalidad_27541_si%} 27.541, {% endif %} {%if inconstitucionalidad_27609_si%} 27.609 {% endif %} {%if inconstitucionalidad_decreto_274_si%} del Decreto </w:t>
       </w:r>
       <w:r>
         <w:rPr>
@@ -899,61 +573,7 @@
           <w:lang w:val="es-AR"/>
         </w:rPr>
         <w:lastRenderedPageBreak/>
-        <w:t xml:space="preserve">274/2024, {% </w:t>
-      </w:r>
-      <w:proofErr w:type="spellStart"/>
-      <w:r>
-        <w:rPr>
-          <w:b/>
-          <w:bCs/>
-          <w:lang w:val="es-AR"/>
-        </w:rPr>
-        <w:t>endif</w:t>
-      </w:r>
-      <w:proofErr w:type="spellEnd"/>
-      <w:r>
-        <w:rPr>
-          <w:b/>
-          <w:bCs/>
-          <w:lang w:val="es-AR"/>
-        </w:rPr>
-        <w:t xml:space="preserve"> %} por resultar violatorios de los arts. 14 bis, 16, 17 y 28 de la Constitución Nacional, en tanto afectan la movilidad jubilatoria, el principio de </w:t>
-      </w:r>
-      <w:proofErr w:type="spellStart"/>
-      <w:r>
-        <w:rPr>
-          <w:b/>
-          <w:bCs/>
-          <w:lang w:val="es-AR"/>
-        </w:rPr>
-        <w:t>sustitutividad</w:t>
-      </w:r>
-      <w:proofErr w:type="spellEnd"/>
-      <w:r>
-        <w:rPr>
-          <w:b/>
-          <w:bCs/>
-          <w:lang w:val="es-AR"/>
-        </w:rPr>
-        <w:t xml:space="preserve"> y el carácter integral del haber previsional, configurando una regresión en materia de derechos sociales. {% </w:t>
-      </w:r>
-      <w:proofErr w:type="spellStart"/>
-      <w:r>
-        <w:rPr>
-          <w:b/>
-          <w:bCs/>
-          <w:lang w:val="es-AR"/>
-        </w:rPr>
-        <w:t>endif</w:t>
-      </w:r>
-      <w:proofErr w:type="spellEnd"/>
-      <w:r>
-        <w:rPr>
-          <w:b/>
-          <w:bCs/>
-          <w:lang w:val="es-AR"/>
-        </w:rPr>
-        <w:t xml:space="preserve"> %}</w:t>
+        <w:t>274/2024, {% endif %} por resultar violatorios de los arts. 14 bis, 16, 17 y 28 de la Constitución Nacional, en tanto afectan la movilidad jubilatoria, el principio de sustitutividad y el carácter integral del haber previsional, configurando una regresión en materia de derechos sociales. {% endif %}</w:t>
       </w:r>
     </w:p>
     <w:p>
@@ -1163,55 +783,7 @@
         <w:t xml:space="preserve"> Sala </w:t>
       </w:r>
       <w:r>
-        <w:t>{%</w:t>
-      </w:r>
-      <w:proofErr w:type="spellStart"/>
-      <w:r>
-        <w:t>if</w:t>
-      </w:r>
-      <w:proofErr w:type="spellEnd"/>
-      <w:r>
-        <w:t xml:space="preserve"> sala_1%} </w:t>
-      </w:r>
-      <w:proofErr w:type="gramStart"/>
-      <w:r>
-        <w:t>I .</w:t>
-      </w:r>
-      <w:proofErr w:type="gramEnd"/>
-      <w:r>
-        <w:t xml:space="preserve">{% </w:t>
-      </w:r>
-      <w:proofErr w:type="spellStart"/>
-      <w:r>
-        <w:t>endif</w:t>
-      </w:r>
-      <w:proofErr w:type="spellEnd"/>
-      <w:r>
-        <w:t xml:space="preserve"> %} {%</w:t>
-      </w:r>
-      <w:proofErr w:type="spellStart"/>
-      <w:r>
-        <w:t>if</w:t>
-      </w:r>
-      <w:proofErr w:type="spellEnd"/>
-      <w:r>
-        <w:t xml:space="preserve"> sala_2%} </w:t>
-      </w:r>
-      <w:proofErr w:type="gramStart"/>
-      <w:r>
-        <w:t>II .</w:t>
-      </w:r>
-      <w:proofErr w:type="gramEnd"/>
-      <w:r>
-        <w:t xml:space="preserve"> {% </w:t>
-      </w:r>
-      <w:proofErr w:type="spellStart"/>
-      <w:r>
-        <w:t>endif</w:t>
-      </w:r>
-      <w:proofErr w:type="spellEnd"/>
-      <w:r>
-        <w:t xml:space="preserve"> %}</w:t>
+        <w:t>{%if sala_1%} I .{% endif %} {%if sala_2%} II . {% endif %}</w:t>
       </w:r>
     </w:p>
     <w:p>
@@ -1288,27 +860,7 @@
           <w:highlight w:val="yellow"/>
           <w:u w:val="single"/>
         </w:rPr>
-        <w:t>{%</w:t>
-      </w:r>
-      <w:proofErr w:type="spellStart"/>
-      <w:r>
-        <w:rPr>
-          <w:b/>
-          <w:bCs/>
-          <w:highlight w:val="yellow"/>
-          <w:u w:val="single"/>
-        </w:rPr>
-        <w:t>if</w:t>
-      </w:r>
-      <w:proofErr w:type="spellEnd"/>
-      <w:r>
-        <w:rPr>
-          <w:b/>
-          <w:bCs/>
-          <w:highlight w:val="yellow"/>
-          <w:u w:val="single"/>
-        </w:rPr>
-        <w:t xml:space="preserve"> impugnación%}</w:t>
+        <w:t>{%if impugnación%}</w:t>
       </w:r>
     </w:p>
     <w:p>
@@ -1377,31 +929,7 @@
         <w:jc w:val="both"/>
       </w:pPr>
       <w:r>
-        <w:t xml:space="preserve">La liquidación de </w:t>
-      </w:r>
-      <w:proofErr w:type="spellStart"/>
-      <w:r>
-        <w:t>Anses</w:t>
-      </w:r>
-      <w:proofErr w:type="spellEnd"/>
-      <w:r>
-        <w:t xml:space="preserve"> adolece de los siguientes errores, que tornan invalida toda la liquidación. {%</w:t>
-      </w:r>
-      <w:proofErr w:type="spellStart"/>
-      <w:r>
-        <w:t>if</w:t>
-      </w:r>
-      <w:proofErr w:type="spellEnd"/>
-      <w:r>
-        <w:t xml:space="preserve"> </w:t>
-      </w:r>
-      <w:proofErr w:type="spellStart"/>
-      <w:r>
-        <w:t>no_reajusta_pbu</w:t>
-      </w:r>
-      <w:proofErr w:type="spellEnd"/>
-      <w:r>
-        <w:t>%}</w:t>
+        <w:t>La liquidación de Anses adolece de los siguientes errores, que tornan invalida toda la liquidación. {%if no_reajusta_pbu%}</w:t>
       </w:r>
     </w:p>
     <w:p>
@@ -1418,31 +946,7 @@
         <w:t>No reajusta PBU por lo cual toda la liquidación deviene errónea.</w:t>
       </w:r>
       <w:r>
-        <w:t xml:space="preserve"> {% </w:t>
-      </w:r>
-      <w:proofErr w:type="spellStart"/>
-      <w:r>
-        <w:t>endif</w:t>
-      </w:r>
-      <w:proofErr w:type="spellEnd"/>
-      <w:r>
-        <w:t xml:space="preserve"> %} {%</w:t>
-      </w:r>
-      <w:proofErr w:type="spellStart"/>
-      <w:r>
-        <w:t>if</w:t>
-      </w:r>
-      <w:proofErr w:type="spellEnd"/>
-      <w:r>
-        <w:t xml:space="preserve"> </w:t>
-      </w:r>
-      <w:proofErr w:type="spellStart"/>
-      <w:r>
-        <w:t>corta_intereses_tres_meses</w:t>
-      </w:r>
-      <w:proofErr w:type="spellEnd"/>
-      <w:r>
-        <w:t>%}</w:t>
+        <w:t xml:space="preserve"> {% endif %} {%if corta_intereses_tres_meses%}</w:t>
       </w:r>
     </w:p>
     <w:p>
@@ -1464,31 +968,7 @@
         <w:t>Corta los intereses tres meses antes del cierre de la liquidación.</w:t>
       </w:r>
       <w:r>
-        <w:t xml:space="preserve"> {% </w:t>
-      </w:r>
-      <w:proofErr w:type="spellStart"/>
-      <w:r>
-        <w:t>endif</w:t>
-      </w:r>
-      <w:proofErr w:type="spellEnd"/>
-      <w:r>
-        <w:t xml:space="preserve"> %} {%</w:t>
-      </w:r>
-      <w:proofErr w:type="spellStart"/>
-      <w:r>
-        <w:t>if</w:t>
-      </w:r>
-      <w:proofErr w:type="spellEnd"/>
-      <w:r>
-        <w:t xml:space="preserve"> </w:t>
-      </w:r>
-      <w:proofErr w:type="spellStart"/>
-      <w:r>
-        <w:t>reajusta_haber</w:t>
-      </w:r>
-      <w:proofErr w:type="spellEnd"/>
-      <w:r>
-        <w:t>%}</w:t>
+        <w:t xml:space="preserve"> {% endif %} {%if reajusta_haber%}</w:t>
       </w:r>
     </w:p>
     <w:p>
@@ -1511,31 +991,7 @@
         <w:t>Reajusta el haber de mi mandante utilizando solamente movilidad de la ley general.</w:t>
       </w:r>
       <w:r>
-        <w:t xml:space="preserve"> {% </w:t>
-      </w:r>
-      <w:proofErr w:type="spellStart"/>
-      <w:r>
-        <w:t>endif</w:t>
-      </w:r>
-      <w:proofErr w:type="spellEnd"/>
-      <w:r>
-        <w:t xml:space="preserve"> %} {%</w:t>
-      </w:r>
-      <w:proofErr w:type="spellStart"/>
-      <w:r>
-        <w:t>if</w:t>
-      </w:r>
-      <w:proofErr w:type="spellEnd"/>
-      <w:r>
-        <w:t xml:space="preserve"> </w:t>
-      </w:r>
-      <w:proofErr w:type="spellStart"/>
-      <w:r>
-        <w:t>no_toma_sumas_rem</w:t>
-      </w:r>
-      <w:proofErr w:type="spellEnd"/>
-      <w:r>
-        <w:t>%}</w:t>
+        <w:t xml:space="preserve"> {% endif %} {%if no_toma_sumas_rem%}</w:t>
       </w:r>
     </w:p>
     <w:p>
@@ -1557,31 +1013,7 @@
         <w:t>No se procedió a la incorporación de las sumas no remunerativas para el recalculo del haber inicial, conforme lo ordena sentencia de fecha (fecha de juzgado)</w:t>
       </w:r>
       <w:r>
-        <w:t xml:space="preserve"> {% </w:t>
-      </w:r>
-      <w:proofErr w:type="spellStart"/>
-      <w:r>
-        <w:t>endif</w:t>
-      </w:r>
-      <w:proofErr w:type="spellEnd"/>
-      <w:r>
-        <w:t xml:space="preserve"> %} {%</w:t>
-      </w:r>
-      <w:proofErr w:type="spellStart"/>
-      <w:r>
-        <w:t>if</w:t>
-      </w:r>
-      <w:proofErr w:type="spellEnd"/>
-      <w:r>
-        <w:t xml:space="preserve"> </w:t>
-      </w:r>
-      <w:proofErr w:type="spellStart"/>
-      <w:r>
-        <w:t>no_corrige_error_material</w:t>
-      </w:r>
-      <w:proofErr w:type="spellEnd"/>
-      <w:r>
-        <w:t>%}</w:t>
+        <w:t xml:space="preserve"> {% endif %} {%if no_corrige_error_material%}</w:t>
       </w:r>
     </w:p>
     <w:p>
@@ -1599,35 +1031,14 @@
           <w:bCs/>
         </w:rPr>
       </w:pPr>
-      <w:proofErr w:type="spellStart"/>
-      <w:r>
-        <w:t>Anses</w:t>
-      </w:r>
-      <w:proofErr w:type="spellEnd"/>
-      <w:r>
-        <w:t xml:space="preserve"> no rectifico las remuneraciones por el período (periodo del error material), conforme lo ordena la sentencia de fecha (fecha de juzgado), en cuanto existía un error material en el cálculo del haber inicial.</w:t>
-      </w:r>
-      <w:r>
-        <w:t xml:space="preserve"> {% </w:t>
-      </w:r>
-      <w:proofErr w:type="spellStart"/>
-      <w:r>
-        <w:t>endif</w:t>
-      </w:r>
-      <w:proofErr w:type="spellEnd"/>
-      <w:r>
-        <w:t xml:space="preserve"> %}</w:t>
-      </w:r>
-      <w:r>
-        <w:t xml:space="preserve"> {% </w:t>
-      </w:r>
-      <w:proofErr w:type="spellStart"/>
-      <w:r>
-        <w:t>endif</w:t>
-      </w:r>
-      <w:proofErr w:type="spellEnd"/>
-      <w:r>
-        <w:t xml:space="preserve"> %}</w:t>
+      <w:r>
+        <w:t>Anses no rectifico las remuneraciones por el período (periodo del error material), conforme lo ordena la sentencia de fecha (fecha de juzgado), en cuanto existía un error material en el cálculo del haber inicial.</w:t>
+      </w:r>
+      <w:r>
+        <w:t xml:space="preserve"> {% endif %}</w:t>
+      </w:r>
+      <w:r>
+        <w:t xml:space="preserve"> {% endif %}</w:t>
       </w:r>
     </w:p>
     <w:p>
@@ -1714,85 +1125,19 @@
         <w:jc w:val="both"/>
       </w:pPr>
       <w:r>
-        <w:t xml:space="preserve">Que vengo por el presente a promover ejecución de sentencia por las diferencias de haberes previsionales e intereses adeudados por la </w:t>
-      </w:r>
-      <w:proofErr w:type="spellStart"/>
-      <w:r>
-        <w:t>ANSeS</w:t>
-      </w:r>
-      <w:proofErr w:type="spellEnd"/>
-      <w:r>
-        <w:t xml:space="preserve"> correspondientes al período </w:t>
-      </w:r>
-      <w:proofErr w:type="gramStart"/>
-      <w:r>
-        <w:t xml:space="preserve">{{ </w:t>
-      </w:r>
-      <w:proofErr w:type="spellStart"/>
-      <w:r>
-        <w:t>fecha</w:t>
-      </w:r>
-      <w:proofErr w:type="gramEnd"/>
-      <w:r>
-        <w:t>_inicial_de_</w:t>
-      </w:r>
-      <w:proofErr w:type="gramStart"/>
-      <w:r>
-        <w:t>pago</w:t>
-      </w:r>
-      <w:proofErr w:type="spellEnd"/>
-      <w:r>
-        <w:t xml:space="preserve"> }</w:t>
-      </w:r>
-      <w:proofErr w:type="gramEnd"/>
-      <w:r>
-        <w:t>}</w:t>
+        <w:t xml:space="preserve">Que vengo por el presente a promover ejecución de sentencia por las diferencias de haberes previsionales e intereses adeudados por la ANSeS correspondientes al período </w:t>
+      </w:r>
+      <w:r>
+        <w:t>{{ fecha_inicial_de_pago }}</w:t>
       </w:r>
       <w:r>
         <w:t xml:space="preserve"> al </w:t>
       </w:r>
-      <w:proofErr w:type="gramStart"/>
-      <w:r>
-        <w:t xml:space="preserve">{{ </w:t>
-      </w:r>
-      <w:proofErr w:type="spellStart"/>
-      <w:r>
-        <w:t>fecha</w:t>
-      </w:r>
-      <w:proofErr w:type="gramEnd"/>
-      <w:r>
-        <w:t>_de_</w:t>
-      </w:r>
-      <w:proofErr w:type="gramStart"/>
-      <w:r>
-        <w:t>cierre</w:t>
-      </w:r>
-      <w:proofErr w:type="spellEnd"/>
-      <w:r>
-        <w:t xml:space="preserve"> }</w:t>
-      </w:r>
-      <w:proofErr w:type="gramEnd"/>
-      <w:r>
-        <w:t>}</w:t>
-      </w:r>
-      <w:r>
-        <w:t xml:space="preserve">, </w:t>
-      </w:r>
-      <w:proofErr w:type="gramStart"/>
-      <w:r>
-        <w:t>en razón de</w:t>
-      </w:r>
-      <w:proofErr w:type="gramEnd"/>
-      <w:r>
-        <w:t xml:space="preserve"> no haber sido </w:t>
-      </w:r>
-      <w:proofErr w:type="spellStart"/>
-      <w:r>
-        <w:t>redeterminado</w:t>
-      </w:r>
-      <w:proofErr w:type="spellEnd"/>
-      <w:r>
-        <w:t xml:space="preserve"> el haber de mi mandante conforme la sentencia firme recaída en autos.</w:t>
+      <w:r>
+        <w:t>{{ fecha_de_cierre }}</w:t>
+      </w:r>
+      <w:r>
+        <w:t>, en razón de no haber sido redeterminado el haber de mi mandante conforme la sentencia firme recaída en autos.</w:t>
       </w:r>
     </w:p>
     <w:p>
@@ -1812,57 +1157,20 @@
       <w:r>
         <w:t xml:space="preserve"> al </w:t>
       </w:r>
-      <w:proofErr w:type="gramStart"/>
-      <w:r>
-        <w:t xml:space="preserve">{{ </w:t>
-      </w:r>
-      <w:proofErr w:type="spellStart"/>
-      <w:r>
-        <w:t>fecha</w:t>
-      </w:r>
-      <w:proofErr w:type="gramEnd"/>
-      <w:r>
-        <w:t>_haber_</w:t>
-      </w:r>
-      <w:proofErr w:type="gramStart"/>
-      <w:r>
-        <w:t>reclamado</w:t>
-      </w:r>
-      <w:proofErr w:type="spellEnd"/>
-      <w:r>
-        <w:t xml:space="preserve"> }</w:t>
-      </w:r>
-      <w:proofErr w:type="gramEnd"/>
-      <w:r>
-        <w:t>}</w:t>
+      <w:r>
+        <w:t>{{ fecha_haber_reclamado }}</w:t>
       </w:r>
       <w:r>
         <w:t xml:space="preserve"> ($</w:t>
       </w:r>
       <w:r>
-        <w:t>{{</w:t>
-      </w:r>
-      <w:proofErr w:type="spellStart"/>
-      <w:r>
-        <w:t>haber_reclamado</w:t>
-      </w:r>
-      <w:proofErr w:type="spellEnd"/>
-      <w:r>
-        <w:t>}}</w:t>
+        <w:t>{{haber_reclamado}}</w:t>
       </w:r>
       <w:r>
         <w:t>), siendo el haber percibido a dicha fecha $</w:t>
       </w:r>
       <w:r>
-        <w:t>{{</w:t>
-      </w:r>
-      <w:proofErr w:type="spellStart"/>
-      <w:r>
-        <w:t>haber_percibido</w:t>
-      </w:r>
-      <w:proofErr w:type="spellEnd"/>
-      <w:r>
-        <w:t>}}</w:t>
+        <w:t>{{haber_percibido}}</w:t>
       </w:r>
       <w:r>
         <w:t>. A partir de esa base uniforme, se proyecta mes a mes la evolución del haber conforme el índice de movilidad aplicado en cada opción, determinándose las diferencias y sus intereses hasta la fecha de corte.</w:t>
@@ -1898,58 +1206,32 @@
         <w:t xml:space="preserve"> </w:t>
       </w:r>
       <w:r>
-        <w:t>{%</w:t>
-      </w:r>
-      <w:proofErr w:type="spellStart"/>
-      <w:r>
-        <w:t>if</w:t>
-      </w:r>
-      <w:proofErr w:type="spellEnd"/>
+        <w:t>{%if reparación_historica%}</w:t>
+      </w:r>
+      <w:r>
+        <w:t>S</w:t>
+      </w:r>
+      <w:r>
+        <w:t xml:space="preserve">e computó </w:t>
+      </w:r>
+      <w:r>
+        <w:t xml:space="preserve">el concepto de </w:t>
+      </w:r>
+      <w:r>
+        <w:t>Reparación Histórica</w:t>
+      </w:r>
+      <w:r>
+        <w:t>, que percibió por el periodo 09/2016 a 09/2018</w:t>
+      </w:r>
+      <w:r>
+        <w:t>,</w:t>
+      </w:r>
       <w:r>
         <w:t xml:space="preserve"> </w:t>
       </w:r>
-      <w:proofErr w:type="spellStart"/>
-      <w:r>
-        <w:t>reparación_historica</w:t>
-      </w:r>
-      <w:proofErr w:type="spellEnd"/>
-      <w:proofErr w:type="gramStart"/>
-      <w:r>
-        <w:t>%}</w:t>
-      </w:r>
-      <w:r>
-        <w:t>S</w:t>
-      </w:r>
-      <w:r>
-        <w:t>e</w:t>
-      </w:r>
-      <w:proofErr w:type="gramEnd"/>
-      <w:r>
-        <w:t xml:space="preserve"> computó </w:t>
-      </w:r>
-      <w:r>
-        <w:t xml:space="preserve">el concepto de </w:t>
-      </w:r>
-      <w:r>
-        <w:t>Reparación Histórica</w:t>
-      </w:r>
-      <w:r>
-        <w:t>, que percibió por el periodo 09/2016 a 09/2018</w:t>
-      </w:r>
-      <w:r>
-        <w:t>,</w:t>
-      </w:r>
-      <w:r>
-        <w:t xml:space="preserve"> </w:t>
-      </w:r>
-      <w:r>
-        <w:t xml:space="preserve">no </w:t>
-      </w:r>
-      <w:proofErr w:type="spellStart"/>
-      <w:r>
-        <w:t>asi</w:t>
-      </w:r>
-      <w:proofErr w:type="spellEnd"/>
+      <w:r>
+        <w:t>no asi</w:t>
+      </w:r>
       <w:r>
         <w:t xml:space="preserve"> suplementos no percibidos</w:t>
       </w:r>
@@ -1957,15 +1239,7 @@
         <w:t xml:space="preserve"> y no se aplicó quita por confiscatoriedad.</w:t>
       </w:r>
       <w:r>
-        <w:t xml:space="preserve"> {% </w:t>
-      </w:r>
-      <w:proofErr w:type="spellStart"/>
-      <w:r>
-        <w:t>endif</w:t>
-      </w:r>
-      <w:proofErr w:type="spellEnd"/>
-      <w:r>
-        <w:t xml:space="preserve"> %}</w:t>
+        <w:t xml:space="preserve"> {% endif %}</w:t>
       </w:r>
     </w:p>
     <w:p>
@@ -1980,15 +1254,7 @@
         <w:t>La variación de resultados obedece únicamente al índice de movilidad considerado, siendo los cálculos matemáticamente verificables por la contraria.</w:t>
       </w:r>
       <w:r>
-        <w:t xml:space="preserve"> {%</w:t>
-      </w:r>
-      <w:proofErr w:type="spellStart"/>
-      <w:r>
-        <w:t>if</w:t>
-      </w:r>
-      <w:proofErr w:type="spellEnd"/>
-      <w:r>
-        <w:t xml:space="preserve"> opción_1%} </w:t>
+        <w:t xml:space="preserve"> {%if opción_1%} </w:t>
       </w:r>
     </w:p>
     <w:p>
@@ -2024,23 +1290,7 @@
           <w:b/>
           <w:bCs/>
         </w:rPr>
-        <w:t xml:space="preserve"> {%</w:t>
-      </w:r>
-      <w:proofErr w:type="spellStart"/>
-      <w:r>
-        <w:rPr>
-          <w:b/>
-          <w:bCs/>
-        </w:rPr>
-        <w:t>if</w:t>
-      </w:r>
-      <w:proofErr w:type="spellEnd"/>
-      <w:r>
-        <w:rPr>
-          <w:b/>
-          <w:bCs/>
-        </w:rPr>
-        <w:t xml:space="preserve"> tope_9_opcion_1%}</w:t>
+        <w:t xml:space="preserve"> {%if tope_9_opcion_1%}</w:t>
       </w:r>
     </w:p>
     <w:p>
@@ -2076,49 +1326,13 @@
         <w:rPr>
           <w:lang w:val="es-AR"/>
         </w:rPr>
-        <w:t xml:space="preserve">El tope del haber máximo Art.9 inc.3 Ley 24463 se actualizó desde </w:t>
-      </w:r>
-      <w:proofErr w:type="gramStart"/>
-      <w:r>
-        <w:rPr>
-          <w:lang w:val="es-AR"/>
-        </w:rPr>
-        <w:t>Enero</w:t>
-      </w:r>
-      <w:proofErr w:type="gramEnd"/>
-      <w:r>
-        <w:rPr>
-          <w:lang w:val="es-AR"/>
-        </w:rPr>
-        <w:t xml:space="preserve"> de 2002 según la movilidad del fallo </w:t>
-      </w:r>
-      <w:proofErr w:type="spellStart"/>
-      <w:r>
-        <w:rPr>
-          <w:lang w:val="es-AR"/>
-        </w:rPr>
-        <w:t>Badaro</w:t>
-      </w:r>
-      <w:proofErr w:type="spellEnd"/>
-      <w:r>
-        <w:rPr>
-          <w:lang w:val="es-AR"/>
-        </w:rPr>
-        <w:t xml:space="preserve">. {% </w:t>
-      </w:r>
-      <w:proofErr w:type="spellStart"/>
-      <w:r>
-        <w:rPr>
-          <w:lang w:val="es-AR"/>
-        </w:rPr>
-        <w:t>endif</w:t>
-      </w:r>
-      <w:proofErr w:type="spellEnd"/>
-      <w:r>
-        <w:rPr>
-          <w:lang w:val="es-AR"/>
-        </w:rPr>
-        <w:t xml:space="preserve"> %}</w:t>
+        <w:t>El tope del haber máximo Art.9 inc.3 Ley 24463 se actualizó desde Enero de 2002 según la movilidad del fallo Badaro</w:t>
+      </w:r>
+      <w:r>
+        <w:rPr>
+          <w:lang w:val="es-AR"/>
+        </w:rPr>
+        <w:t>. {% endif %}</w:t>
       </w:r>
     </w:p>
     <w:p>
@@ -2147,15 +1361,7 @@
         <w:t xml:space="preserve">se calcularon hasta el </w:t>
       </w:r>
       <w:r>
-        <w:t>{{</w:t>
-      </w:r>
-      <w:proofErr w:type="spellStart"/>
-      <w:r>
-        <w:t>fecha_intereses</w:t>
-      </w:r>
-      <w:proofErr w:type="spellEnd"/>
-      <w:r>
-        <w:t>}}</w:t>
+        <w:t>{{fecha_intereses}}</w:t>
       </w:r>
       <w:r>
         <w:t xml:space="preserve"> </w:t>
@@ -2192,37 +1398,8 @@
         </w:rPr>
         <w:t xml:space="preserve">Movilidad: </w:t>
       </w:r>
-      <w:proofErr w:type="gramStart"/>
-      <w:r>
-        <w:t>{{ movilidad</w:t>
-      </w:r>
-      <w:proofErr w:type="gramEnd"/>
-      <w:r>
-        <w:t>_opcion_</w:t>
-      </w:r>
-      <w:proofErr w:type="gramStart"/>
-      <w:r>
-        <w:t>1 }</w:t>
-      </w:r>
-      <w:proofErr w:type="gramEnd"/>
-      <w:r>
-        <w:t>} {%</w:t>
-      </w:r>
-      <w:proofErr w:type="spellStart"/>
-      <w:r>
-        <w:t>if</w:t>
-      </w:r>
-      <w:proofErr w:type="spellEnd"/>
-      <w:r>
-        <w:t xml:space="preserve"> </w:t>
-      </w:r>
-      <w:proofErr w:type="spellStart"/>
-      <w:r>
-        <w:t>tuvo_pagos</w:t>
-      </w:r>
-      <w:proofErr w:type="spellEnd"/>
-      <w:r>
-        <w:t>%}</w:t>
+      <w:r>
+        <w:t>{{ movilidad_opcion_1 }} {%if tuvo_pagos%}</w:t>
       </w:r>
     </w:p>
     <w:p>
@@ -2247,43 +1424,14 @@
       <w:r>
         <w:t xml:space="preserve">: </w:t>
       </w:r>
-      <w:proofErr w:type="gramStart"/>
-      <w:r>
-        <w:t xml:space="preserve">{{ </w:t>
-      </w:r>
-      <w:proofErr w:type="spellStart"/>
-      <w:r>
-        <w:t>parrafo</w:t>
-      </w:r>
-      <w:proofErr w:type="gramEnd"/>
-      <w:r>
-        <w:t>_</w:t>
-      </w:r>
-      <w:proofErr w:type="gramStart"/>
-      <w:r>
-        <w:t>descuentos</w:t>
-      </w:r>
-      <w:proofErr w:type="spellEnd"/>
-      <w:r>
-        <w:t xml:space="preserve"> }</w:t>
-      </w:r>
-      <w:proofErr w:type="gramEnd"/>
-      <w:r>
-        <w:t>}</w:t>
+      <w:r>
+        <w:t>{{ parrafo_descuentos }}</w:t>
       </w:r>
       <w:r>
         <w:t xml:space="preserve"> </w:t>
       </w:r>
       <w:r>
-        <w:t xml:space="preserve">{% </w:t>
-      </w:r>
-      <w:proofErr w:type="spellStart"/>
-      <w:r>
-        <w:t>endif</w:t>
-      </w:r>
-      <w:proofErr w:type="spellEnd"/>
-      <w:r>
-        <w:t xml:space="preserve"> %}</w:t>
+        <w:t>{% endif %}</w:t>
       </w:r>
     </w:p>
     <w:p>
@@ -2308,29 +1456,8 @@
       <w:r>
         <w:t xml:space="preserve"> al </w:t>
       </w:r>
-      <w:proofErr w:type="gramStart"/>
-      <w:r>
-        <w:t xml:space="preserve">{{ </w:t>
-      </w:r>
-      <w:proofErr w:type="spellStart"/>
-      <w:r>
-        <w:t>fecha</w:t>
-      </w:r>
-      <w:proofErr w:type="gramEnd"/>
-      <w:r>
-        <w:t>_de_</w:t>
-      </w:r>
-      <w:proofErr w:type="gramStart"/>
-      <w:r>
-        <w:t>cierre</w:t>
-      </w:r>
-      <w:proofErr w:type="spellEnd"/>
-      <w:r>
-        <w:t xml:space="preserve"> }</w:t>
-      </w:r>
-      <w:proofErr w:type="gramEnd"/>
-      <w:r>
-        <w:t>}</w:t>
+      <w:r>
+        <w:t>{{ fecha_de_cierre }}</w:t>
       </w:r>
       <w:r>
         <w:rPr>
@@ -2343,15 +1470,7 @@
         <w:t>asciende a $</w:t>
       </w:r>
       <w:r>
-        <w:t>{{</w:t>
-      </w:r>
-      <w:proofErr w:type="spellStart"/>
-      <w:r>
-        <w:t>haber_de_alta</w:t>
-      </w:r>
-      <w:proofErr w:type="spellEnd"/>
-      <w:r>
-        <w:t>}}</w:t>
+        <w:t>{{haber_de_alta}}</w:t>
       </w:r>
       <w:r>
         <w:t>.</w:t>
@@ -2384,42 +1503,13 @@
         <w:t xml:space="preserve"> exigible al </w:t>
       </w:r>
       <w:r>
-        <w:t>{{</w:t>
-      </w:r>
-      <w:proofErr w:type="spellStart"/>
-      <w:r>
-        <w:t>fecha_intereses</w:t>
-      </w:r>
-      <w:proofErr w:type="spellEnd"/>
-      <w:r>
-        <w:t>}}</w:t>
+        <w:t>{{fecha_intereses}}</w:t>
       </w:r>
       <w:r>
         <w:t xml:space="preserve"> determinado por el periodo </w:t>
       </w:r>
-      <w:proofErr w:type="gramStart"/>
-      <w:r>
-        <w:t xml:space="preserve">{{ </w:t>
-      </w:r>
-      <w:proofErr w:type="spellStart"/>
-      <w:r>
-        <w:t>fecha</w:t>
-      </w:r>
-      <w:proofErr w:type="gramEnd"/>
-      <w:r>
-        <w:t>_inicial_de_</w:t>
-      </w:r>
-      <w:proofErr w:type="gramStart"/>
-      <w:r>
-        <w:t>pago</w:t>
-      </w:r>
-      <w:proofErr w:type="spellEnd"/>
-      <w:r>
-        <w:t xml:space="preserve"> }</w:t>
-      </w:r>
-      <w:proofErr w:type="gramEnd"/>
-      <w:r>
-        <w:t>}</w:t>
+      <w:r>
+        <w:t>{{ fecha_inicial_de_pago }}</w:t>
       </w:r>
       <w:r>
         <w:t xml:space="preserve"> </w:t>
@@ -2434,70 +1524,20 @@
       <w:r>
         <w:t xml:space="preserve">al </w:t>
       </w:r>
-      <w:proofErr w:type="gramStart"/>
-      <w:r>
-        <w:t xml:space="preserve">{{ </w:t>
-      </w:r>
-      <w:proofErr w:type="spellStart"/>
-      <w:r>
-        <w:t>fecha</w:t>
-      </w:r>
-      <w:proofErr w:type="gramEnd"/>
-      <w:r>
-        <w:t>_de_</w:t>
-      </w:r>
-      <w:proofErr w:type="gramStart"/>
-      <w:r>
-        <w:t>cierre</w:t>
-      </w:r>
-      <w:proofErr w:type="spellEnd"/>
-      <w:r>
-        <w:t xml:space="preserve"> }</w:t>
-      </w:r>
-      <w:proofErr w:type="gramEnd"/>
-      <w:r>
-        <w:t>}</w:t>
+      <w:r>
+        <w:t>{{ fecha_de_cierre }}</w:t>
       </w:r>
       <w:r>
         <w:t xml:space="preserve"> en concepto de Capital resulta en $</w:t>
       </w:r>
       <w:r>
-        <w:t xml:space="preserve"> </w:t>
-      </w:r>
-      <w:proofErr w:type="gramStart"/>
-      <w:r>
-        <w:t>{{ capital</w:t>
-      </w:r>
-      <w:proofErr w:type="gramEnd"/>
-      <w:r>
-        <w:t>_opcion_</w:t>
-      </w:r>
-      <w:proofErr w:type="gramStart"/>
-      <w:r>
-        <w:t>1 }</w:t>
-      </w:r>
-      <w:proofErr w:type="gramEnd"/>
-      <w:r>
-        <w:t>}</w:t>
+        <w:t xml:space="preserve"> {{ capital_opcion_1 }}</w:t>
       </w:r>
       <w:r>
         <w:t xml:space="preserve"> concepto de Intereses a $</w:t>
       </w:r>
-      <w:proofErr w:type="gramStart"/>
-      <w:r>
-        <w:t>{{ intereses</w:t>
-      </w:r>
-      <w:proofErr w:type="gramEnd"/>
-      <w:r>
-        <w:t>_opcion_</w:t>
-      </w:r>
-      <w:proofErr w:type="gramStart"/>
-      <w:r>
-        <w:t>1 }</w:t>
-      </w:r>
-      <w:proofErr w:type="gramEnd"/>
-      <w:r>
-        <w:t xml:space="preserve">} </w:t>
+      <w:r>
+        <w:t xml:space="preserve">{{ intereses_opcion_1 }} </w:t>
       </w:r>
       <w:r>
         <w:t>.</w:t>
@@ -2538,44 +1578,8 @@
         <w:rPr>
           <w:b/>
         </w:rPr>
-        <w:t xml:space="preserve">Monto adeudado por diferencias no abonadas de $ </w:t>
-      </w:r>
-      <w:proofErr w:type="gramStart"/>
-      <w:r>
-        <w:rPr>
-          <w:b/>
-        </w:rPr>
-        <w:t>{{ total</w:t>
-      </w:r>
-      <w:proofErr w:type="gramEnd"/>
-      <w:r>
-        <w:rPr>
-          <w:b/>
-        </w:rPr>
-        <w:t>_opcion_</w:t>
-      </w:r>
-      <w:proofErr w:type="gramStart"/>
-      <w:r>
-        <w:rPr>
-          <w:b/>
-        </w:rPr>
-        <w:t>1 }</w:t>
-      </w:r>
-      <w:proofErr w:type="gramEnd"/>
-      <w:r>
-        <w:rPr>
-          <w:b/>
-        </w:rPr>
-        <w:t>}</w:t>
-      </w:r>
-    </w:p>
-    <w:p>
-      <w:pPr>
-        <w:autoSpaceDE w:val="0"/>
-        <w:autoSpaceDN w:val="0"/>
-        <w:adjustRightInd w:val="0"/>
-        <w:jc w:val="both"/>
-      </w:pPr>
+        <w:t>Monto adeudado por diferencias no abonadas de $ {{ total_opcion_1 }}</w:t>
+      </w:r>
     </w:p>
     <w:p>
       <w:pPr>
@@ -2589,15 +1593,11 @@
           <w:bCs/>
         </w:rPr>
       </w:pPr>
-      <w:proofErr w:type="spellStart"/>
-      <w:proofErr w:type="spellEnd"/>
-      <w:proofErr w:type="spellStart"/>
-      <w:proofErr w:type="spellEnd"/>
-      <w:r>
-        <w:rPr>
+      <w:r>
+        <w:rPr>
+          <w:color w:val="FFFFFF"/>
           <w:sz w:val="2"/>
           <w:szCs w:val="2"/>
-          <w:color w:val="FFFFFF"/>
         </w:rPr>
         <w:t>{%p if opción_2 %}</w:t>
       </w:r>
@@ -2619,43 +1619,7 @@
           <w:b/>
           <w:bCs/>
         </w:rPr>
-      </w:r>
-      <w:proofErr w:type="spellStart"/>
-      <w:r>
-        <w:rPr>
-          <w:b/>
-          <w:bCs/>
-        </w:rPr>
-      </w:r>
-      <w:proofErr w:type="spellEnd"/>
-      <w:r>
-        <w:rPr>
-          <w:b/>
-          <w:bCs/>
-        </w:rPr>
-      </w:r>
-      <w:r>
-        <w:rPr>
-          <w:b/>
-          <w:bCs/>
-        </w:rPr>
-        <w:t>Opción 2 {%</w:t>
-      </w:r>
-      <w:proofErr w:type="spellStart"/>
-      <w:r>
-        <w:rPr>
-          <w:b/>
-          <w:bCs/>
-        </w:rPr>
-        <w:t>if</w:t>
-      </w:r>
-      <w:proofErr w:type="spellEnd"/>
-      <w:r>
-        <w:rPr>
-          <w:b/>
-          <w:bCs/>
-        </w:rPr>
-        <w:t xml:space="preserve"> tope_9_opcion_2%}</w:t>
+        <w:t>Opción 2 {%if tope_9_opcion_2%}</w:t>
       </w:r>
     </w:p>
     <w:p>
@@ -2691,49 +1655,13 @@
         <w:rPr>
           <w:lang w:val="es-AR"/>
         </w:rPr>
-        <w:t xml:space="preserve">El tope del haber máximo Art.9 inc.3 Ley 24463 se actualizó desde </w:t>
-      </w:r>
-      <w:proofErr w:type="gramStart"/>
-      <w:r>
-        <w:rPr>
-          <w:lang w:val="es-AR"/>
-        </w:rPr>
-        <w:t>Enero</w:t>
-      </w:r>
-      <w:proofErr w:type="gramEnd"/>
-      <w:r>
-        <w:rPr>
-          <w:lang w:val="es-AR"/>
-        </w:rPr>
-        <w:t xml:space="preserve"> de 2002 según la movilidad del fallo </w:t>
-      </w:r>
-      <w:proofErr w:type="spellStart"/>
-      <w:r>
-        <w:rPr>
-          <w:lang w:val="es-AR"/>
-        </w:rPr>
-        <w:t>Badaro</w:t>
-      </w:r>
-      <w:proofErr w:type="spellEnd"/>
-      <w:r>
-        <w:rPr>
-          <w:lang w:val="es-AR"/>
-        </w:rPr>
-        <w:t xml:space="preserve">. {% </w:t>
-      </w:r>
-      <w:proofErr w:type="spellStart"/>
-      <w:r>
-        <w:rPr>
-          <w:lang w:val="es-AR"/>
-        </w:rPr>
-        <w:t>endif</w:t>
-      </w:r>
-      <w:proofErr w:type="spellEnd"/>
-      <w:r>
-        <w:rPr>
-          <w:lang w:val="es-AR"/>
-        </w:rPr>
-        <w:t xml:space="preserve"> %}</w:t>
+        <w:t>El tope del haber máximo Art.9 inc.3 Ley 24463 se actualizó desde Enero de 2002 según la movilidad del fallo Badaro</w:t>
+      </w:r>
+      <w:r>
+        <w:rPr>
+          <w:lang w:val="es-AR"/>
+        </w:rPr>
+        <w:t>. {% endif %}</w:t>
       </w:r>
     </w:p>
     <w:p>
@@ -2762,15 +1690,7 @@
         <w:t xml:space="preserve">se calcularon hasta el </w:t>
       </w:r>
       <w:r>
-        <w:t>{{</w:t>
-      </w:r>
-      <w:proofErr w:type="spellStart"/>
-      <w:r>
-        <w:t>fecha_intereses</w:t>
-      </w:r>
-      <w:proofErr w:type="spellEnd"/>
-      <w:r>
-        <w:t>}} aplicando para ello la Tasa</w:t>
+        <w:t>{{fecha_intereses}} aplicando para ello la Tasa</w:t>
       </w:r>
       <w:r>
         <w:t xml:space="preserve"> Pasiva para uso de la Justicia (Com. 14290 BCRA)</w:t>
@@ -2798,37 +1718,8 @@
         </w:rPr>
         <w:t xml:space="preserve">Movilidad: </w:t>
       </w:r>
-      <w:proofErr w:type="gramStart"/>
-      <w:r>
-        <w:t>{{ movilidad</w:t>
-      </w:r>
-      <w:proofErr w:type="gramEnd"/>
-      <w:r>
-        <w:t>_opcion_</w:t>
-      </w:r>
-      <w:proofErr w:type="gramStart"/>
-      <w:r>
-        <w:t>2 }</w:t>
-      </w:r>
-      <w:proofErr w:type="gramEnd"/>
-      <w:r>
-        <w:t>} {%</w:t>
-      </w:r>
-      <w:proofErr w:type="spellStart"/>
-      <w:r>
-        <w:t>if</w:t>
-      </w:r>
-      <w:proofErr w:type="spellEnd"/>
-      <w:r>
-        <w:t xml:space="preserve"> </w:t>
-      </w:r>
-      <w:proofErr w:type="spellStart"/>
-      <w:r>
-        <w:t>tuvo_pagos</w:t>
-      </w:r>
-      <w:proofErr w:type="spellEnd"/>
-      <w:r>
-        <w:t>%}</w:t>
+      <w:r>
+        <w:t>{{ movilidad_opcion_2 }} {%if tuvo_pagos%}</w:t>
       </w:r>
     </w:p>
     <w:p>
@@ -2853,40 +1744,11 @@
       <w:r>
         <w:t xml:space="preserve">: </w:t>
       </w:r>
-      <w:proofErr w:type="gramStart"/>
-      <w:r>
-        <w:t xml:space="preserve">{{ </w:t>
-      </w:r>
-      <w:proofErr w:type="spellStart"/>
-      <w:r>
-        <w:t>parrafo</w:t>
-      </w:r>
-      <w:proofErr w:type="gramEnd"/>
-      <w:r>
-        <w:t>_</w:t>
-      </w:r>
-      <w:proofErr w:type="gramStart"/>
-      <w:r>
-        <w:t>descuentos</w:t>
-      </w:r>
-      <w:proofErr w:type="spellEnd"/>
-      <w:r>
-        <w:t xml:space="preserve"> }}</w:t>
-      </w:r>
-      <w:r>
-        <w:t>{</w:t>
-      </w:r>
-      <w:proofErr w:type="gramEnd"/>
-      <w:r>
-        <w:t xml:space="preserve">% </w:t>
-      </w:r>
-      <w:proofErr w:type="spellStart"/>
-      <w:r>
-        <w:t>endif</w:t>
-      </w:r>
-      <w:proofErr w:type="spellEnd"/>
-      <w:r>
-        <w:t xml:space="preserve"> %}</w:t>
+      <w:r>
+        <w:t>{{ parrafo_descuentos }}</w:t>
+      </w:r>
+      <w:r>
+        <w:t>{% endif %}</w:t>
       </w:r>
     </w:p>
     <w:p>
@@ -2911,29 +1773,8 @@
       <w:r>
         <w:t xml:space="preserve"> al </w:t>
       </w:r>
-      <w:proofErr w:type="gramStart"/>
-      <w:r>
-        <w:t xml:space="preserve">{{ </w:t>
-      </w:r>
-      <w:proofErr w:type="spellStart"/>
-      <w:r>
-        <w:t>fecha</w:t>
-      </w:r>
-      <w:proofErr w:type="gramEnd"/>
-      <w:r>
-        <w:t>_de_</w:t>
-      </w:r>
-      <w:proofErr w:type="gramStart"/>
-      <w:r>
-        <w:t>cierre</w:t>
-      </w:r>
-      <w:proofErr w:type="spellEnd"/>
-      <w:r>
-        <w:t xml:space="preserve"> }</w:t>
-      </w:r>
-      <w:proofErr w:type="gramEnd"/>
-      <w:r>
-        <w:t>}</w:t>
+      <w:r>
+        <w:t>{{ fecha_de_cierre }}</w:t>
       </w:r>
       <w:r>
         <w:rPr>
@@ -2946,15 +1787,7 @@
         <w:t>asciende a $</w:t>
       </w:r>
       <w:r>
-        <w:t>{{</w:t>
-      </w:r>
-      <w:proofErr w:type="spellStart"/>
-      <w:r>
-        <w:t>haber_de_alta</w:t>
-      </w:r>
-      <w:proofErr w:type="spellEnd"/>
-      <w:r>
-        <w:t>}}</w:t>
+        <w:t>{{haber_de_alta}}</w:t>
       </w:r>
       <w:r>
         <w:t>.</w:t>
@@ -2986,42 +1819,13 @@
         <w:t xml:space="preserve"> exigible al </w:t>
       </w:r>
       <w:r>
-        <w:t>{{</w:t>
-      </w:r>
-      <w:proofErr w:type="spellStart"/>
-      <w:r>
-        <w:t>fecha_intereses</w:t>
-      </w:r>
-      <w:proofErr w:type="spellEnd"/>
-      <w:r>
-        <w:t>}}</w:t>
+        <w:t>{{fecha_intereses}}</w:t>
       </w:r>
       <w:r>
         <w:t xml:space="preserve"> determinado por el periodo </w:t>
       </w:r>
-      <w:proofErr w:type="gramStart"/>
-      <w:r>
-        <w:t xml:space="preserve">{{ </w:t>
-      </w:r>
-      <w:proofErr w:type="spellStart"/>
-      <w:r>
-        <w:t>fecha</w:t>
-      </w:r>
-      <w:proofErr w:type="gramEnd"/>
-      <w:r>
-        <w:t>_inicial_de_</w:t>
-      </w:r>
-      <w:proofErr w:type="gramStart"/>
-      <w:r>
-        <w:t>pago</w:t>
-      </w:r>
-      <w:proofErr w:type="spellEnd"/>
-      <w:r>
-        <w:t xml:space="preserve"> }</w:t>
-      </w:r>
-      <w:proofErr w:type="gramEnd"/>
-      <w:r>
-        <w:t>}</w:t>
+      <w:r>
+        <w:t>{{ fecha_inicial_de_pago }}</w:t>
       </w:r>
       <w:r>
         <w:t xml:space="preserve"> </w:t>
@@ -3036,73 +1840,47 @@
       <w:r>
         <w:t xml:space="preserve">al </w:t>
       </w:r>
-      <w:proofErr w:type="gramStart"/>
-      <w:r>
-        <w:t xml:space="preserve">{{ </w:t>
-      </w:r>
-      <w:proofErr w:type="spellStart"/>
-      <w:r>
-        <w:t>fecha</w:t>
-      </w:r>
-      <w:proofErr w:type="gramEnd"/>
-      <w:r>
-        <w:t>_de_</w:t>
-      </w:r>
-      <w:proofErr w:type="gramStart"/>
-      <w:r>
-        <w:t>cierre</w:t>
-      </w:r>
-      <w:proofErr w:type="spellEnd"/>
-      <w:r>
-        <w:t xml:space="preserve"> }</w:t>
-      </w:r>
-      <w:proofErr w:type="gramEnd"/>
-      <w:r>
-        <w:t>}</w:t>
+      <w:r>
+        <w:t>{{ fecha_de_cierre }}</w:t>
       </w:r>
       <w:r>
         <w:t xml:space="preserve"> en concepto de Capital resulta en $</w:t>
       </w:r>
       <w:r>
+        <w:t xml:space="preserve"> {{ capital_opcion_2 }}</w:t>
+      </w:r>
+      <w:r>
+        <w:t xml:space="preserve"> concepto de Intereses a $</w:t>
+      </w:r>
+      <w:r>
+        <w:t xml:space="preserve">{{ intereses_opcion_2 }} </w:t>
+      </w:r>
+      <w:r>
+        <w:t>.</w:t>
+      </w:r>
+      <w:r>
         <w:t xml:space="preserve"> </w:t>
       </w:r>
-      <w:proofErr w:type="gramStart"/>
-      <w:r>
-        <w:t>{{ capital</w:t>
-      </w:r>
-      <w:proofErr w:type="gramEnd"/>
-      <w:r>
-        <w:t>_opcion_</w:t>
-      </w:r>
-      <w:proofErr w:type="gramStart"/>
-      <w:r>
-        <w:t>2 }</w:t>
-      </w:r>
-      <w:proofErr w:type="gramEnd"/>
-      <w:r>
-        <w:t>}</w:t>
-      </w:r>
-      <w:r>
-        <w:t xml:space="preserve"> concepto de Intereses a $</w:t>
-      </w:r>
-      <w:proofErr w:type="gramStart"/>
-      <w:r>
-        <w:t>{{ intereses</w:t>
-      </w:r>
-      <w:proofErr w:type="gramEnd"/>
-      <w:r>
-        <w:t>_opcion_</w:t>
-      </w:r>
-      <w:proofErr w:type="gramStart"/>
-      <w:r>
-        <w:t>2 }</w:t>
-      </w:r>
-      <w:proofErr w:type="gramEnd"/>
-      <w:r>
-        <w:t xml:space="preserve">} </w:t>
-      </w:r>
-      <w:r>
-        <w:t>.</w:t>
+      <w:r>
+        <w:rPr>
+          <w:b/>
+          <w:bCs/>
+        </w:rPr>
+        <w:t>{%</w:t>
+      </w:r>
+      <w:r>
+        <w:rPr>
+          <w:b/>
+          <w:bCs/>
+        </w:rPr>
+        <w:t xml:space="preserve"> endif </w:t>
+      </w:r>
+      <w:r>
+        <w:rPr>
+          <w:b/>
+          <w:bCs/>
+        </w:rPr>
+        <w:t>%}</w:t>
       </w:r>
     </w:p>
     <w:p>
@@ -3164,61 +1942,29 @@
           <w:b/>
           <w:bCs/>
         </w:rPr>
-        <w:t xml:space="preserve"> </w:t>
-      </w:r>
-      <w:proofErr w:type="gramStart"/>
-      <w:r>
-        <w:rPr>
-          <w:b/>
-          <w:bCs/>
-        </w:rPr>
-        <w:t>{{ total</w:t>
-      </w:r>
-      <w:proofErr w:type="gramEnd"/>
-      <w:r>
-        <w:rPr>
-          <w:b/>
-          <w:bCs/>
-        </w:rPr>
-        <w:t>_opcion_</w:t>
-      </w:r>
-      <w:proofErr w:type="gramStart"/>
-      <w:r>
-        <w:rPr>
-          <w:b/>
-          <w:bCs/>
-        </w:rPr>
-        <w:t>2 }</w:t>
-      </w:r>
-      <w:proofErr w:type="gramEnd"/>
-      <w:r>
-        <w:rPr>
-          <w:b/>
-          <w:bCs/>
-        </w:rPr>
-        <w:t>}</w:t>
-      </w:r>
-    </w:p>
-    <w:p>
-      <w:pPr>
-        <w:autoSpaceDE w:val="0"/>
-        <w:autoSpaceDN w:val="0"/>
-        <w:adjustRightInd w:val="0"/>
-        <w:jc w:val="both"/>
-      </w:pPr>
-    </w:p>
-    <w:p>
-      <w:pPr>
-        <w:autoSpaceDE w:val="0"/>
-        <w:autoSpaceDN w:val="0"/>
-        <w:adjustRightInd w:val="0"/>
-        <w:jc w:val="both"/>
-      </w:pPr>
-      <w:r>
-        <w:rPr>
+        <w:t xml:space="preserve"> {{ total_opcion_2 }}</w:t>
+      </w:r>
+    </w:p>
+    <w:p>
+      <w:pPr>
+        <w:autoSpaceDE w:val="0"/>
+        <w:autoSpaceDN w:val="0"/>
+        <w:adjustRightInd w:val="0"/>
+        <w:jc w:val="both"/>
+      </w:pPr>
+    </w:p>
+    <w:p>
+      <w:pPr>
+        <w:autoSpaceDE w:val="0"/>
+        <w:autoSpaceDN w:val="0"/>
+        <w:adjustRightInd w:val="0"/>
+        <w:jc w:val="both"/>
+      </w:pPr>
+      <w:r>
+        <w:rPr>
+          <w:color w:val="FFFFFF"/>
           <w:sz w:val="2"/>
           <w:szCs w:val="2"/>
-          <w:color w:val="FFFFFF"/>
         </w:rPr>
         <w:t>{%p endif %}</w:t>
       </w:r>
@@ -3240,23 +1986,7 @@
           <w:b/>
           <w:bCs/>
         </w:rPr>
-        <w:t xml:space="preserve"> {%</w:t>
-      </w:r>
-      <w:proofErr w:type="spellStart"/>
-      <w:r>
-        <w:rPr>
-          <w:b/>
-          <w:bCs/>
-        </w:rPr>
-        <w:t>if</w:t>
-      </w:r>
-      <w:proofErr w:type="spellEnd"/>
-      <w:r>
-        <w:rPr>
-          <w:b/>
-          <w:bCs/>
-        </w:rPr>
-        <w:t xml:space="preserve"> opción_3%}</w:t>
+        <w:t xml:space="preserve"> {%if opción_3%}</w:t>
       </w:r>
     </w:p>
     <w:p>
@@ -3330,14 +2060,13 @@
         <w:rPr>
           <w:color w:val="000000"/>
         </w:rPr>
-        <w:t>s</w:t>
-      </w:r>
-      <w:proofErr w:type="gramStart"/>
+        <w:t>s:</w:t>
+      </w:r>
       <w:r>
         <w:rPr>
           <w:color w:val="000000"/>
         </w:rPr>
-        <w:t>:</w:t>
+        <w:t xml:space="preserve"> </w:t>
       </w:r>
       <w:r>
         <w:rPr>
@@ -3347,40 +2076,10 @@
       </w:r>
       <w:r>
         <w:rPr>
-          <w:color w:val="000000"/>
-        </w:rPr>
-        <w:t xml:space="preserve"> </w:t>
-      </w:r>
-      <w:r>
-        <w:rPr>
-          <w:b/>
-          <w:bCs/>
-        </w:rPr>
-        <w:t>{</w:t>
-      </w:r>
-      <w:proofErr w:type="gramEnd"/>
-      <w:r>
-        <w:rPr>
-          <w:b/>
-          <w:bCs/>
-        </w:rPr>
-        <w:t>%</w:t>
-      </w:r>
-      <w:proofErr w:type="spellStart"/>
-      <w:r>
-        <w:rPr>
-          <w:b/>
-          <w:bCs/>
-        </w:rPr>
-        <w:t>if</w:t>
-      </w:r>
-      <w:proofErr w:type="spellEnd"/>
-      <w:r>
-        <w:rPr>
-          <w:b/>
-          <w:bCs/>
-        </w:rPr>
-        <w:t xml:space="preserve"> tope_9_opcion_3%}</w:t>
+          <w:b/>
+          <w:bCs/>
+        </w:rPr>
+        <w:t>{%if tope_9_opcion_3%}</w:t>
       </w:r>
     </w:p>
     <w:p>
@@ -3416,49 +2115,13 @@
         <w:rPr>
           <w:lang w:val="es-AR"/>
         </w:rPr>
-        <w:t xml:space="preserve">El tope del haber máximo Art.9 inc.3 Ley 24463 se actualizó desde </w:t>
-      </w:r>
-      <w:proofErr w:type="gramStart"/>
-      <w:r>
-        <w:rPr>
-          <w:lang w:val="es-AR"/>
-        </w:rPr>
-        <w:t>Enero</w:t>
-      </w:r>
-      <w:proofErr w:type="gramEnd"/>
-      <w:r>
-        <w:rPr>
-          <w:lang w:val="es-AR"/>
-        </w:rPr>
-        <w:t xml:space="preserve"> de 2002 según la movilidad del fallo </w:t>
-      </w:r>
-      <w:proofErr w:type="spellStart"/>
-      <w:r>
-        <w:rPr>
-          <w:lang w:val="es-AR"/>
-        </w:rPr>
-        <w:t>Badaro</w:t>
-      </w:r>
-      <w:proofErr w:type="spellEnd"/>
-      <w:r>
-        <w:rPr>
-          <w:lang w:val="es-AR"/>
-        </w:rPr>
-        <w:t xml:space="preserve">. {% </w:t>
-      </w:r>
-      <w:proofErr w:type="spellStart"/>
-      <w:r>
-        <w:rPr>
-          <w:lang w:val="es-AR"/>
-        </w:rPr>
-        <w:t>endif</w:t>
-      </w:r>
-      <w:proofErr w:type="spellEnd"/>
-      <w:r>
-        <w:rPr>
-          <w:lang w:val="es-AR"/>
-        </w:rPr>
-        <w:t xml:space="preserve"> %}</w:t>
+        <w:t>El tope del haber máximo Art.9 inc.3 Ley 24463 se actualizó desde Enero de 2002 según la movilidad del fallo Badaro</w:t>
+      </w:r>
+      <w:r>
+        <w:rPr>
+          <w:lang w:val="es-AR"/>
+        </w:rPr>
+        <w:t>. {% endif %}</w:t>
       </w:r>
     </w:p>
     <w:p>
@@ -3487,23 +2150,7 @@
         <w:t>:</w:t>
       </w:r>
       <w:r>
-        <w:t xml:space="preserve"> </w:t>
-      </w:r>
-      <w:proofErr w:type="gramStart"/>
-      <w:r>
-        <w:t>{{ movilidad</w:t>
-      </w:r>
-      <w:proofErr w:type="gramEnd"/>
-      <w:r>
-        <w:t>_opcion_</w:t>
-      </w:r>
-      <w:proofErr w:type="gramStart"/>
-      <w:r>
-        <w:t>3 }</w:t>
-      </w:r>
-      <w:proofErr w:type="gramEnd"/>
-      <w:r>
-        <w:t>}</w:t>
+        <w:t xml:space="preserve"> {{ movilidad_opcion_3 }}</w:t>
       </w:r>
     </w:p>
     <w:p>
@@ -3532,15 +2179,7 @@
         <w:t xml:space="preserve"> exigible al </w:t>
       </w:r>
       <w:r>
-        <w:t>{{</w:t>
-      </w:r>
-      <w:proofErr w:type="spellStart"/>
-      <w:r>
-        <w:t>fecha_intereses</w:t>
-      </w:r>
-      <w:proofErr w:type="spellEnd"/>
-      <w:r>
-        <w:t>}}</w:t>
+        <w:t>{{fecha_intereses}}</w:t>
       </w:r>
       <w:r>
         <w:t xml:space="preserve"> </w:t>
@@ -3557,29 +2196,8 @@
       <w:r>
         <w:t xml:space="preserve"> </w:t>
       </w:r>
-      <w:proofErr w:type="gramStart"/>
-      <w:r>
-        <w:t xml:space="preserve">{{ </w:t>
-      </w:r>
-      <w:proofErr w:type="spellStart"/>
-      <w:r>
-        <w:t>fecha</w:t>
-      </w:r>
-      <w:proofErr w:type="gramEnd"/>
-      <w:r>
-        <w:t>_inicial_de_</w:t>
-      </w:r>
-      <w:proofErr w:type="gramStart"/>
-      <w:r>
-        <w:t>pago</w:t>
-      </w:r>
-      <w:proofErr w:type="spellEnd"/>
-      <w:r>
-        <w:t xml:space="preserve"> }</w:t>
-      </w:r>
-      <w:proofErr w:type="gramEnd"/>
-      <w:r>
-        <w:t>}</w:t>
+      <w:r>
+        <w:t>{{ fecha_inicial_de_pago }}</w:t>
       </w:r>
       <w:r>
         <w:t xml:space="preserve"> </w:t>
@@ -3587,29 +2205,8 @@
       <w:r>
         <w:t xml:space="preserve">al </w:t>
       </w:r>
-      <w:proofErr w:type="gramStart"/>
-      <w:r>
-        <w:t xml:space="preserve">{{ </w:t>
-      </w:r>
-      <w:proofErr w:type="spellStart"/>
-      <w:r>
-        <w:t>fecha</w:t>
-      </w:r>
-      <w:proofErr w:type="gramEnd"/>
-      <w:r>
-        <w:t>_de_</w:t>
-      </w:r>
-      <w:proofErr w:type="gramStart"/>
-      <w:r>
-        <w:t>cierre</w:t>
-      </w:r>
-      <w:proofErr w:type="spellEnd"/>
-      <w:r>
-        <w:t xml:space="preserve"> }</w:t>
-      </w:r>
-      <w:proofErr w:type="gramEnd"/>
-      <w:r>
-        <w:t>}</w:t>
+      <w:r>
+        <w:t>{{ fecha_de_cierre }}</w:t>
       </w:r>
       <w:r>
         <w:t xml:space="preserve"> en concepto de Capital resulta en $</w:t>
@@ -3617,21 +2214,8 @@
       <w:r>
         <w:t xml:space="preserve"> </w:t>
       </w:r>
-      <w:proofErr w:type="gramStart"/>
-      <w:r>
-        <w:t>{{ capital</w:t>
-      </w:r>
-      <w:proofErr w:type="gramEnd"/>
-      <w:r>
-        <w:t>_opcion_</w:t>
-      </w:r>
-      <w:proofErr w:type="gramStart"/>
-      <w:r>
-        <w:t>3 }</w:t>
-      </w:r>
-      <w:proofErr w:type="gramEnd"/>
-      <w:r>
-        <w:t>}</w:t>
+      <w:r>
+        <w:t>{{ capital_opcion_3 }}</w:t>
       </w:r>
       <w:r>
         <w:t xml:space="preserve"> </w:t>
@@ -3642,56 +2226,18 @@
       <w:r>
         <w:t>$</w:t>
       </w:r>
-      <w:proofErr w:type="gramStart"/>
-      <w:r>
-        <w:t>{{ intereses</w:t>
-      </w:r>
-      <w:proofErr w:type="gramEnd"/>
-      <w:r>
-        <w:t>_opcion_</w:t>
-      </w:r>
-      <w:proofErr w:type="gramStart"/>
-      <w:r>
-        <w:t>3 }</w:t>
-      </w:r>
-      <w:proofErr w:type="gramEnd"/>
-      <w:r>
-        <w:t>}</w:t>
+      <w:r>
+        <w:t>{{ intereses_opcion_3 }}</w:t>
       </w:r>
       <w:r>
         <w:t xml:space="preserve"> totalizando una deuda de $</w:t>
       </w:r>
-      <w:proofErr w:type="gramStart"/>
-      <w:r>
-        <w:rPr>
-          <w:b/>
-          <w:bCs/>
-        </w:rPr>
-        <w:t>{{ total</w:t>
-      </w:r>
-      <w:proofErr w:type="gramEnd"/>
-      <w:r>
-        <w:rPr>
-          <w:b/>
-          <w:bCs/>
-        </w:rPr>
-        <w:t>_opcion_</w:t>
-      </w:r>
-      <w:proofErr w:type="gramStart"/>
-      <w:r>
-        <w:rPr>
-          <w:b/>
-          <w:bCs/>
-        </w:rPr>
-        <w:t>3 }</w:t>
-      </w:r>
-      <w:proofErr w:type="gramEnd"/>
-      <w:r>
-        <w:rPr>
-          <w:b/>
-          <w:bCs/>
-        </w:rPr>
-        <w:t>}</w:t>
+      <w:r>
+        <w:rPr>
+          <w:b/>
+          <w:bCs/>
+        </w:rPr>
+        <w:t>{{ total_opcion_3 }}</w:t>
       </w:r>
       <w:r>
         <w:t>.</w:t>
@@ -3700,23 +2246,7 @@
         <w:t xml:space="preserve"> </w:t>
       </w:r>
       <w:r>
-        <w:t xml:space="preserve">{% </w:t>
-      </w:r>
-      <w:proofErr w:type="spellStart"/>
-      <w:r>
-        <w:t>endif</w:t>
-      </w:r>
-      <w:proofErr w:type="spellEnd"/>
-      <w:r>
-        <w:t xml:space="preserve"> %} {%</w:t>
-      </w:r>
-      <w:proofErr w:type="spellStart"/>
-      <w:r>
-        <w:t>if</w:t>
-      </w:r>
-      <w:proofErr w:type="spellEnd"/>
-      <w:r>
-        <w:t xml:space="preserve"> opción_4%}</w:t>
+        <w:t>{% endif %} {%if opción_4%}</w:t>
       </w:r>
     </w:p>
     <w:p>
@@ -3815,23 +2345,7 @@
           <w:b/>
           <w:bCs/>
         </w:rPr>
-        <w:t>{%</w:t>
-      </w:r>
-      <w:proofErr w:type="spellStart"/>
-      <w:r>
-        <w:rPr>
-          <w:b/>
-          <w:bCs/>
-        </w:rPr>
-        <w:t>if</w:t>
-      </w:r>
-      <w:proofErr w:type="spellEnd"/>
-      <w:r>
-        <w:rPr>
-          <w:b/>
-          <w:bCs/>
-        </w:rPr>
-        <w:t xml:space="preserve"> tope_9_opcion_4%}</w:t>
+        <w:t>{%if tope_9_opcion_4%}</w:t>
       </w:r>
     </w:p>
     <w:p>
@@ -3867,49 +2381,13 @@
         <w:rPr>
           <w:lang w:val="es-AR"/>
         </w:rPr>
-        <w:t xml:space="preserve">El tope del haber máximo Art.9 inc.3 Ley 24463 se actualizó desde </w:t>
-      </w:r>
-      <w:proofErr w:type="gramStart"/>
-      <w:r>
-        <w:rPr>
-          <w:lang w:val="es-AR"/>
-        </w:rPr>
-        <w:t>Enero</w:t>
-      </w:r>
-      <w:proofErr w:type="gramEnd"/>
-      <w:r>
-        <w:rPr>
-          <w:lang w:val="es-AR"/>
-        </w:rPr>
-        <w:t xml:space="preserve"> de 2002 según la movilidad del fallo </w:t>
-      </w:r>
-      <w:proofErr w:type="spellStart"/>
-      <w:r>
-        <w:rPr>
-          <w:lang w:val="es-AR"/>
-        </w:rPr>
-        <w:t>Badaro</w:t>
-      </w:r>
-      <w:proofErr w:type="spellEnd"/>
-      <w:r>
-        <w:rPr>
-          <w:lang w:val="es-AR"/>
-        </w:rPr>
-        <w:t xml:space="preserve">. {% </w:t>
-      </w:r>
-      <w:proofErr w:type="spellStart"/>
-      <w:r>
-        <w:rPr>
-          <w:lang w:val="es-AR"/>
-        </w:rPr>
-        <w:t>endif</w:t>
-      </w:r>
-      <w:proofErr w:type="spellEnd"/>
-      <w:r>
-        <w:rPr>
-          <w:lang w:val="es-AR"/>
-        </w:rPr>
-        <w:t xml:space="preserve"> %}</w:t>
+        <w:t>El tope del haber máximo Art.9 inc.3 Ley 24463 se actualizó desde Enero de 2002 según la movilidad del fallo Badaro</w:t>
+      </w:r>
+      <w:r>
+        <w:rPr>
+          <w:lang w:val="es-AR"/>
+        </w:rPr>
+        <w:t>. {% endif %}</w:t>
       </w:r>
     </w:p>
     <w:p>
@@ -3935,182 +2413,22 @@
         <w:t>Movilidad</w:t>
       </w:r>
       <w:r>
-        <w:t xml:space="preserve">: </w:t>
-      </w:r>
-      <w:proofErr w:type="gramStart"/>
-      <w:r>
-        <w:t>{{ movilidad</w:t>
-      </w:r>
-      <w:proofErr w:type="gramEnd"/>
-      <w:r>
-        <w:t>_opcion_</w:t>
-      </w:r>
-      <w:proofErr w:type="gramStart"/>
-      <w:r>
-        <w:t>4 }</w:t>
-      </w:r>
-      <w:proofErr w:type="gramEnd"/>
-      <w:r>
-        <w:t>}</w:t>
-      </w:r>
-    </w:p>
-    <w:p>
-      <w:pPr>
-        <w:autoSpaceDE w:val="0"/>
-        <w:autoSpaceDN w:val="0"/>
-        <w:adjustRightInd w:val="0"/>
-        <w:jc w:val="both"/>
-      </w:pPr>
-      <w:r>
-        <w:rPr>
-          <w:b/>
-          <w:bCs/>
-        </w:rPr>
-        <w:t>Retroactivo exigible al {{</w:t>
-      </w:r>
-      <w:proofErr w:type="spellStart"/>
-      <w:r>
-        <w:rPr>
-          <w:b/>
-          <w:bCs/>
-        </w:rPr>
-        <w:t>fecha_intereses</w:t>
-      </w:r>
-      <w:proofErr w:type="spellEnd"/>
-      <w:r>
-        <w:rPr>
-          <w:b/>
-          <w:bCs/>
-        </w:rPr>
-        <w:t xml:space="preserve">}} determinado con estos índices de movilidad por el periodo </w:t>
-      </w:r>
-      <w:proofErr w:type="gramStart"/>
-      <w:r>
-        <w:rPr>
-          <w:b/>
-          <w:bCs/>
-        </w:rPr>
-        <w:t xml:space="preserve">{{ </w:t>
-      </w:r>
-      <w:proofErr w:type="spellStart"/>
-      <w:r>
-        <w:rPr>
-          <w:b/>
-          <w:bCs/>
-        </w:rPr>
-        <w:t>fecha</w:t>
-      </w:r>
-      <w:proofErr w:type="gramEnd"/>
-      <w:r>
-        <w:rPr>
-          <w:b/>
-          <w:bCs/>
-        </w:rPr>
-        <w:t>_inicial_de_</w:t>
-      </w:r>
-      <w:proofErr w:type="gramStart"/>
-      <w:r>
-        <w:rPr>
-          <w:b/>
-          <w:bCs/>
-        </w:rPr>
-        <w:t>pago</w:t>
-      </w:r>
-      <w:proofErr w:type="spellEnd"/>
-      <w:r>
-        <w:rPr>
-          <w:b/>
-          <w:bCs/>
-        </w:rPr>
-        <w:t xml:space="preserve"> }</w:t>
-      </w:r>
-      <w:proofErr w:type="gramEnd"/>
-      <w:r>
-        <w:rPr>
-          <w:b/>
-          <w:bCs/>
-        </w:rPr>
-        <w:t xml:space="preserve">} al </w:t>
-      </w:r>
-      <w:proofErr w:type="gramStart"/>
-      <w:r>
-        <w:rPr>
-          <w:b/>
-          <w:bCs/>
-        </w:rPr>
-        <w:t xml:space="preserve">{{ </w:t>
-      </w:r>
-      <w:proofErr w:type="spellStart"/>
-      <w:r>
-        <w:rPr>
-          <w:b/>
-          <w:bCs/>
-        </w:rPr>
-        <w:t>fecha</w:t>
-      </w:r>
-      <w:proofErr w:type="gramEnd"/>
-      <w:r>
-        <w:rPr>
-          <w:b/>
-          <w:bCs/>
-        </w:rPr>
-        <w:t>_de_</w:t>
-      </w:r>
-      <w:proofErr w:type="gramStart"/>
-      <w:r>
-        <w:rPr>
-          <w:b/>
-          <w:bCs/>
-        </w:rPr>
-        <w:t>cierre</w:t>
-      </w:r>
-      <w:proofErr w:type="spellEnd"/>
-      <w:r>
-        <w:rPr>
-          <w:b/>
-          <w:bCs/>
-        </w:rPr>
-        <w:t xml:space="preserve"> }</w:t>
-      </w:r>
-      <w:proofErr w:type="gramEnd"/>
-      <w:r>
-        <w:rPr>
-          <w:b/>
-          <w:bCs/>
-        </w:rPr>
-        <w:t xml:space="preserve">} en concepto de Capital resulta en $ </w:t>
-      </w:r>
-      <w:proofErr w:type="gramStart"/>
-      <w:r>
-        <w:rPr>
-          <w:b/>
-          <w:bCs/>
-        </w:rPr>
-        <w:t>{{ capital</w:t>
-      </w:r>
-      <w:proofErr w:type="gramEnd"/>
-      <w:r>
-        <w:rPr>
-          <w:b/>
-          <w:bCs/>
-        </w:rPr>
-        <w:t>_opcion_</w:t>
-      </w:r>
-      <w:proofErr w:type="gramStart"/>
-      <w:r>
-        <w:rPr>
-          <w:b/>
-          <w:bCs/>
-        </w:rPr>
-        <w:t>4 }</w:t>
-      </w:r>
-      <w:proofErr w:type="gramEnd"/>
-      <w:r>
-        <w:rPr>
-          <w:b/>
-          <w:bCs/>
-        </w:rPr>
-        <w:t xml:space="preserve">} concepto de </w:t>
+        <w:t>: {{ movilidad_opcion_4 }}</w:t>
+      </w:r>
+    </w:p>
+    <w:p>
+      <w:pPr>
+        <w:autoSpaceDE w:val="0"/>
+        <w:autoSpaceDN w:val="0"/>
+        <w:adjustRightInd w:val="0"/>
+        <w:jc w:val="both"/>
+      </w:pPr>
+      <w:r>
+        <w:rPr>
+          <w:b/>
+          <w:bCs/>
+        </w:rPr>
+        <w:t xml:space="preserve">Retroactivo exigible al {{fecha_intereses}} determinado con estos índices de movilidad por el periodo {{ fecha_inicial_de_pago }} al {{ fecha_de_cierre }} en concepto de Capital resulta en $ {{ capital_opcion_4 }} concepto de </w:t>
       </w:r>
       <w:r>
         <w:rPr>
@@ -4118,87 +2436,7 @@
           <w:bCs/>
         </w:rPr>
         <w:lastRenderedPageBreak/>
-        <w:t>Intereses a $</w:t>
-      </w:r>
-      <w:proofErr w:type="gramStart"/>
-      <w:r>
-        <w:rPr>
-          <w:b/>
-          <w:bCs/>
-        </w:rPr>
-        <w:t>{{ intereses</w:t>
-      </w:r>
-      <w:proofErr w:type="gramEnd"/>
-      <w:r>
-        <w:rPr>
-          <w:b/>
-          <w:bCs/>
-        </w:rPr>
-        <w:t>_opcion_4}} totalizando una deuda de $</w:t>
-      </w:r>
-      <w:proofErr w:type="gramStart"/>
-      <w:r>
-        <w:rPr>
-          <w:b/>
-          <w:bCs/>
-        </w:rPr>
-        <w:t>{{ total</w:t>
-      </w:r>
-      <w:proofErr w:type="gramEnd"/>
-      <w:r>
-        <w:rPr>
-          <w:b/>
-          <w:bCs/>
-        </w:rPr>
-        <w:t>_opcion_</w:t>
-      </w:r>
-      <w:proofErr w:type="gramStart"/>
-      <w:r>
-        <w:rPr>
-          <w:b/>
-          <w:bCs/>
-        </w:rPr>
-        <w:t>4 }</w:t>
-      </w:r>
-      <w:proofErr w:type="gramEnd"/>
-      <w:r>
-        <w:rPr>
-          <w:b/>
-          <w:bCs/>
-        </w:rPr>
-        <w:t xml:space="preserve">}. {% </w:t>
-      </w:r>
-      <w:proofErr w:type="spellStart"/>
-      <w:r>
-        <w:rPr>
-          <w:b/>
-          <w:bCs/>
-        </w:rPr>
-        <w:t>endif</w:t>
-      </w:r>
-      <w:proofErr w:type="spellEnd"/>
-      <w:r>
-        <w:rPr>
-          <w:b/>
-          <w:bCs/>
-        </w:rPr>
-        <w:t xml:space="preserve"> %} {%</w:t>
-      </w:r>
-      <w:proofErr w:type="spellStart"/>
-      <w:r>
-        <w:rPr>
-          <w:b/>
-          <w:bCs/>
-        </w:rPr>
-        <w:t>if</w:t>
-      </w:r>
-      <w:proofErr w:type="spellEnd"/>
-      <w:r>
-        <w:rPr>
-          <w:b/>
-          <w:bCs/>
-        </w:rPr>
-        <w:t xml:space="preserve"> inconstitucionalidad_27426_si%}</w:t>
+        <w:t>Intereses a ${{ intereses_opcion_4}} totalizando una deuda de ${{ total_opcion_4 }}. {% endif %} {%if inconstitucionalidad_27426_si%}</w:t>
       </w:r>
       <w:bookmarkEnd w:id="1"/>
     </w:p>
@@ -4299,21 +2537,7 @@
         <w:rPr>
           <w:bCs/>
         </w:rPr>
-        <w:t xml:space="preserve">La constitucionalidad de una norma que fije nuevas pautas de movilidad reconoce un límite temporal que no puede ser infringido sin lesionar derechos constitucionales de los beneficiarios y afectando los s derechos de los jubilados por cuanto la norma pretende tener vigencia desde antes de su sanción, alterando la situación jurídica consolidada al amparo de una norma anterior. La incidencia </w:t>
-      </w:r>
-      <w:proofErr w:type="gramStart"/>
-      <w:r>
-        <w:rPr>
-          <w:bCs/>
-        </w:rPr>
-        <w:t>del mismo</w:t>
-      </w:r>
-      <w:proofErr w:type="gramEnd"/>
-      <w:r>
-        <w:rPr>
-          <w:bCs/>
-        </w:rPr>
-        <w:t xml:space="preserve"> en el haber de mi mandante afecta derechos constitucionales lo cual torna inconstitucional al art 2 de la ley 27.426.</w:t>
+        <w:t>La constitucionalidad de una norma que fije nuevas pautas de movilidad reconoce un límite temporal que no puede ser infringido sin lesionar derechos constitucionales de los beneficiarios y afectando los s derechos de los jubilados por cuanto la norma pretende tener vigencia desde antes de su sanción, alterando la situación jurídica consolidada al amparo de una norma anterior. La incidencia del mismo en el haber de mi mandante afecta derechos constitucionales lo cual torna inconstitucional al art 2 de la ley 27.426.</w:t>
       </w:r>
     </w:p>
     <w:p>
@@ -4357,25 +2581,7 @@
           <w:i/>
           <w:iCs/>
         </w:rPr>
-        <w:t xml:space="preserve">“a partir de su </w:t>
-      </w:r>
-      <w:proofErr w:type="gramStart"/>
-      <w:r>
-        <w:rPr>
-          <w:bCs/>
-          <w:i/>
-          <w:iCs/>
-        </w:rPr>
-        <w:t>entrada en vigencia</w:t>
-      </w:r>
-      <w:proofErr w:type="gramEnd"/>
-      <w:r>
-        <w:rPr>
-          <w:bCs/>
-          <w:i/>
-          <w:iCs/>
-        </w:rPr>
-        <w:t>, las leyes se aplican a las consecuencias de las relaciones y situaciones jurídicas existentes. Las leyes no tienen efecto retroactivo, sean o no de orden público, excepto disposición en contrario. La retroactividad establecida por la ley no puede afectar derechos amparados por garantías constitucionales”.</w:t>
+        <w:t>“a partir de su entrada en vigencia, las leyes se aplican a las consecuencias de las relaciones y situaciones jurídicas existentes. Las leyes no tienen efecto retroactivo, sean o no de orden público, excepto disposición en contrario. La retroactividad establecida por la ley no puede afectar derechos amparados por garantías constitucionales”.</w:t>
       </w:r>
     </w:p>
     <w:p>
@@ -4447,21 +2653,7 @@
         <w:rPr>
           <w:bCs/>
         </w:rPr>
-        <w:t xml:space="preserve">Por Resolución E 2/2018 de la S.S.S., el valor de la movilidad correspondiente al mes de marzo de </w:t>
-      </w:r>
-      <w:proofErr w:type="gramStart"/>
-      <w:r>
-        <w:rPr>
-          <w:bCs/>
-        </w:rPr>
-        <w:t>2018,</w:t>
-      </w:r>
-      <w:proofErr w:type="gramEnd"/>
-      <w:r>
-        <w:rPr>
-          <w:bCs/>
-        </w:rPr>
-        <w:t xml:space="preserve"> fue establecido en un 5,71%, conforme </w:t>
+        <w:t xml:space="preserve">Por Resolución E 2/2018 de la S.S.S., el valor de la movilidad correspondiente al mes de marzo de 2018, fue establecido en un 5,71%, conforme </w:t>
       </w:r>
       <w:r>
         <w:rPr>
@@ -4554,49 +2746,7 @@
         <w:rPr>
           <w:bCs/>
         </w:rPr>
-        <w:t xml:space="preserve">Solicito expresamente se declare la inconstitucionalidad del art 2 de la ley 27.426, y se ordene que la movilidad correspondiente al mes de marzo de 2018 sea determinada de conformidad con las pautas fijadas en la Ley 26.417, debiendo empezar a aplicarse la nueva movilidad establecida por Ley 27.426 a partir del incremento correspondiente al mensual septiembre </w:t>
-      </w:r>
-      <w:proofErr w:type="gramStart"/>
-      <w:r>
-        <w:rPr>
-          <w:bCs/>
-        </w:rPr>
-        <w:t>2018.{</w:t>
-      </w:r>
-      <w:proofErr w:type="gramEnd"/>
-      <w:r>
-        <w:rPr>
-          <w:bCs/>
-        </w:rPr>
-        <w:t xml:space="preserve">% </w:t>
-      </w:r>
-      <w:proofErr w:type="spellStart"/>
-      <w:r>
-        <w:rPr>
-          <w:bCs/>
-        </w:rPr>
-        <w:t>endif</w:t>
-      </w:r>
-      <w:proofErr w:type="spellEnd"/>
-      <w:r>
-        <w:rPr>
-          <w:bCs/>
-        </w:rPr>
-        <w:t xml:space="preserve"> %} {%</w:t>
-      </w:r>
-      <w:proofErr w:type="spellStart"/>
-      <w:r>
-        <w:rPr>
-          <w:bCs/>
-        </w:rPr>
-        <w:t>if</w:t>
-      </w:r>
-      <w:proofErr w:type="spellEnd"/>
-      <w:r>
-        <w:rPr>
-          <w:bCs/>
-        </w:rPr>
-        <w:t xml:space="preserve"> inconstitucionalidad_27541_si%} </w:t>
+        <w:t xml:space="preserve">Solicito expresamente se declare la inconstitucionalidad del art 2 de la ley 27.426, y se ordene que la movilidad correspondiente al mes de marzo de 2018 sea determinada de conformidad con las pautas fijadas en la Ley 26.417, debiendo empezar a aplicarse la nueva movilidad establecida por Ley 27.426 a partir del incremento correspondiente al mensual septiembre 2018.{% endif %} {%if inconstitucionalidad_27541_si%} </w:t>
       </w:r>
     </w:p>
     <w:p>
@@ -4664,21 +2814,7 @@
         <w:rPr>
           <w:bCs/>
         </w:rPr>
-        <w:t xml:space="preserve">Al haber visto que los aumentos de 2020 dados por decreto fueron muy inferiores a los que hubiera correspondido conforme ley 27.426, solicito se expida y declare la inconstitucionalidad de la ley 27.541, del art 1 en cuanto declara la emergencia previsional , del  art 2 inc. </w:t>
-      </w:r>
-      <w:proofErr w:type="spellStart"/>
-      <w:r>
-        <w:rPr>
-          <w:bCs/>
-        </w:rPr>
-        <w:t>e</w:t>
-      </w:r>
-      <w:proofErr w:type="spellEnd"/>
-      <w:r>
-        <w:rPr>
-          <w:bCs/>
-        </w:rPr>
-        <w:t xml:space="preserve">, del art 55 y 56, como así también de los </w:t>
+        <w:t xml:space="preserve">Al haber visto que los aumentos de 2020 dados por decreto fueron muy inferiores a los que hubiera correspondido conforme ley 27.426, solicito se expida y declare la inconstitucionalidad de la ley 27.541, del art 1 en cuanto declara la emergencia previsional , del  art 2 inc. e, del art 55 y 56, como así también de los </w:t>
       </w:r>
       <w:r>
         <w:rPr>
@@ -4802,21 +2938,7 @@
         <w:rPr>
           <w:bCs/>
         </w:rPr>
-        <w:t xml:space="preserve">No respeta las bases de la delegación del art 2 </w:t>
-      </w:r>
-      <w:proofErr w:type="spellStart"/>
-      <w:r>
-        <w:rPr>
-          <w:bCs/>
-        </w:rPr>
-        <w:t>inc</w:t>
-      </w:r>
-      <w:proofErr w:type="spellEnd"/>
-      <w:r>
-        <w:rPr>
-          <w:bCs/>
-        </w:rPr>
-        <w:t xml:space="preserve"> e. </w:t>
+        <w:t xml:space="preserve">No respeta las bases de la delegación del art 2 inc e. </w:t>
       </w:r>
     </w:p>
     <w:p>
@@ -5030,35 +3152,7 @@
         <w:rPr>
           <w:lang w:val="es-AR"/>
         </w:rPr>
-        <w:t xml:space="preserve">{% </w:t>
-      </w:r>
-      <w:proofErr w:type="spellStart"/>
-      <w:r>
-        <w:rPr>
-          <w:lang w:val="es-AR"/>
-        </w:rPr>
-        <w:t>endif</w:t>
-      </w:r>
-      <w:proofErr w:type="spellEnd"/>
-      <w:r>
-        <w:rPr>
-          <w:lang w:val="es-AR"/>
-        </w:rPr>
-        <w:t xml:space="preserve"> %} {%</w:t>
-      </w:r>
-      <w:proofErr w:type="spellStart"/>
-      <w:r>
-        <w:rPr>
-          <w:lang w:val="es-AR"/>
-        </w:rPr>
-        <w:t>if</w:t>
-      </w:r>
-      <w:proofErr w:type="spellEnd"/>
-      <w:r>
-        <w:rPr>
-          <w:lang w:val="es-AR"/>
-        </w:rPr>
-        <w:t xml:space="preserve"> inconstitucionalidad_27609_si%} </w:t>
+        <w:t xml:space="preserve">{% endif %} {%if inconstitucionalidad_27609_si%} </w:t>
       </w:r>
     </w:p>
     <w:p>
@@ -5109,21 +3203,7 @@
           <w:lang w:eastAsia="en-US"/>
         </w:rPr>
         <w:lastRenderedPageBreak/>
-        <w:t xml:space="preserve">La Ley 27.609 ha demostrado ser manifiestamente insuficiente para preservar el poder adquisitivo del haber previsional de mi mandante, afectando de manera directa derechos y garantías de jerarquía constitucional. En particular, vulnera la garantía de movilidad e integralidad del haber consagrada en el art. 14 bis de la Constitución Nacional, el derecho de propiedad (art. 17), el principio de razonabilidad (art. 28), el derecho al desarrollo humano y la protección especial de los adultos mayores reconocida en los arts. 75 </w:t>
-      </w:r>
-      <w:proofErr w:type="spellStart"/>
-      <w:r>
-        <w:rPr>
-          <w:lang w:eastAsia="en-US"/>
-        </w:rPr>
-        <w:t>incs</w:t>
-      </w:r>
-      <w:proofErr w:type="spellEnd"/>
-      <w:r>
-        <w:rPr>
-          <w:lang w:eastAsia="en-US"/>
-        </w:rPr>
-        <w:t>. 22 y 23, y en definitiva el derecho a una vejez digna.</w:t>
+        <w:t>La Ley 27.609 ha demostrado ser manifiestamente insuficiente para preservar el poder adquisitivo del haber previsional de mi mandante, afectando de manera directa derechos y garantías de jerarquía constitucional. En particular, vulnera la garantía de movilidad e integralidad del haber consagrada en el art. 14 bis de la Constitución Nacional, el derecho de propiedad (art. 17), el principio de razonabilidad (art. 28), el derecho al desarrollo humano y la protección especial de los adultos mayores reconocida en los arts. 75 incs. 22 y 23, y en definitiva el derecho a una vejez digna.</w:t>
       </w:r>
     </w:p>
     <w:p>
@@ -5232,21 +3312,7 @@
           <w:lang w:eastAsia="en-US"/>
         </w:rPr>
         <w:lastRenderedPageBreak/>
-        <w:t>resulta pública y notoria. Los bonos otorgados a jubilados que perciben la mínima, que llegaron a representar hasta un 55% del haber mensual, evidencian el fracaso del mecanismo de movilidad y colocan la situación en un plano comparable al que motivó el dictado del precedente “</w:t>
-      </w:r>
-      <w:proofErr w:type="spellStart"/>
-      <w:r>
-        <w:rPr>
-          <w:lang w:eastAsia="en-US"/>
-        </w:rPr>
-        <w:t>Badaro</w:t>
-      </w:r>
-      <w:proofErr w:type="spellEnd"/>
-      <w:r>
-        <w:rPr>
-          <w:lang w:eastAsia="en-US"/>
-        </w:rPr>
-        <w:t xml:space="preserve">” (Fallos </w:t>
+        <w:t xml:space="preserve">resulta pública y notoria. Los bonos otorgados a jubilados que perciben la mínima, que llegaron a representar hasta un 55% del haber mensual, evidencian el fracaso del mecanismo de movilidad y colocan la situación en un plano comparable al que motivó el dictado del precedente “Badaro” (Fallos </w:t>
       </w:r>
       <w:hyperlink r:id="rId9" w:history="1">
         <w:r>
@@ -5410,35 +3476,7 @@
         <w:rPr>
           <w:lang w:eastAsia="en-US"/>
         </w:rPr>
-        <w:t>Los adultos mayores constituyen un grupo especialmente vulnerable que merece tutela reforzada, tal como lo ha reconocido reiteradamente la Corte Suprema en precedentes como “</w:t>
-      </w:r>
-      <w:proofErr w:type="spellStart"/>
-      <w:r>
-        <w:rPr>
-          <w:lang w:eastAsia="en-US"/>
-        </w:rPr>
-        <w:t>Itzcovich</w:t>
-      </w:r>
-      <w:proofErr w:type="spellEnd"/>
-      <w:r>
-        <w:rPr>
-          <w:lang w:eastAsia="en-US"/>
-        </w:rPr>
-        <w:t>”, “Sánchez”, “</w:t>
-      </w:r>
-      <w:proofErr w:type="spellStart"/>
-      <w:r>
-        <w:rPr>
-          <w:lang w:eastAsia="en-US"/>
-        </w:rPr>
-        <w:t>Badaro</w:t>
-      </w:r>
-      <w:proofErr w:type="spellEnd"/>
-      <w:r>
-        <w:rPr>
-          <w:lang w:eastAsia="en-US"/>
-        </w:rPr>
-        <w:t>”, “Blanco”, “Giménez” y “Garay Corina”. En tiempos de crisis económica —ha dicho el Alto Tribunal— deben profundizarse las respuestas institucionales en favor de los grupos más débiles y postergados (</w:t>
+        <w:t>Los adultos mayores constituyen un grupo especialmente vulnerable que merece tutela reforzada, tal como lo ha reconocido reiteradamente la Corte Suprema en precedentes como “Itzcovich”, “Sánchez”, “Badaro”, “Blanco”, “Giménez” y “Garay Corina”. En tiempos de crisis económica —ha dicho el Alto Tribunal— deben profundizarse las respuestas institucionales en favor de los grupos más débiles y postergados (</w:t>
       </w:r>
       <w:hyperlink r:id="rId14" w:history="1">
         <w:r>
@@ -5490,23 +3528,7 @@
         <w:jc w:val="both"/>
       </w:pPr>
       <w:r>
-        <w:t xml:space="preserve">En consecuencia, corresponde que V.S. ejerza plenamente el control de constitucionalidad y disponga la recomposición integral del haber previsional para el período en debate, adoptando un criterio de movilidad que preserve efectivamente su poder adquisitivo y garantice la reparación del daño sufrido por mi mandante, en resguardo de la supremacía de la Constitución, del principio de progresividad y de la dignidad humana que debe orientar toda decisión jurisdiccional en materia previsional. {% </w:t>
-      </w:r>
-      <w:proofErr w:type="spellStart"/>
-      <w:r>
-        <w:t>endif</w:t>
-      </w:r>
-      <w:proofErr w:type="spellEnd"/>
-      <w:r>
-        <w:t xml:space="preserve"> %} {%</w:t>
-      </w:r>
-      <w:proofErr w:type="spellStart"/>
-      <w:r>
-        <w:t>if</w:t>
-      </w:r>
-      <w:proofErr w:type="spellEnd"/>
-      <w:r>
-        <w:t xml:space="preserve"> inconstitucionalidad_decreto_274_si%} </w:t>
+        <w:t xml:space="preserve">En consecuencia, corresponde que V.S. ejerza plenamente el control de constitucionalidad y disponga la recomposición integral del haber previsional para el período en debate, adoptando un criterio de movilidad que preserve efectivamente su poder adquisitivo y garantice la reparación del daño sufrido por mi mandante, en resguardo de la supremacía de la Constitución, del principio de progresividad y de la dignidad humana que debe orientar toda decisión jurisdiccional en materia previsional. {% endif %} {%if inconstitucionalidad_decreto_274_si%} </w:t>
       </w:r>
     </w:p>
     <w:p>
@@ -5582,15 +3604,7 @@
         <w:jc w:val="both"/>
       </w:pPr>
       <w:r>
-        <w:t xml:space="preserve">En el mencionado voto disidente de los autos “Cendan”, al analizar la aplicación de la fórmula de la Ley 27.609, se sostiene que la movilidad no puede concebirse como una mera actualización inflacionaria, sino que debe mantener una proporcionalidad razonable entre pasividad y actividad, conforme la doctrina de la Corte Suprema y la interpretación del principio de </w:t>
-      </w:r>
-      <w:proofErr w:type="spellStart"/>
-      <w:r>
-        <w:t>sustitutividad</w:t>
-      </w:r>
-      <w:proofErr w:type="spellEnd"/>
-      <w:r>
-        <w:t xml:space="preserve">. En palabras de Bidart Campos, citadas por el magistrado, la movilidad implica mantener una </w:t>
+        <w:t xml:space="preserve">En el mencionado voto disidente de los autos “Cendan”, al analizar la aplicación de la fórmula de la Ley 27.609, se sostiene que la movilidad no puede concebirse como una mera actualización inflacionaria, sino que debe mantener una proporcionalidad razonable entre pasividad y actividad, conforme la doctrina de la Corte Suprema y la interpretación del principio de sustitutividad. En palabras de Bidart Campos, citadas por el magistrado, la movilidad implica mantener una </w:t>
       </w:r>
       <w:r>
         <w:lastRenderedPageBreak/>
@@ -5630,15 +3644,7 @@
         <w:jc w:val="both"/>
       </w:pPr>
       <w:r>
-        <w:t xml:space="preserve">Por todo lo expuesto, y sin perjuicio del reconocimiento estatal del perjuicio generado por la Ley 27.609, se solicita que se declare la inconstitucionalidad del Decreto 274/24 en cuanto establece un régimen de movilidad jubilatoria basado exclusivamente en el IPC, por cuanto tal modalidad no garantiza el principio de </w:t>
-      </w:r>
-      <w:proofErr w:type="spellStart"/>
-      <w:r>
-        <w:t>sustitutividad</w:t>
-      </w:r>
-      <w:proofErr w:type="spellEnd"/>
-      <w:r>
-        <w:t>, vulnera la integralidad del haber previsional el cual se aleja del salario real del jubilado y no mantiene su poder en el tiempo y además,  desconoce el estándar mínimo de una movilidad razonable, progresiva y proporcional, conforme surge de los principios de raigambre constitucional, los tratados internacionales con jerarquía constitucional (art. 75 inc. 22 CN), y la doctrina consolidada de la Corte Suprema de Justicia de la Nación.</w:t>
+        <w:t>Por todo lo expuesto, y sin perjuicio del reconocimiento estatal del perjuicio generado por la Ley 27.609, se solicita que se declare la inconstitucionalidad del Decreto 274/24 en cuanto establece un régimen de movilidad jubilatoria basado exclusivamente en el IPC, por cuanto tal modalidad no garantiza el principio de sustitutividad, vulnera la integralidad del haber previsional el cual se aleja del salario real del jubilado y no mantiene su poder en el tiempo y además,  desconoce el estándar mínimo de una movilidad razonable, progresiva y proporcional, conforme surge de los principios de raigambre constitucional, los tratados internacionales con jerarquía constitucional (art. 75 inc. 22 CN), y la doctrina consolidada de la Corte Suprema de Justicia de la Nación.</w:t>
       </w:r>
     </w:p>
     <w:p>
@@ -5670,15 +3676,7 @@
         <w:jc w:val="both"/>
       </w:pPr>
       <w:r>
-        <w:t xml:space="preserve">Mientras tramito el proceso se suspendió la ley 27.426, se dictó la ley </w:t>
-      </w:r>
-      <w:proofErr w:type="spellStart"/>
-      <w:r>
-        <w:t>N°</w:t>
-      </w:r>
-      <w:proofErr w:type="spellEnd"/>
-      <w:r>
-        <w:t xml:space="preserve"> 27.609, luego aquella se derogó y se dictó en DNU 274/24. Por lo que ahora la movilidad de los haberes jubilatorios se está dando por DNU, relacionados con la inflación, no siendo esa una facultad del Poder Ejecutivo.</w:t>
+        <w:t>Mientras tramito el proceso se suspendió la ley 27.426, se dictó la ley N° 27.609, luego aquella se derogó y se dictó en DNU 274/24. Por lo que ahora la movilidad de los haberes jubilatorios se está dando por DNU, relacionados con la inflación, no siendo esa una facultad del Poder Ejecutivo.</w:t>
       </w:r>
     </w:p>
     <w:p>
@@ -5741,42 +3739,10 @@
         <w:t>En consecuencia, corresponde que V.S. ejerza plenamente el control de constitucionalidad y disponga la recomposición integral del haber previsional para el período en debate, adoptando un criterio de movilidad que preserve efectivamente su poder adquisitivo y garantice la reparación del daño sufrido por mi mandante, en resguardo de la supremacía de la Constitución, del principio de progresividad y de la dignidad humana que debe orientar toda decisión jurisdiccional en materia previsional.</w:t>
       </w:r>
       <w:r>
-        <w:t xml:space="preserve"> {% </w:t>
-      </w:r>
-      <w:proofErr w:type="spellStart"/>
-      <w:r>
-        <w:t>endif</w:t>
-      </w:r>
-      <w:proofErr w:type="spellEnd"/>
-      <w:r>
-        <w:t xml:space="preserve"> </w:t>
-      </w:r>
-      <w:proofErr w:type="gramStart"/>
-      <w:r>
-        <w:t>%}</w:t>
-      </w:r>
-      <w:r>
-        <w:t>{</w:t>
-      </w:r>
-      <w:proofErr w:type="gramEnd"/>
-      <w:r>
-        <w:t>%</w:t>
-      </w:r>
-      <w:proofErr w:type="spellStart"/>
-      <w:r>
-        <w:t>if</w:t>
-      </w:r>
-      <w:proofErr w:type="spellEnd"/>
-      <w:r>
-        <w:t xml:space="preserve"> </w:t>
-      </w:r>
-      <w:proofErr w:type="spellStart"/>
-      <w:r>
-        <w:t>inconstitucionalidad_si</w:t>
-      </w:r>
-      <w:proofErr w:type="spellEnd"/>
-      <w:r>
-        <w:t>%}</w:t>
+        <w:t xml:space="preserve"> {% endif %}</w:t>
+      </w:r>
+      <w:r>
+        <w:t>{%if inconstitucionalidad_si%}</w:t>
       </w:r>
     </w:p>
     <w:p>
@@ -6092,55 +4058,7 @@
           <w:lang w:val="es-AR"/>
         </w:rPr>
         <w:lastRenderedPageBreak/>
-        <w:t xml:space="preserve">Juzgado Federal de Salta </w:t>
-      </w:r>
-      <w:proofErr w:type="spellStart"/>
-      <w:r>
-        <w:rPr>
-          <w:bCs/>
-          <w:lang w:val="es-AR"/>
-        </w:rPr>
-        <w:t>N°</w:t>
-      </w:r>
-      <w:proofErr w:type="spellEnd"/>
-      <w:r>
-        <w:rPr>
-          <w:bCs/>
-          <w:lang w:val="es-AR"/>
-        </w:rPr>
-        <w:t xml:space="preserve"> 2, en “ABRAHAM, RUBÉN DARÍO c/ ANSES s/ Reajustes Varios” (19/10/2022, </w:t>
-      </w:r>
-      <w:proofErr w:type="spellStart"/>
-      <w:r>
-        <w:rPr>
-          <w:bCs/>
-          <w:lang w:val="es-AR"/>
-        </w:rPr>
-        <w:t>Expte</w:t>
-      </w:r>
-      <w:proofErr w:type="spellEnd"/>
-      <w:r>
-        <w:rPr>
-          <w:bCs/>
-          <w:lang w:val="es-AR"/>
-        </w:rPr>
-        <w:t xml:space="preserve">. </w:t>
-      </w:r>
-      <w:proofErr w:type="spellStart"/>
-      <w:r>
-        <w:rPr>
-          <w:bCs/>
-          <w:lang w:val="es-AR"/>
-        </w:rPr>
-        <w:t>N°</w:t>
-      </w:r>
-      <w:proofErr w:type="spellEnd"/>
-      <w:r>
-        <w:rPr>
-          <w:bCs/>
-          <w:lang w:val="es-AR"/>
-        </w:rPr>
-        <w:t xml:space="preserve"> FSA 25000393/2010), sostuvo que el análisis de las leyes 27.426, 27.541 y 27.609 deviene ineludible cuando incide en la determinación de la movilidad aplicable al haber en ejecución, aclarando que ello no implica exceso jurisdiccional sino aplicación del derecho vigente al momento de resolver.</w:t>
+        <w:t>Juzgado Federal de Salta N° 2, en “ABRAHAM, RUBÉN DARÍO c/ ANSES s/ Reajustes Varios” (19/10/2022, Expte. N° FSA 25000393/2010), sostuvo que el análisis de las leyes 27.426, 27.541 y 27.609 deviene ineludible cuando incide en la determinación de la movilidad aplicable al haber en ejecución, aclarando que ello no implica exceso jurisdiccional sino aplicación del derecho vigente al momento de resolver.</w:t>
       </w:r>
     </w:p>
     <w:p>
@@ -6160,23 +4078,7 @@
           <w:bCs/>
           <w:lang w:val="es-AR"/>
         </w:rPr>
-        <w:t xml:space="preserve">La Sala II de la Cámara Federal de Salta, en “GAMARRA, MARÍA DEL HUERTO DOLORES c/ ANSES s/ Reajustes Varios” (26/04/2016), precisó que la cosa juzgada no impide resolver nuevas cuestiones surgidas con posterioridad, sino únicamente el reiterado juzgamiento de las mismas cuestiones ya decididas, destacando que es en la etapa de ejecución (arts. 499 y </w:t>
-      </w:r>
-      <w:proofErr w:type="spellStart"/>
-      <w:r>
-        <w:rPr>
-          <w:bCs/>
-          <w:lang w:val="es-AR"/>
-        </w:rPr>
-        <w:t>ccs</w:t>
-      </w:r>
-      <w:proofErr w:type="spellEnd"/>
-      <w:r>
-        <w:rPr>
-          <w:bCs/>
-          <w:lang w:val="es-AR"/>
-        </w:rPr>
-        <w:t>. CPCCN) donde puede evaluarse la razonabilidad de la aplicación de normas que inciden en la cuantía del haber.</w:t>
+        <w:t>La Sala II de la Cámara Federal de Salta, en “GAMARRA, MARÍA DEL HUERTO DOLORES c/ ANSES s/ Reajustes Varios” (26/04/2016), precisó que la cosa juzgada no impide resolver nuevas cuestiones surgidas con posterioridad, sino únicamente el reiterado juzgamiento de las mismas cuestiones ya decididas, destacando que es en la etapa de ejecución (arts. 499 y ccs. CPCCN) donde puede evaluarse la razonabilidad de la aplicación de normas que inciden en la cuantía del haber.</w:t>
       </w:r>
     </w:p>
     <w:p>
@@ -6216,39 +4118,7 @@
           <w:bCs/>
           <w:lang w:val="es-AR"/>
         </w:rPr>
-        <w:t xml:space="preserve">Finalmente, la Sala II en “Campos Toranzos, Marcos Aurelio c/ ANSES s/ Reajustes Varios” (14/02/2023, </w:t>
-      </w:r>
-      <w:proofErr w:type="spellStart"/>
-      <w:r>
-        <w:rPr>
-          <w:bCs/>
-          <w:lang w:val="es-AR"/>
-        </w:rPr>
-        <w:t>Expte</w:t>
-      </w:r>
-      <w:proofErr w:type="spellEnd"/>
-      <w:r>
-        <w:rPr>
-          <w:bCs/>
-          <w:lang w:val="es-AR"/>
-        </w:rPr>
-        <w:t xml:space="preserve">. </w:t>
-      </w:r>
-      <w:proofErr w:type="spellStart"/>
-      <w:r>
-        <w:rPr>
-          <w:bCs/>
-          <w:lang w:val="es-AR"/>
-        </w:rPr>
-        <w:t>N°</w:t>
-      </w:r>
-      <w:proofErr w:type="spellEnd"/>
-      <w:r>
-        <w:rPr>
-          <w:bCs/>
-          <w:lang w:val="es-AR"/>
-        </w:rPr>
-        <w:t xml:space="preserve"> 15100257/2012) confirmó la facultad judicial de determinar criterios de movilidad en etapa de ejecución respecto de períodos no contemplados en el pronunciamiento definitivo por razones temporales, con fundamento en la obligación de resolver conforme a las circunstancias actuales, en la naturaleza alimentaria de la prestación y en razones de economía procesal.</w:t>
+        <w:t>Finalmente, la Sala II en “Campos Toranzos, Marcos Aurelio c/ ANSES s/ Reajustes Varios” (14/02/2023, Expte. N° 15100257/2012) confirmó la facultad judicial de determinar criterios de movilidad en etapa de ejecución respecto de períodos no contemplados en el pronunciamiento definitivo por razones temporales, con fundamento en la obligación de resolver conforme a las circunstancias actuales, en la naturaleza alimentaria de la prestación y en razones de economía procesal.</w:t>
       </w:r>
     </w:p>
     <w:p>
@@ -6313,23 +4183,7 @@
           <w:bCs/>
           <w:lang w:val="es-AR"/>
         </w:rPr>
-        <w:t xml:space="preserve"> {% </w:t>
-      </w:r>
-      <w:proofErr w:type="spellStart"/>
-      <w:r>
-        <w:rPr>
-          <w:bCs/>
-          <w:lang w:val="es-AR"/>
-        </w:rPr>
-        <w:t>endif</w:t>
-      </w:r>
-      <w:proofErr w:type="spellEnd"/>
-      <w:r>
-        <w:rPr>
-          <w:bCs/>
-          <w:lang w:val="es-AR"/>
-        </w:rPr>
-        <w:t xml:space="preserve"> %}</w:t>
+        <w:t xml:space="preserve"> {% endif %}</w:t>
       </w:r>
       <w:r>
         <w:rPr>
@@ -6342,35 +4196,7 @@
         <w:rPr>
           <w:bCs/>
         </w:rPr>
-        <w:t xml:space="preserve">{% </w:t>
-      </w:r>
-      <w:proofErr w:type="spellStart"/>
-      <w:r>
-        <w:rPr>
-          <w:bCs/>
-        </w:rPr>
-        <w:t>if</w:t>
-      </w:r>
-      <w:proofErr w:type="spellEnd"/>
-      <w:r>
-        <w:rPr>
-          <w:bCs/>
-        </w:rPr>
-        <w:t xml:space="preserve"> </w:t>
-      </w:r>
-      <w:proofErr w:type="spellStart"/>
-      <w:r>
-        <w:rPr>
-          <w:bCs/>
-        </w:rPr>
-        <w:t>Tope_Haber_Maximo_Si</w:t>
-      </w:r>
-      <w:proofErr w:type="spellEnd"/>
-      <w:r>
-        <w:rPr>
-          <w:bCs/>
-        </w:rPr>
-        <w:t xml:space="preserve"> %}</w:t>
+        <w:t>{% if Tope_Haber_Maximo_Si %}</w:t>
       </w:r>
     </w:p>
     <w:p>
@@ -6443,137 +4269,95 @@
         <w:t>Note VS El tope del art 9 inc. 3 de la ley 24463 es a</w:t>
       </w:r>
       <w:r>
-        <w:t xml:space="preserve">l </w:t>
-      </w:r>
-      <w:proofErr w:type="gramStart"/>
-      <w:r>
+        <w:t>l {{</w:t>
+      </w:r>
+      <w:r>
+        <w:t xml:space="preserve"> Fecha_de_cierre_de_intereses</w:t>
+      </w:r>
+      <w:r>
+        <w:t xml:space="preserve">}} </w:t>
+      </w:r>
+      <w:r>
+        <w:t xml:space="preserve"> </w:t>
+      </w:r>
+      <w:r>
+        <w:rPr>
+          <w:b/>
+        </w:rPr>
         <w:t>{{</w:t>
       </w:r>
       <w:r>
+        <w:rPr>
+          <w:b/>
+        </w:rPr>
+        <w:t>tope_anses</w:t>
+      </w:r>
+      <w:r>
+        <w:rPr>
+          <w:b/>
+        </w:rPr>
+        <w:t>}}</w:t>
+      </w:r>
+    </w:p>
+    <w:p>
+      <w:pPr>
+        <w:jc w:val="both"/>
+        <w:rPr>
+          <w:b/>
+        </w:rPr>
+      </w:pPr>
+      <w:r>
+        <w:t>Si se tuviera en cuenta que los $3.100 representaban el 82% de la remuneración máxima sujeta a aportes que era $3.780 (60 ampo de $63), y trajéramos el mismo criterio a hoy, nos daría que el tope del haber máximo debiera ser a</w:t>
+      </w:r>
+      <w:r>
+        <w:t>l</w:t>
+      </w:r>
+      <w:r>
         <w:t xml:space="preserve"> </w:t>
       </w:r>
-      <w:proofErr w:type="spellStart"/>
-      <w:r>
-        <w:t>Fecha</w:t>
-      </w:r>
-      <w:proofErr w:type="gramEnd"/>
-      <w:r>
-        <w:t>_de_cierre_de_intereses</w:t>
-      </w:r>
-      <w:proofErr w:type="spellEnd"/>
-      <w:proofErr w:type="gramStart"/>
+      <w:r>
+        <w:t>{{</w:t>
+      </w:r>
+      <w:r>
+        <w:t xml:space="preserve"> Fecha_de_cierre_de_intereses</w:t>
+      </w:r>
       <w:r>
         <w:t xml:space="preserve">}} </w:t>
       </w:r>
       <w:r>
-        <w:t xml:space="preserve"> </w:t>
-      </w:r>
-      <w:r>
-        <w:rPr>
-          <w:b/>
-        </w:rPr>
-        <w:t>{</w:t>
-      </w:r>
-      <w:proofErr w:type="gramEnd"/>
-      <w:r>
-        <w:rPr>
-          <w:b/>
-        </w:rPr>
-        <w:t>{</w:t>
-      </w:r>
-      <w:proofErr w:type="spellStart"/>
-      <w:r>
-        <w:rPr>
-          <w:b/>
-        </w:rPr>
-        <w:t>tope_anses</w:t>
-      </w:r>
-      <w:proofErr w:type="spellEnd"/>
+        <w:t xml:space="preserve"> del 82% de la remuneración máxima</w:t>
+      </w:r>
+      <w:r>
+        <w:t xml:space="preserve"> es decir</w:t>
+      </w:r>
+      <w:r>
+        <w:rPr>
+          <w:b/>
+        </w:rPr>
+        <w:t xml:space="preserve"> {{</w:t>
+      </w:r>
+      <w:r>
+        <w:rPr>
+          <w:b/>
+        </w:rPr>
+        <w:t>tope_ocheintados_rem_max</w:t>
+      </w:r>
       <w:r>
         <w:rPr>
           <w:b/>
         </w:rPr>
         <w:t>}}</w:t>
       </w:r>
-    </w:p>
-    <w:p>
-      <w:pPr>
-        <w:jc w:val="both"/>
-        <w:rPr>
-          <w:b/>
-        </w:rPr>
-      </w:pPr>
-      <w:r>
-        <w:t>Si se tuviera en cuenta que los $3.100 representaban el 82% de la remuneración máxima sujeta a aportes que era $3.780 (60 ampo de $63), y trajéramos el mismo criterio a hoy, nos daría que el tope del haber máximo debiera ser a</w:t>
-      </w:r>
-      <w:r>
-        <w:t>l</w:t>
-      </w:r>
-      <w:r>
-        <w:t xml:space="preserve"> </w:t>
-      </w:r>
-      <w:proofErr w:type="gramStart"/>
-      <w:r>
-        <w:t>{{</w:t>
-      </w:r>
-      <w:r>
-        <w:t xml:space="preserve"> </w:t>
-      </w:r>
-      <w:proofErr w:type="spellStart"/>
-      <w:r>
-        <w:t>Fecha</w:t>
-      </w:r>
-      <w:proofErr w:type="gramEnd"/>
-      <w:r>
-        <w:t>_de_cierre_de_intereses</w:t>
-      </w:r>
-      <w:proofErr w:type="spellEnd"/>
-      <w:proofErr w:type="gramStart"/>
+      <w:r>
+        <w:t xml:space="preserve"> un {{</w:t>
+      </w:r>
+      <w:r>
+        <w:t>dif_ocheintados_rem_max_anses</w:t>
+      </w:r>
       <w:r>
         <w:t xml:space="preserve">}} </w:t>
       </w:r>
       <w:r>
-        <w:t xml:space="preserve"> del</w:t>
-      </w:r>
-      <w:proofErr w:type="gramEnd"/>
-      <w:r>
-        <w:t xml:space="preserve"> 82% de la remuneración máxima</w:t>
-      </w:r>
-      <w:r>
-        <w:t xml:space="preserve"> es decir</w:t>
-      </w:r>
-      <w:r>
-        <w:rPr>
-          <w:b/>
-        </w:rPr>
-        <w:t xml:space="preserve"> {{</w:t>
-      </w:r>
-      <w:proofErr w:type="spellStart"/>
-      <w:r>
-        <w:rPr>
-          <w:b/>
-        </w:rPr>
-        <w:t>tope_ocheintados_rem_max</w:t>
-      </w:r>
-      <w:proofErr w:type="spellEnd"/>
-      <w:r>
-        <w:rPr>
-          <w:b/>
-        </w:rPr>
-        <w:t>}}</w:t>
-      </w:r>
-      <w:r>
-        <w:t xml:space="preserve"> un {{</w:t>
-      </w:r>
-      <w:proofErr w:type="spellStart"/>
-      <w:r>
-        <w:t>dif_ocheintados_rem_max_anses</w:t>
-      </w:r>
-      <w:proofErr w:type="spellEnd"/>
-      <w:r>
-        <w:t xml:space="preserve">}} </w:t>
-      </w:r>
-      <w:r>
         <w:rPr>
           <w:b/>
         </w:rPr>
@@ -6600,7 +4384,7 @@
           <w:noProof/>
         </w:rPr>
         <w:drawing>
-          <wp:inline distT="0" distB="0" distL="0" distR="0" wp14:anchorId="0A6F4340" wp14:editId="41BB6B87">
+          <wp:inline distT="0" distB="0" distL="0" distR="0" wp14:anchorId="0A6F4340" wp14:editId="3572009D">
             <wp:extent cx="3710940" cy="3179171"/>
             <wp:effectExtent l="0" t="0" r="3810" b="2540"/>
             <wp:docPr id="507230546" name="Imagen 2" descr="Gráfico, Gráfico de barrasDescripción generada automáticamente con confianza media"/>
@@ -6679,7 +4463,6 @@
         </w:rPr>
         <w:t>{{</w:t>
       </w:r>
-      <w:proofErr w:type="spellStart"/>
       <w:r>
         <w:rPr>
           <w:b/>
@@ -6687,7 +4470,6 @@
         </w:rPr>
         <w:t>dif_haber_reclamado_anses</w:t>
       </w:r>
-      <w:proofErr w:type="spellEnd"/>
       <w:r>
         <w:rPr>
           <w:b/>
@@ -6700,40 +4482,22 @@
           <w:b/>
           <w:u w:val="single"/>
         </w:rPr>
-        <w:t xml:space="preserve">conforme el tope de </w:t>
-      </w:r>
-      <w:proofErr w:type="spellStart"/>
+        <w:t xml:space="preserve">conforme el tope de Anses, es decir un </w:t>
+      </w:r>
       <w:r>
         <w:rPr>
           <w:b/>
           <w:u w:val="single"/>
         </w:rPr>
-        <w:t>Anses</w:t>
-      </w:r>
-      <w:proofErr w:type="spellEnd"/>
+        <w:t>{{</w:t>
+      </w:r>
       <w:r>
         <w:rPr>
           <w:b/>
           <w:u w:val="single"/>
         </w:rPr>
-        <w:t xml:space="preserve">, es decir un </w:t>
-      </w:r>
-      <w:r>
-        <w:rPr>
-          <w:b/>
-          <w:u w:val="single"/>
-        </w:rPr>
-        <w:t>{{</w:t>
-      </w:r>
-      <w:proofErr w:type="spellStart"/>
-      <w:r>
-        <w:rPr>
-          <w:b/>
-          <w:u w:val="single"/>
-        </w:rPr>
         <w:t>porc_haber_reclamado_anses</w:t>
       </w:r>
-      <w:proofErr w:type="spellEnd"/>
       <w:r>
         <w:rPr>
           <w:b/>
@@ -6813,15 +4577,7 @@
         <w:t>S</w:t>
       </w:r>
       <w:r>
-        <w:t>i a los $3.100, que eran a 01/2002, lo actualizamos con las mismas pautas de “</w:t>
-      </w:r>
-      <w:proofErr w:type="spellStart"/>
-      <w:r>
-        <w:t>Badaro</w:t>
-      </w:r>
-      <w:proofErr w:type="spellEnd"/>
-      <w:r>
-        <w:t>” y aumentos generales de ANSES el tope hoy sería notablemente superior</w:t>
+        <w:t>i a los $3.100, que eran a 01/2002, lo actualizamos con las mismas pautas de “Badaro” y aumentos generales de ANSES el tope hoy sería notablemente superior</w:t>
       </w:r>
       <w:r>
         <w:t xml:space="preserve"> $ 2.776.554,87.</w:t>
@@ -6832,15 +4588,7 @@
         <w:jc w:val="both"/>
       </w:pPr>
       <w:r>
-        <w:t xml:space="preserve">Acá se cuestiona el monto del haber máximo, como así también la quita que se produce tanto por su inadecuada movilidad y como por su aplicación, provocando un daño notorio en el haber, por cuanto si tengo que realizar una quita del 15% sobre un haber máximo no actualizado desde 1995 que se dictó la ley 24463, a mayo de 2006 que se incrementó con el Decreto </w:t>
-      </w:r>
-      <w:proofErr w:type="spellStart"/>
-      <w:r>
-        <w:t>Nº</w:t>
-      </w:r>
-      <w:proofErr w:type="spellEnd"/>
-      <w:r>
-        <w:t xml:space="preserve"> 764/06, un 11%, resultando el mismo de $3.441. Los aumentos posteriores otorgados a las prestaciones previsionales mediante la Ley 26.198, los Decretos 1346/07, 279/08 y posteriormente en virtud de la ley de movilidad 26.417, se reflejaron en el haber máximo. Pero de 2002 al 05-2006 NO, causando un perjuicio enorme a mi mandante en caso de ser alcanzado por el mismo.</w:t>
+        <w:t>Acá se cuestiona el monto del haber máximo, como así también la quita que se produce tanto por su inadecuada movilidad y como por su aplicación, provocando un daño notorio en el haber, por cuanto si tengo que realizar una quita del 15% sobre un haber máximo no actualizado desde 1995 que se dictó la ley 24463, a mayo de 2006 que se incrementó con el Decreto Nº 764/06, un 11%, resultando el mismo de $3.441. Los aumentos posteriores otorgados a las prestaciones previsionales mediante la Ley 26.198, los Decretos 1346/07, 279/08 y posteriormente en virtud de la ley de movilidad 26.417, se reflejaron en el haber máximo. Pero de 2002 al 05-2006 NO, causando un perjuicio enorme a mi mandante en caso de ser alcanzado por el mismo.</w:t>
       </w:r>
     </w:p>
     <w:p>
@@ -6854,56 +4602,16 @@
         <w:t xml:space="preserve"> y así se resolvió en “</w:t>
       </w:r>
       <w:r>
-        <w:t xml:space="preserve">LEONARDUZZI, ROBERTO ATILIO c/ ANSES s/REAJUSTES POR MOVILIDAD” </w:t>
-      </w:r>
-      <w:proofErr w:type="spellStart"/>
-      <w:r>
-        <w:t>Expte</w:t>
-      </w:r>
-      <w:proofErr w:type="spellEnd"/>
-      <w:r>
-        <w:t xml:space="preserve">. </w:t>
-      </w:r>
-      <w:proofErr w:type="spellStart"/>
-      <w:r>
-        <w:t>N°</w:t>
-      </w:r>
-      <w:proofErr w:type="spellEnd"/>
-      <w:r>
-        <w:t xml:space="preserve"> FSA 8762/2022</w:t>
+        <w:t>LEONARDUZZI, ROBERTO ATILIO c/ ANSES s/REAJUSTES POR MOVILIDAD” Expte. N° FSA 8762/2022</w:t>
       </w:r>
       <w:r>
         <w:t xml:space="preserve"> e </w:t>
       </w:r>
       <w:r>
-        <w:t xml:space="preserve">“INCHAURRONDO, JOSE LUIS c/ ANSES s/ REAJUSTES VARIOS” </w:t>
-      </w:r>
-      <w:proofErr w:type="spellStart"/>
-      <w:r>
-        <w:t>Expte</w:t>
-      </w:r>
-      <w:proofErr w:type="spellEnd"/>
-      <w:r>
-        <w:t xml:space="preserve">. </w:t>
-      </w:r>
-      <w:proofErr w:type="spellStart"/>
-      <w:r>
-        <w:t>Nº</w:t>
-      </w:r>
-      <w:proofErr w:type="spellEnd"/>
-      <w:r>
-        <w:t xml:space="preserve"> FSA 379/2020</w:t>
-      </w:r>
-      <w:r>
-        <w:t xml:space="preserve">, a </w:t>
-      </w:r>
-      <w:proofErr w:type="gramStart"/>
-      <w:r>
-        <w:t>cuyo fundamentos</w:t>
-      </w:r>
-      <w:proofErr w:type="gramEnd"/>
-      <w:r>
-        <w:t xml:space="preserve"> me remito.</w:t>
+        <w:t>“INCHAURRONDO, JOSE LUIS c/ ANSES s/ REAJUSTES VARIOS” Expte. Nº FSA 379/2020</w:t>
+      </w:r>
+      <w:r>
+        <w:t>, a cuyo fundamentos me remito.</w:t>
       </w:r>
     </w:p>
     <w:p>
@@ -6915,15 +4623,7 @@
         <w:jc w:val="both"/>
       </w:pPr>
       <w:r>
-        <w:t xml:space="preserve">{% </w:t>
-      </w:r>
-      <w:proofErr w:type="spellStart"/>
-      <w:r>
-        <w:t>endif</w:t>
-      </w:r>
-      <w:proofErr w:type="spellEnd"/>
-      <w:r>
-        <w:t xml:space="preserve"> %}</w:t>
+        <w:t>{% endif %}</w:t>
       </w:r>
     </w:p>
     <w:p>
@@ -7025,21 +4725,7 @@
         <w:rPr>
           <w:lang w:val="es-AR"/>
         </w:rPr>
-        <w:t xml:space="preserve">Asimismo, requiero que dicha intimación se efectúe bajo apercibimiento de aplicar astreintes por cada día de demora en el cumplimiento de la manda judicial, conforme las facultades </w:t>
-      </w:r>
-      <w:proofErr w:type="spellStart"/>
-      <w:r>
-        <w:rPr>
-          <w:lang w:val="es-AR"/>
-        </w:rPr>
-        <w:t>ordenatorias</w:t>
-      </w:r>
-      <w:proofErr w:type="spellEnd"/>
-      <w:r>
-        <w:rPr>
-          <w:lang w:val="es-AR"/>
-        </w:rPr>
-        <w:t xml:space="preserve"> y disciplinarias conferidas a V.S. por el art. 37 del Código Procesal Civil y Comercial de la Nación, a fin de asegurar la eficacia real de la sentencia y evitar dilaciones indebidas en la percepción de un crédito de naturaleza alimentaria.</w:t>
+        <w:t>Asimismo, requiero que dicha intimación se efectúe bajo apercibimiento de aplicar astreintes por cada día de demora en el cumplimiento de la manda judicial, conforme las facultades ordenatorias y disciplinarias conferidas a V.S. por el art. 37 del Código Procesal Civil y Comercial de la Nación, a fin de asegurar la eficacia real de la sentencia y evitar dilaciones indebidas en la percepción de un crédito de naturaleza alimentaria.</w:t>
       </w:r>
     </w:p>
     <w:p>
@@ -7220,51 +4906,28 @@
         <w:adjustRightInd w:val="0"/>
         <w:jc w:val="both"/>
       </w:pPr>
-      <w:proofErr w:type="spellStart"/>
       <w:r>
         <w:t>Cuadro_Uma</w:t>
       </w:r>
-      <w:proofErr w:type="spellEnd"/>
-    </w:p>
-    <w:p>
-      <w:pPr>
-        <w:autoSpaceDE w:val="0"/>
-        <w:autoSpaceDN w:val="0"/>
-        <w:adjustRightInd w:val="0"/>
-        <w:jc w:val="both"/>
-      </w:pPr>
-    </w:p>
-    <w:p>
-      <w:pPr>
-        <w:autoSpaceDE w:val="0"/>
-        <w:autoSpaceDN w:val="0"/>
-        <w:adjustRightInd w:val="0"/>
-        <w:jc w:val="both"/>
-      </w:pPr>
-      <w:proofErr w:type="gramStart"/>
+    </w:p>
+    <w:p>
+      <w:pPr>
+        <w:autoSpaceDE w:val="0"/>
+        <w:autoSpaceDN w:val="0"/>
+        <w:adjustRightInd w:val="0"/>
+        <w:jc w:val="both"/>
+      </w:pPr>
+    </w:p>
+    <w:p>
+      <w:pPr>
+        <w:autoSpaceDE w:val="0"/>
+        <w:autoSpaceDN w:val="0"/>
+        <w:adjustRightInd w:val="0"/>
+        <w:jc w:val="both"/>
+      </w:pPr>
       <w:r>
         <w:lastRenderedPageBreak/>
-        <w:t xml:space="preserve">{{ </w:t>
-      </w:r>
-      <w:proofErr w:type="spellStart"/>
-      <w:r>
-        <w:t>cuadro</w:t>
-      </w:r>
-      <w:proofErr w:type="gramEnd"/>
-      <w:r>
-        <w:t>_</w:t>
-      </w:r>
-      <w:proofErr w:type="gramStart"/>
-      <w:r>
-        <w:t>honorarios</w:t>
-      </w:r>
-      <w:proofErr w:type="spellEnd"/>
-      <w:r>
-        <w:t xml:space="preserve"> }</w:t>
-      </w:r>
-      <w:proofErr w:type="gramEnd"/>
-      <w:r>
-        <w:t>}</w:t>
+        <w:t>{{ cuadro_honorarios }}</w:t>
       </w:r>
     </w:p>
     <w:p>
@@ -7344,21 +5007,7 @@
         <w:rPr>
           <w:lang w:val="es-AR"/>
         </w:rPr>
-        <w:t xml:space="preserve">En consecuencia, solicito se regulen los honorarios en esta etapa, </w:t>
-      </w:r>
-      <w:proofErr w:type="gramStart"/>
-      <w:r>
-        <w:rPr>
-          <w:lang w:val="es-AR"/>
-        </w:rPr>
-        <w:t>conjuntamente con</w:t>
-      </w:r>
-      <w:proofErr w:type="gramEnd"/>
-      <w:r>
-        <w:rPr>
-          <w:lang w:val="es-AR"/>
-        </w:rPr>
-        <w:t xml:space="preserve"> la aprobación del monto, conforme la normativa aplicable.</w:t>
+        <w:t>En consecuencia, solicito se regulen los honorarios en esta etapa, conjuntamente con la aprobación del monto, conforme la normativa aplicable.</w:t>
       </w:r>
     </w:p>
     <w:p>
@@ -7579,15 +5228,7 @@
         <w:jc w:val="both"/>
       </w:pPr>
       <w:r>
-        <w:t>La Corte Suprema ha reconocido que normas originariamente válidas pueden devenir inconstitucionales por el cambio de circunstancias (Fallos “</w:t>
-      </w:r>
-      <w:proofErr w:type="spellStart"/>
-      <w:r>
-        <w:t>Itzcovich</w:t>
-      </w:r>
-      <w:proofErr w:type="spellEnd"/>
-      <w:r>
-        <w:t>”, “Giménez”), doctrina plenamente aplicable cuando su aplicación concreta compromete derechos fundamentales y vacía de contenido el derecho reconocido.</w:t>
+        <w:t>La Corte Suprema ha reconocido que normas originariamente válidas pueden devenir inconstitucionales por el cambio de circunstancias (Fallos “Itzcovich”, “Giménez”), doctrina plenamente aplicable cuando su aplicación concreta compromete derechos fundamentales y vacía de contenido el derecho reconocido.</w:t>
       </w:r>
     </w:p>
     <w:p>
@@ -7994,61 +5635,19 @@
         <w:rPr>
           <w:lang w:val="en-US"/>
         </w:rPr>
-        <w:t xml:space="preserve">Por </w:t>
-      </w:r>
-      <w:proofErr w:type="spellStart"/>
+        <w:t>Por to</w:t>
+      </w:r>
       <w:r>
         <w:rPr>
           <w:lang w:val="en-US"/>
         </w:rPr>
-        <w:t>to</w:t>
+        <w:t xml:space="preserve">do </w:t>
       </w:r>
       <w:r>
         <w:rPr>
           <w:lang w:val="en-US"/>
         </w:rPr>
-        <w:t>do</w:t>
-      </w:r>
-      <w:proofErr w:type="spellEnd"/>
-      <w:r>
-        <w:rPr>
-          <w:lang w:val="en-US"/>
-        </w:rPr>
-        <w:t xml:space="preserve"> </w:t>
-      </w:r>
-      <w:r>
-        <w:rPr>
-          <w:lang w:val="en-US"/>
-        </w:rPr>
-        <w:t xml:space="preserve">lo </w:t>
-      </w:r>
-      <w:proofErr w:type="spellStart"/>
-      <w:r>
-        <w:rPr>
-          <w:lang w:val="en-US"/>
-        </w:rPr>
-        <w:t>expuesto</w:t>
-      </w:r>
-      <w:proofErr w:type="spellEnd"/>
-      <w:r>
-        <w:rPr>
-          <w:lang w:val="en-US"/>
-        </w:rPr>
-        <w:t xml:space="preserve">, a V.S. </w:t>
-      </w:r>
-      <w:proofErr w:type="spellStart"/>
-      <w:r>
-        <w:rPr>
-          <w:lang w:val="en-US"/>
-        </w:rPr>
-        <w:t>solicito</w:t>
-      </w:r>
-      <w:proofErr w:type="spellEnd"/>
-      <w:r>
-        <w:rPr>
-          <w:lang w:val="en-US"/>
-        </w:rPr>
-        <w:t>:</w:t>
+        <w:t>lo expuesto, a V.S. solicito:</w:t>
       </w:r>
     </w:p>
     <w:p>
@@ -8159,119 +5758,13 @@
         <w:rPr>
           <w:lang w:val="en-US"/>
         </w:rPr>
-        <w:t xml:space="preserve">Se intime a la </w:t>
-      </w:r>
-      <w:proofErr w:type="spellStart"/>
+        <w:t>Se intime a la demandada a adjuntar el RUB histórico completo de mi mandante.</w:t>
+      </w:r>
       <w:r>
         <w:rPr>
           <w:lang w:val="en-US"/>
         </w:rPr>
-        <w:t>demandada</w:t>
-      </w:r>
-      <w:proofErr w:type="spellEnd"/>
-      <w:r>
-        <w:rPr>
-          <w:lang w:val="en-US"/>
-        </w:rPr>
-        <w:t xml:space="preserve"> </w:t>
-      </w:r>
-      <w:proofErr w:type="gramStart"/>
-      <w:r>
-        <w:rPr>
-          <w:lang w:val="en-US"/>
-        </w:rPr>
-        <w:t>a</w:t>
-      </w:r>
-      <w:proofErr w:type="gramEnd"/>
-      <w:r>
-        <w:rPr>
-          <w:lang w:val="en-US"/>
-        </w:rPr>
-        <w:t xml:space="preserve"> </w:t>
-      </w:r>
-      <w:proofErr w:type="spellStart"/>
-      <w:r>
-        <w:rPr>
-          <w:lang w:val="en-US"/>
-        </w:rPr>
-        <w:t>adjuntar</w:t>
-      </w:r>
-      <w:proofErr w:type="spellEnd"/>
-      <w:r>
-        <w:rPr>
-          <w:lang w:val="en-US"/>
-        </w:rPr>
-        <w:t xml:space="preserve"> </w:t>
-      </w:r>
-      <w:proofErr w:type="spellStart"/>
-      <w:r>
-        <w:rPr>
-          <w:lang w:val="en-US"/>
-        </w:rPr>
-        <w:t>el</w:t>
-      </w:r>
-      <w:proofErr w:type="spellEnd"/>
-      <w:r>
-        <w:rPr>
-          <w:lang w:val="en-US"/>
-        </w:rPr>
-        <w:t xml:space="preserve"> RUB histórico </w:t>
-      </w:r>
-      <w:proofErr w:type="spellStart"/>
-      <w:r>
-        <w:rPr>
-          <w:lang w:val="en-US"/>
-        </w:rPr>
-        <w:t>completo</w:t>
-      </w:r>
-      <w:proofErr w:type="spellEnd"/>
-      <w:r>
-        <w:rPr>
-          <w:lang w:val="en-US"/>
-        </w:rPr>
-        <w:t xml:space="preserve"> de mi </w:t>
-      </w:r>
-      <w:proofErr w:type="spellStart"/>
-      <w:proofErr w:type="gramStart"/>
-      <w:r>
-        <w:rPr>
-          <w:lang w:val="en-US"/>
-        </w:rPr>
-        <w:t>mandante</w:t>
-      </w:r>
-      <w:proofErr w:type="spellEnd"/>
-      <w:r>
-        <w:rPr>
-          <w:lang w:val="en-US"/>
-        </w:rPr>
-        <w:t>.</w:t>
-      </w:r>
-      <w:r>
-        <w:rPr>
-          <w:lang w:val="en-US"/>
-        </w:rPr>
-        <w:t>{</w:t>
-      </w:r>
-      <w:proofErr w:type="gramEnd"/>
-      <w:r>
-        <w:rPr>
-          <w:lang w:val="en-US"/>
-        </w:rPr>
-        <w:t xml:space="preserve">%if </w:t>
-      </w:r>
-      <w:proofErr w:type="spellStart"/>
-      <w:r>
-        <w:rPr>
-          <w:lang w:val="en-US"/>
-        </w:rPr>
-        <w:t>inconstitucionalidad_si</w:t>
-      </w:r>
-      <w:proofErr w:type="spellEnd"/>
-      <w:r>
-        <w:rPr>
-          <w:lang w:val="en-US"/>
-        </w:rPr>
-        <w:t>%}</w:t>
+        <w:t>{%if inconstitucionalidad_si%}</w:t>
       </w:r>
     </w:p>
     <w:p>
@@ -8295,183 +5788,7 @@
           <w:highlight w:val="yellow"/>
           <w:lang w:val="es-AR"/>
         </w:rPr>
-        <w:t>Se declare la inconstitucionalidad {%</w:t>
-      </w:r>
-      <w:proofErr w:type="spellStart"/>
-      <w:r>
-        <w:rPr>
-          <w:highlight w:val="yellow"/>
-          <w:lang w:val="es-AR"/>
-        </w:rPr>
-        <w:t>if</w:t>
-      </w:r>
-      <w:proofErr w:type="spellEnd"/>
-      <w:r>
-        <w:rPr>
-          <w:highlight w:val="yellow"/>
-          <w:lang w:val="es-AR"/>
-        </w:rPr>
-        <w:t xml:space="preserve"> inconstitucionalidad_27426_si%} de la Ley 27.426, {% </w:t>
-      </w:r>
-      <w:proofErr w:type="spellStart"/>
-      <w:r>
-        <w:rPr>
-          <w:highlight w:val="yellow"/>
-          <w:lang w:val="es-AR"/>
-        </w:rPr>
-        <w:t>endif</w:t>
-      </w:r>
-      <w:proofErr w:type="spellEnd"/>
-      <w:r>
-        <w:rPr>
-          <w:highlight w:val="yellow"/>
-          <w:lang w:val="es-AR"/>
-        </w:rPr>
-        <w:t xml:space="preserve"> %} {%</w:t>
-      </w:r>
-      <w:proofErr w:type="spellStart"/>
-      <w:r>
-        <w:rPr>
-          <w:highlight w:val="yellow"/>
-          <w:lang w:val="es-AR"/>
-        </w:rPr>
-        <w:t>if</w:t>
-      </w:r>
-      <w:proofErr w:type="spellEnd"/>
-      <w:r>
-        <w:rPr>
-          <w:highlight w:val="yellow"/>
-          <w:lang w:val="es-AR"/>
-        </w:rPr>
-        <w:t xml:space="preserve"> inconstitucionalidad_27541_si%} Ley 27.541, {% </w:t>
-      </w:r>
-      <w:proofErr w:type="spellStart"/>
-      <w:r>
-        <w:rPr>
-          <w:highlight w:val="yellow"/>
-          <w:lang w:val="es-AR"/>
-        </w:rPr>
-        <w:t>endif</w:t>
-      </w:r>
-      <w:proofErr w:type="spellEnd"/>
-      <w:r>
-        <w:rPr>
-          <w:highlight w:val="yellow"/>
-          <w:lang w:val="es-AR"/>
-        </w:rPr>
-        <w:t xml:space="preserve"> %} {%</w:t>
-      </w:r>
-      <w:proofErr w:type="spellStart"/>
-      <w:r>
-        <w:rPr>
-          <w:highlight w:val="yellow"/>
-          <w:lang w:val="es-AR"/>
-        </w:rPr>
-        <w:t>if</w:t>
-      </w:r>
-      <w:proofErr w:type="spellEnd"/>
-      <w:r>
-        <w:rPr>
-          <w:highlight w:val="yellow"/>
-          <w:lang w:val="es-AR"/>
-        </w:rPr>
-        <w:t xml:space="preserve"> inconstitucionalidad_27609%} 27.609 {% </w:t>
-      </w:r>
-      <w:proofErr w:type="spellStart"/>
-      <w:r>
-        <w:rPr>
-          <w:highlight w:val="yellow"/>
-          <w:lang w:val="es-AR"/>
-        </w:rPr>
-        <w:t>endif</w:t>
-      </w:r>
-      <w:proofErr w:type="spellEnd"/>
-      <w:r>
-        <w:rPr>
-          <w:highlight w:val="yellow"/>
-          <w:lang w:val="es-AR"/>
-        </w:rPr>
-        <w:t xml:space="preserve"> %} {%</w:t>
-      </w:r>
-      <w:proofErr w:type="spellStart"/>
-      <w:r>
-        <w:rPr>
-          <w:highlight w:val="yellow"/>
-          <w:lang w:val="es-AR"/>
-        </w:rPr>
-        <w:t>if</w:t>
-      </w:r>
-      <w:proofErr w:type="spellEnd"/>
-      <w:r>
-        <w:rPr>
-          <w:highlight w:val="yellow"/>
-          <w:lang w:val="es-AR"/>
-        </w:rPr>
-        <w:t xml:space="preserve"> inconstitucionalidad_decreto_274_si</w:t>
-      </w:r>
-      <w:proofErr w:type="gramStart"/>
-      <w:r>
-        <w:rPr>
-          <w:highlight w:val="yellow"/>
-          <w:lang w:val="es-AR"/>
-        </w:rPr>
-        <w:t>%}  del</w:t>
-      </w:r>
-      <w:proofErr w:type="gramEnd"/>
-      <w:r>
-        <w:rPr>
-          <w:highlight w:val="yellow"/>
-          <w:lang w:val="es-AR"/>
-        </w:rPr>
-        <w:t xml:space="preserve"> Decreto 274/</w:t>
-      </w:r>
-      <w:proofErr w:type="gramStart"/>
-      <w:r>
-        <w:rPr>
-          <w:highlight w:val="yellow"/>
-          <w:lang w:val="es-AR"/>
-        </w:rPr>
-        <w:t>24  {</w:t>
-      </w:r>
-      <w:proofErr w:type="gramEnd"/>
-      <w:r>
-        <w:rPr>
-          <w:highlight w:val="yellow"/>
-          <w:lang w:val="es-AR"/>
-        </w:rPr>
-        <w:t xml:space="preserve">% </w:t>
-      </w:r>
-      <w:proofErr w:type="spellStart"/>
-      <w:r>
-        <w:rPr>
-          <w:highlight w:val="yellow"/>
-          <w:lang w:val="es-AR"/>
-        </w:rPr>
-        <w:t>endif</w:t>
-      </w:r>
-      <w:proofErr w:type="spellEnd"/>
-      <w:r>
-        <w:rPr>
-          <w:highlight w:val="yellow"/>
-          <w:lang w:val="es-AR"/>
-        </w:rPr>
-        <w:t xml:space="preserve"> %} para el período en debate, disponiendo una movilidad que preserve efectivamente el poder adquisitivo del haber previsional. {% </w:t>
-      </w:r>
-      <w:proofErr w:type="spellStart"/>
-      <w:r>
-        <w:rPr>
-          <w:highlight w:val="yellow"/>
-          <w:lang w:val="es-AR"/>
-        </w:rPr>
-        <w:t>endif</w:t>
-      </w:r>
-      <w:proofErr w:type="spellEnd"/>
-      <w:r>
-        <w:rPr>
-          <w:highlight w:val="yellow"/>
-          <w:lang w:val="es-AR"/>
-        </w:rPr>
-        <w:t xml:space="preserve"> %}</w:t>
+        <w:t>Se declare la inconstitucionalidad {%if inconstitucionalidad_27426_si%} de la Ley 27.426, {% endif %} {%if inconstitucionalidad_27541_si%} Ley 27.541, {% endif %} {%if inconstitucionalidad_27609%} 27.609 {% endif %} {%if inconstitucionalidad_decreto_274_si%}  del Decreto 274/24  {% endif %} para el período en debate, disponiendo una movilidad que preserve efectivamente el poder adquisitivo del haber previsional. {% endif %}</w:t>
       </w:r>
     </w:p>
     <w:p>
@@ -8496,21 +5813,7 @@
         <w:rPr>
           <w:lang w:val="es-AR"/>
         </w:rPr>
-        <w:t xml:space="preserve">Se regulen los honorarios profesionales correspondientes a esta etapa, </w:t>
-      </w:r>
-      <w:proofErr w:type="gramStart"/>
-      <w:r>
-        <w:rPr>
-          <w:lang w:val="es-AR"/>
-        </w:rPr>
-        <w:t>conjuntamente con</w:t>
-      </w:r>
-      <w:proofErr w:type="gramEnd"/>
-      <w:r>
-        <w:rPr>
-          <w:lang w:val="es-AR"/>
-        </w:rPr>
-        <w:t xml:space="preserve"> la aprobación del monto, conforme lo dispuesto por los arts. 16, 22, 23, 24, 51 y 52 de la Ley 27.423.</w:t>
+        <w:t>Se regulen los honorarios profesionales correspondientes a esta etapa, conjuntamente con la aprobación del monto, conforme lo dispuesto por los arts. 16, 22, 23, 24, 51 y 52 de la Ley 27.423.</w:t>
       </w:r>
     </w:p>
     <w:p>
@@ -14003,6 +11306,7 @@
   <w:style w:type="character" w:default="1" w:styleId="Fuentedeprrafopredeter">
     <w:name w:val="Default Paragraph Font"/>
     <w:uiPriority w:val="1"/>
+    <w:semiHidden/>
     <w:unhideWhenUsed/>
   </w:style>
   <w:style w:type="table" w:default="1" w:styleId="Tablanormal">

</xml_diff>

<commit_message>
fix: corregir extracción de intereses y actualizar plantilla de liquidación
- Prompt: buscar capital/intereses/total en 'Saldos a la Fecha de Consolidacion' fila 'Efectivo' (formato BlueCorp)
- Plantilla: limpiar condicional duplicado de Opción 2

Co-Authored-By: Claude Sonnet 4.6 <noreply@anthropic.com>
</commit_message>
<xml_diff>
--- a/datos/escritos_liquidacion/Modelo_Escrito_liquidacion.docx
+++ b/datos/escritos_liquidacion/Modelo_Escrito_liquidacion.docx
@@ -1615,6 +1615,22 @@
         </w:rPr>
       </w:pPr>
       <w:r>
+        <w:t>{%if opción_2%}</w:t>
+      </w:r>
+    </w:p>
+    <w:p>
+      <w:pPr>
+        <w:autoSpaceDE w:val="0"/>
+        <w:autoSpaceDN w:val="0"/>
+        <w:adjustRightInd w:val="0"/>
+        <w:ind w:firstLine="1134"/>
+        <w:jc w:val="both"/>
+        <w:rPr>
+          <w:b/>
+          <w:bCs/>
+        </w:rPr>
+      </w:pPr>
+      <w:r>
         <w:rPr>
           <w:b/>
           <w:bCs/>
@@ -1860,27 +1876,6 @@
       </w:r>
       <w:r>
         <w:t xml:space="preserve"> </w:t>
-      </w:r>
-      <w:r>
-        <w:rPr>
-          <w:b/>
-          <w:bCs/>
-        </w:rPr>
-        <w:t>{%</w:t>
-      </w:r>
-      <w:r>
-        <w:rPr>
-          <w:b/>
-          <w:bCs/>
-        </w:rPr>
-        <w:t xml:space="preserve"> endif </w:t>
-      </w:r>
-      <w:r>
-        <w:rPr>
-          <w:b/>
-          <w:bCs/>
-        </w:rPr>
-        <w:t>%}</w:t>
       </w:r>
     </w:p>
     <w:p>
@@ -1981,6 +1976,13 @@
           <w:bCs/>
         </w:rPr>
       </w:pPr>
+      <w:r>
+        <w:rPr>
+          <w:b/>
+          <w:bCs/>
+        </w:rPr>
+        <w:t>{% endif %}</w:t>
+      </w:r>
       <w:r>
         <w:rPr>
           <w:b/>
@@ -4384,7 +4386,7 @@
           <w:noProof/>
         </w:rPr>
         <w:drawing>
-          <wp:inline distT="0" distB="0" distL="0" distR="0" wp14:anchorId="0A6F4340" wp14:editId="3572009D">
+          <wp:inline distT="0" distB="0" distL="0" distR="0" wp14:anchorId="0A6F4340" wp14:editId="630BDF27">
             <wp:extent cx="3710940" cy="3179171"/>
             <wp:effectExtent l="0" t="0" r="3810" b="2540"/>
             <wp:docPr id="507230546" name="Imagen 2" descr="Gráfico, Gráfico de barrasDescripción generada automáticamente con confianza media"/>

</xml_diff>

<commit_message>
fix: eliminar {%if opción_2%} huérfano que rompía balance Jinja2 en template de liquidación
El párrafo extra con {%if opción_2%} sin endif causaba un TemplateSyntaxError
al generar el escrito, redirigiendo hacia atrás en lugar de descargar el docx.

Co-Authored-By: Claude Sonnet 4.6 <noreply@anthropic.com>
</commit_message>
<xml_diff>
--- a/datos/escritos_liquidacion/Modelo_Escrito_liquidacion.docx
+++ b/datos/escritos_liquidacion/Modelo_Escrito_liquidacion.docx
@@ -1600,22 +1600,6 @@
           <w:szCs w:val="2"/>
         </w:rPr>
         <w:t>{%p if opción_2 %}</w:t>
-      </w:r>
-    </w:p>
-    <w:p>
-      <w:pPr>
-        <w:autoSpaceDE w:val="0"/>
-        <w:autoSpaceDN w:val="0"/>
-        <w:adjustRightInd w:val="0"/>
-        <w:ind w:firstLine="1134"/>
-        <w:jc w:val="both"/>
-        <w:rPr>
-          <w:b/>
-          <w:bCs/>
-        </w:rPr>
-      </w:pPr>
-      <w:r>
-        <w:t>{%if opción_2%}</w:t>
       </w:r>
     </w:p>
     <w:p>

</xml_diff>

<commit_message>
fix: actualizar formato de plantilla Modelo_Escrito_liquidacion.docx
Co-Authored-By: Claude Sonnet 4.6 <noreply@anthropic.com>
</commit_message>
<xml_diff>
--- a/datos/escritos_liquidacion/Modelo_Escrito_liquidacion.docx
+++ b/datos/escritos_liquidacion/Modelo_Escrito_liquidacion.docx
@@ -21,27 +21,45 @@
           <w:bCs/>
           <w:u w:val="single"/>
         </w:rPr>
-        <w:t>{%if impugnación%}</w:t>
-      </w:r>
-    </w:p>
-    <w:p>
-      <w:pPr>
-        <w:autoSpaceDE w:val="0"/>
-        <w:autoSpaceDN w:val="0"/>
-        <w:adjustRightInd w:val="0"/>
-        <w:jc w:val="both"/>
+        <w:t>{%</w:t>
+      </w:r>
+      <w:proofErr w:type="spellStart"/>
+      <w:r>
         <w:rPr>
           <w:b/>
           <w:bCs/>
           <w:u w:val="single"/>
         </w:rPr>
-      </w:pPr>
+        <w:t>if</w:t>
+      </w:r>
+      <w:proofErr w:type="spellEnd"/>
       <w:r>
         <w:rPr>
           <w:b/>
           <w:bCs/>
           <w:u w:val="single"/>
         </w:rPr>
+        <w:t xml:space="preserve"> impugnación%}</w:t>
+      </w:r>
+    </w:p>
+    <w:p>
+      <w:pPr>
+        <w:autoSpaceDE w:val="0"/>
+        <w:autoSpaceDN w:val="0"/>
+        <w:adjustRightInd w:val="0"/>
+        <w:jc w:val="both"/>
+        <w:rPr>
+          <w:b/>
+          <w:bCs/>
+          <w:u w:val="single"/>
+        </w:rPr>
+      </w:pPr>
+      <w:r>
+        <w:rPr>
+          <w:b/>
+          <w:bCs/>
+          <w:u w:val="single"/>
+        </w:rPr>
         <w:t>Impugno</w:t>
       </w:r>
       <w:r>
@@ -95,28 +113,25 @@
           <w:bCs/>
           <w:u w:val="single"/>
         </w:rPr>
-        <w:t>{% endif %}</w:t>
-      </w:r>
-    </w:p>
-    <w:p>
-      <w:pPr>
-        <w:autoSpaceDE w:val="0"/>
-        <w:autoSpaceDN w:val="0"/>
-        <w:adjustRightInd w:val="0"/>
-        <w:jc w:val="both"/>
+        <w:t xml:space="preserve">{% </w:t>
+      </w:r>
+      <w:proofErr w:type="spellStart"/>
+      <w:r>
         <w:rPr>
           <w:b/>
           <w:bCs/>
           <w:u w:val="single"/>
         </w:rPr>
-      </w:pPr>
+        <w:t>endif</w:t>
+      </w:r>
+      <w:proofErr w:type="spellEnd"/>
       <w:r>
         <w:rPr>
           <w:b/>
           <w:bCs/>
           <w:u w:val="single"/>
         </w:rPr>
-        <w:t>{%if readecuación%}</w:t>
+        <w:t xml:space="preserve"> %}</w:t>
       </w:r>
     </w:p>
     <w:p>
@@ -137,6 +152,45 @@
           <w:bCs/>
           <w:u w:val="single"/>
         </w:rPr>
+        <w:t>{%</w:t>
+      </w:r>
+      <w:proofErr w:type="spellStart"/>
+      <w:r>
+        <w:rPr>
+          <w:b/>
+          <w:bCs/>
+          <w:u w:val="single"/>
+        </w:rPr>
+        <w:t>if</w:t>
+      </w:r>
+      <w:proofErr w:type="spellEnd"/>
+      <w:r>
+        <w:rPr>
+          <w:b/>
+          <w:bCs/>
+          <w:u w:val="single"/>
+        </w:rPr>
+        <w:t xml:space="preserve"> readecuación%}</w:t>
+      </w:r>
+    </w:p>
+    <w:p>
+      <w:pPr>
+        <w:autoSpaceDE w:val="0"/>
+        <w:autoSpaceDN w:val="0"/>
+        <w:adjustRightInd w:val="0"/>
+        <w:jc w:val="both"/>
+        <w:rPr>
+          <w:b/>
+          <w:bCs/>
+          <w:u w:val="single"/>
+        </w:rPr>
+      </w:pPr>
+      <w:r>
+        <w:rPr>
+          <w:b/>
+          <w:bCs/>
+          <w:u w:val="single"/>
+        </w:rPr>
         <w:t>Readecuo. Adjunto planilla de liquidación por diferencias</w:t>
       </w:r>
     </w:p>
@@ -148,18 +202,42 @@
         <w:jc w:val="both"/>
       </w:pPr>
       <w:r>
-        <w:t>{% endif %}</w:t>
-      </w:r>
-    </w:p>
-    <w:p>
-      <w:pPr>
-        <w:autoSpaceDE w:val="0"/>
-        <w:autoSpaceDN w:val="0"/>
-        <w:adjustRightInd w:val="0"/>
-        <w:jc w:val="both"/>
-      </w:pPr>
-      <w:r>
-        <w:t>{%if primera_vez%}</w:t>
+        <w:t xml:space="preserve">{% </w:t>
+      </w:r>
+      <w:proofErr w:type="spellStart"/>
+      <w:r>
+        <w:t>endif</w:t>
+      </w:r>
+      <w:proofErr w:type="spellEnd"/>
+      <w:r>
+        <w:t xml:space="preserve"> %}</w:t>
+      </w:r>
+    </w:p>
+    <w:p>
+      <w:pPr>
+        <w:autoSpaceDE w:val="0"/>
+        <w:autoSpaceDN w:val="0"/>
+        <w:adjustRightInd w:val="0"/>
+        <w:jc w:val="both"/>
+      </w:pPr>
+      <w:r>
+        <w:t>{%</w:t>
+      </w:r>
+      <w:proofErr w:type="spellStart"/>
+      <w:r>
+        <w:t>if</w:t>
+      </w:r>
+      <w:proofErr w:type="spellEnd"/>
+      <w:r>
+        <w:t xml:space="preserve"> </w:t>
+      </w:r>
+      <w:proofErr w:type="spellStart"/>
+      <w:r>
+        <w:t>primera_vez</w:t>
+      </w:r>
+      <w:proofErr w:type="spellEnd"/>
+      <w:r>
+        <w:t>%}</w:t>
       </w:r>
     </w:p>
     <w:p>
@@ -186,7 +264,15 @@
         <w:jc w:val="both"/>
       </w:pPr>
       <w:r>
-        <w:t>{% endif %}</w:t>
+        <w:t xml:space="preserve">{% </w:t>
+      </w:r>
+      <w:proofErr w:type="spellStart"/>
+      <w:r>
+        <w:t>endif</w:t>
+      </w:r>
+      <w:proofErr w:type="spellEnd"/>
+      <w:r>
+        <w:t xml:space="preserve"> %}</w:t>
       </w:r>
     </w:p>
     <w:p>
@@ -249,8 +335,13 @@
       <w:r>
         <w:t xml:space="preserve">Belgrano </w:t>
       </w:r>
-      <w:r>
-        <w:t xml:space="preserve">Nº </w:t>
+      <w:proofErr w:type="spellStart"/>
+      <w:r>
+        <w:t>Nº</w:t>
+      </w:r>
+      <w:proofErr w:type="spellEnd"/>
+      <w:r>
+        <w:t xml:space="preserve"> </w:t>
       </w:r>
       <w:r>
         <w:t>1188</w:t>
@@ -297,7 +388,23 @@
           <w:b/>
           <w:bCs/>
         </w:rPr>
-        <w:t>{{nombre_caratula}}</w:t>
+        <w:t>{{</w:t>
+      </w:r>
+      <w:proofErr w:type="spellStart"/>
+      <w:r>
+        <w:rPr>
+          <w:b/>
+          <w:bCs/>
+        </w:rPr>
+        <w:t>nombre_caratula</w:t>
+      </w:r>
+      <w:proofErr w:type="spellEnd"/>
+      <w:r>
+        <w:rPr>
+          <w:b/>
+          <w:bCs/>
+        </w:rPr>
+        <w:t>}}</w:t>
       </w:r>
       <w:r>
         <w:rPr>
@@ -313,6 +420,7 @@
         </w:rPr>
         <w:t xml:space="preserve"> </w:t>
       </w:r>
+      <w:proofErr w:type="spellStart"/>
       <w:r>
         <w:rPr>
           <w:b/>
@@ -320,21 +428,50 @@
         </w:rPr>
         <w:t>Expte</w:t>
       </w:r>
-      <w:r>
-        <w:t xml:space="preserve">. Nº </w:t>
-      </w:r>
-      <w:r>
-        <w:t>{{numero_expte}}</w:t>
+      <w:proofErr w:type="spellEnd"/>
+      <w:r>
+        <w:t xml:space="preserve">. </w:t>
+      </w:r>
+      <w:proofErr w:type="spellStart"/>
+      <w:r>
+        <w:t>Nº</w:t>
+      </w:r>
+      <w:proofErr w:type="spellEnd"/>
+      <w:r>
+        <w:t xml:space="preserve"> </w:t>
+      </w:r>
+      <w:r>
+        <w:t>{{</w:t>
+      </w:r>
+      <w:proofErr w:type="spellStart"/>
+      <w:r>
+        <w:t>numero_expte</w:t>
+      </w:r>
+      <w:proofErr w:type="spellEnd"/>
+      <w:proofErr w:type="gramStart"/>
+      <w:r>
+        <w:t>}}</w:t>
       </w:r>
       <w:r>
         <w:t>/</w:t>
       </w:r>
-      <w:r>
-        <w:t>{{año_expte}}</w:t>
+      <w:proofErr w:type="gramEnd"/>
+      <w:r>
+        <w:t>{{</w:t>
+      </w:r>
+      <w:proofErr w:type="spellStart"/>
+      <w:r>
+        <w:t>año_expte</w:t>
+      </w:r>
+      <w:proofErr w:type="spellEnd"/>
+      <w:proofErr w:type="gramStart"/>
+      <w:r>
+        <w:t>}}</w:t>
       </w:r>
       <w:r>
         <w:t>a</w:t>
       </w:r>
+      <w:proofErr w:type="gramEnd"/>
       <w:r>
         <w:t xml:space="preserve"> V.S. muy respetuosamente digo:</w:t>
       </w:r>
@@ -367,6 +504,7 @@
       <w:r>
         <w:t xml:space="preserve"> </w:t>
       </w:r>
+      <w:proofErr w:type="gramStart"/>
       <w:r>
         <w:rPr>
           <w:b/>
@@ -379,7 +517,31 @@
           <w:b/>
           <w:bCs/>
         </w:rPr>
-        <w:t xml:space="preserve">  {%if impugnación%}</w:t>
+        <w:t xml:space="preserve">  {</w:t>
+      </w:r>
+      <w:proofErr w:type="gramEnd"/>
+      <w:r>
+        <w:rPr>
+          <w:b/>
+          <w:bCs/>
+        </w:rPr>
+        <w:t>%</w:t>
+      </w:r>
+      <w:proofErr w:type="spellStart"/>
+      <w:r>
+        <w:rPr>
+          <w:b/>
+          <w:bCs/>
+        </w:rPr>
+        <w:t>if</w:t>
+      </w:r>
+      <w:proofErr w:type="spellEnd"/>
+      <w:r>
+        <w:rPr>
+          <w:b/>
+          <w:bCs/>
+        </w:rPr>
+        <w:t xml:space="preserve"> impugnación%}</w:t>
       </w:r>
     </w:p>
     <w:p>
@@ -397,7 +559,15 @@
         <w:t>Impugno planilla presentada por el organismo previsional.</w:t>
       </w:r>
       <w:r>
-        <w:t xml:space="preserve"> {% endif %}</w:t>
+        <w:t xml:space="preserve"> {% </w:t>
+      </w:r>
+      <w:proofErr w:type="spellStart"/>
+      <w:r>
+        <w:t>endif</w:t>
+      </w:r>
+      <w:proofErr w:type="spellEnd"/>
+      <w:r>
+        <w:t xml:space="preserve"> %}</w:t>
       </w:r>
     </w:p>
     <w:p>
@@ -503,7 +673,21 @@
         <w:rPr>
           <w:lang w:val="es-AR"/>
         </w:rPr>
-        <w:t>Se intime a la demandada a reajustar correctamente el haber previsional conforme los parámetros fijados en la sentencia firme, bajo apercibimiento de aplicar astreintes en caso de incumplimiento, conforme las facultades ordenatorias y sancionatorias de V.S., atento al incumplimiento reiterado y sistemático en el cumplimiento integral de la manda judicial.</w:t>
+        <w:t xml:space="preserve">Se intime a la demandada a reajustar correctamente el haber previsional conforme los parámetros fijados en la sentencia firme, bajo apercibimiento de aplicar astreintes en caso de incumplimiento, conforme las facultades </w:t>
+      </w:r>
+      <w:proofErr w:type="spellStart"/>
+      <w:r>
+        <w:rPr>
+          <w:lang w:val="es-AR"/>
+        </w:rPr>
+        <w:t>ordenatorias</w:t>
+      </w:r>
+      <w:proofErr w:type="spellEnd"/>
+      <w:r>
+        <w:rPr>
+          <w:lang w:val="es-AR"/>
+        </w:rPr>
+        <w:t xml:space="preserve"> y sancionatorias de V.S., atento al incumplimiento reiterado y sistemático en el cumplimiento integral de la manda judicial.</w:t>
       </w:r>
     </w:p>
     <w:p>
@@ -540,7 +724,23 @@
         <w:t>Solicito se actualice la liquidación a la fecha de su aprobación, conforme a la tasa fijada en la sentencia (tasa pasiva comunicada 14290 del Banco Central de la República Argentina), teniendo en cuenta el período inflacionario transcurrido mientras se tramitaba el proceso y la demora ocasionada por el incumplimiento sistemático de la ANSES en cumplir integralmente con la manda judicial.</w:t>
       </w:r>
       <w:r>
-        <w:t xml:space="preserve"> {%if inconstitucionalidad_si%}</w:t>
+        <w:t xml:space="preserve"> {%</w:t>
+      </w:r>
+      <w:proofErr w:type="spellStart"/>
+      <w:r>
+        <w:t>if</w:t>
+      </w:r>
+      <w:proofErr w:type="spellEnd"/>
+      <w:r>
+        <w:t xml:space="preserve"> </w:t>
+      </w:r>
+      <w:proofErr w:type="spellStart"/>
+      <w:r>
+        <w:t>inconstitucionalidad_si</w:t>
+      </w:r>
+      <w:proofErr w:type="spellEnd"/>
+      <w:r>
+        <w:t>%}</w:t>
       </w:r>
     </w:p>
     <w:p>
@@ -564,7 +764,133 @@
           <w:bCs/>
           <w:lang w:val="es-AR"/>
         </w:rPr>
-        <w:t xml:space="preserve"> Planteo de inconstitucionalidad: Dejo planteada la inconstitucionalidad de la Ley {%if inconstitucionalidad_27426_si%} 27.426, {% endif %} {%if inconstitucionalidad_27541_si%} 27.541, {% endif %} {%if inconstitucionalidad_27609_si%} 27.609 {% endif %} {%if inconstitucionalidad_decreto_274_si%} del Decreto </w:t>
+        <w:t xml:space="preserve"> Planteo de inconstitucionalidad: Dejo planteada la inconstitucionalidad de la Ley {%</w:t>
+      </w:r>
+      <w:proofErr w:type="spellStart"/>
+      <w:r>
+        <w:rPr>
+          <w:b/>
+          <w:bCs/>
+          <w:lang w:val="es-AR"/>
+        </w:rPr>
+        <w:t>if</w:t>
+      </w:r>
+      <w:proofErr w:type="spellEnd"/>
+      <w:r>
+        <w:rPr>
+          <w:b/>
+          <w:bCs/>
+          <w:lang w:val="es-AR"/>
+        </w:rPr>
+        <w:t xml:space="preserve"> inconstitucionalidad_27426_si%} 27.426, {% </w:t>
+      </w:r>
+      <w:proofErr w:type="spellStart"/>
+      <w:r>
+        <w:rPr>
+          <w:b/>
+          <w:bCs/>
+          <w:lang w:val="es-AR"/>
+        </w:rPr>
+        <w:t>endif</w:t>
+      </w:r>
+      <w:proofErr w:type="spellEnd"/>
+      <w:r>
+        <w:rPr>
+          <w:b/>
+          <w:bCs/>
+          <w:lang w:val="es-AR"/>
+        </w:rPr>
+        <w:t xml:space="preserve"> %} {%</w:t>
+      </w:r>
+      <w:proofErr w:type="spellStart"/>
+      <w:r>
+        <w:rPr>
+          <w:b/>
+          <w:bCs/>
+          <w:lang w:val="es-AR"/>
+        </w:rPr>
+        <w:t>if</w:t>
+      </w:r>
+      <w:proofErr w:type="spellEnd"/>
+      <w:r>
+        <w:rPr>
+          <w:b/>
+          <w:bCs/>
+          <w:lang w:val="es-AR"/>
+        </w:rPr>
+        <w:t xml:space="preserve"> inconstitucionalidad_27541_si%} 27.541, {% </w:t>
+      </w:r>
+      <w:proofErr w:type="spellStart"/>
+      <w:r>
+        <w:rPr>
+          <w:b/>
+          <w:bCs/>
+          <w:lang w:val="es-AR"/>
+        </w:rPr>
+        <w:t>endif</w:t>
+      </w:r>
+      <w:proofErr w:type="spellEnd"/>
+      <w:r>
+        <w:rPr>
+          <w:b/>
+          <w:bCs/>
+          <w:lang w:val="es-AR"/>
+        </w:rPr>
+        <w:t xml:space="preserve"> %} {%</w:t>
+      </w:r>
+      <w:proofErr w:type="spellStart"/>
+      <w:r>
+        <w:rPr>
+          <w:b/>
+          <w:bCs/>
+          <w:lang w:val="es-AR"/>
+        </w:rPr>
+        <w:t>if</w:t>
+      </w:r>
+      <w:proofErr w:type="spellEnd"/>
+      <w:r>
+        <w:rPr>
+          <w:b/>
+          <w:bCs/>
+          <w:lang w:val="es-AR"/>
+        </w:rPr>
+        <w:t xml:space="preserve"> inconstitucionalidad_27609_si%} 27.609 {% </w:t>
+      </w:r>
+      <w:proofErr w:type="spellStart"/>
+      <w:r>
+        <w:rPr>
+          <w:b/>
+          <w:bCs/>
+          <w:lang w:val="es-AR"/>
+        </w:rPr>
+        <w:t>endif</w:t>
+      </w:r>
+      <w:proofErr w:type="spellEnd"/>
+      <w:r>
+        <w:rPr>
+          <w:b/>
+          <w:bCs/>
+          <w:lang w:val="es-AR"/>
+        </w:rPr>
+        <w:t xml:space="preserve"> %} {%</w:t>
+      </w:r>
+      <w:proofErr w:type="spellStart"/>
+      <w:r>
+        <w:rPr>
+          <w:b/>
+          <w:bCs/>
+          <w:lang w:val="es-AR"/>
+        </w:rPr>
+        <w:t>if</w:t>
+      </w:r>
+      <w:proofErr w:type="spellEnd"/>
+      <w:r>
+        <w:rPr>
+          <w:b/>
+          <w:bCs/>
+          <w:lang w:val="es-AR"/>
+        </w:rPr>
+        <w:t xml:space="preserve"> inconstitucionalidad_decreto_274_si%} del Decreto </w:t>
       </w:r>
       <w:r>
         <w:rPr>
@@ -573,7 +899,61 @@
           <w:lang w:val="es-AR"/>
         </w:rPr>
         <w:lastRenderedPageBreak/>
-        <w:t>274/2024, {% endif %} por resultar violatorios de los arts. 14 bis, 16, 17 y 28 de la Constitución Nacional, en tanto afectan la movilidad jubilatoria, el principio de sustitutividad y el carácter integral del haber previsional, configurando una regresión en materia de derechos sociales. {% endif %}</w:t>
+        <w:t xml:space="preserve">274/2024, {% </w:t>
+      </w:r>
+      <w:proofErr w:type="spellStart"/>
+      <w:r>
+        <w:rPr>
+          <w:b/>
+          <w:bCs/>
+          <w:lang w:val="es-AR"/>
+        </w:rPr>
+        <w:t>endif</w:t>
+      </w:r>
+      <w:proofErr w:type="spellEnd"/>
+      <w:r>
+        <w:rPr>
+          <w:b/>
+          <w:bCs/>
+          <w:lang w:val="es-AR"/>
+        </w:rPr>
+        <w:t xml:space="preserve"> %} por resultar violatorios de los arts. 14 bis, 16, 17 y 28 de la Constitución Nacional, en tanto afectan la movilidad jubilatoria, el principio de </w:t>
+      </w:r>
+      <w:proofErr w:type="spellStart"/>
+      <w:r>
+        <w:rPr>
+          <w:b/>
+          <w:bCs/>
+          <w:lang w:val="es-AR"/>
+        </w:rPr>
+        <w:t>sustitutividad</w:t>
+      </w:r>
+      <w:proofErr w:type="spellEnd"/>
+      <w:r>
+        <w:rPr>
+          <w:b/>
+          <w:bCs/>
+          <w:lang w:val="es-AR"/>
+        </w:rPr>
+        <w:t xml:space="preserve"> y el carácter integral del haber previsional, configurando una regresión en materia de derechos sociales. {% </w:t>
+      </w:r>
+      <w:proofErr w:type="spellStart"/>
+      <w:r>
+        <w:rPr>
+          <w:b/>
+          <w:bCs/>
+          <w:lang w:val="es-AR"/>
+        </w:rPr>
+        <w:t>endif</w:t>
+      </w:r>
+      <w:proofErr w:type="spellEnd"/>
+      <w:r>
+        <w:rPr>
+          <w:b/>
+          <w:bCs/>
+          <w:lang w:val="es-AR"/>
+        </w:rPr>
+        <w:t xml:space="preserve"> %}</w:t>
       </w:r>
     </w:p>
     <w:p>
@@ -783,7 +1163,55 @@
         <w:t xml:space="preserve"> Sala </w:t>
       </w:r>
       <w:r>
-        <w:t>{%if sala_1%} I .{% endif %} {%if sala_2%} II . {% endif %}</w:t>
+        <w:t>{%</w:t>
+      </w:r>
+      <w:proofErr w:type="spellStart"/>
+      <w:r>
+        <w:t>if</w:t>
+      </w:r>
+      <w:proofErr w:type="spellEnd"/>
+      <w:r>
+        <w:t xml:space="preserve"> sala_1%} </w:t>
+      </w:r>
+      <w:proofErr w:type="gramStart"/>
+      <w:r>
+        <w:t>I .</w:t>
+      </w:r>
+      <w:proofErr w:type="gramEnd"/>
+      <w:r>
+        <w:t xml:space="preserve">{% </w:t>
+      </w:r>
+      <w:proofErr w:type="spellStart"/>
+      <w:r>
+        <w:t>endif</w:t>
+      </w:r>
+      <w:proofErr w:type="spellEnd"/>
+      <w:r>
+        <w:t xml:space="preserve"> %} {%</w:t>
+      </w:r>
+      <w:proofErr w:type="spellStart"/>
+      <w:r>
+        <w:t>if</w:t>
+      </w:r>
+      <w:proofErr w:type="spellEnd"/>
+      <w:r>
+        <w:t xml:space="preserve"> sala_2%} </w:t>
+      </w:r>
+      <w:proofErr w:type="gramStart"/>
+      <w:r>
+        <w:t>II .</w:t>
+      </w:r>
+      <w:proofErr w:type="gramEnd"/>
+      <w:r>
+        <w:t xml:space="preserve"> {% </w:t>
+      </w:r>
+      <w:proofErr w:type="spellStart"/>
+      <w:r>
+        <w:t>endif</w:t>
+      </w:r>
+      <w:proofErr w:type="spellEnd"/>
+      <w:r>
+        <w:t xml:space="preserve"> %}</w:t>
       </w:r>
     </w:p>
     <w:p>
@@ -860,7 +1288,27 @@
           <w:highlight w:val="yellow"/>
           <w:u w:val="single"/>
         </w:rPr>
-        <w:t>{%if impugnación%}</w:t>
+        <w:t>{%</w:t>
+      </w:r>
+      <w:proofErr w:type="spellStart"/>
+      <w:r>
+        <w:rPr>
+          <w:b/>
+          <w:bCs/>
+          <w:highlight w:val="yellow"/>
+          <w:u w:val="single"/>
+        </w:rPr>
+        <w:t>if</w:t>
+      </w:r>
+      <w:proofErr w:type="spellEnd"/>
+      <w:r>
+        <w:rPr>
+          <w:b/>
+          <w:bCs/>
+          <w:highlight w:val="yellow"/>
+          <w:u w:val="single"/>
+        </w:rPr>
+        <w:t xml:space="preserve"> impugnación%}</w:t>
       </w:r>
     </w:p>
     <w:p>
@@ -929,7 +1377,31 @@
         <w:jc w:val="both"/>
       </w:pPr>
       <w:r>
-        <w:t>La liquidación de Anses adolece de los siguientes errores, que tornan invalida toda la liquidación. {%if no_reajusta_pbu%}</w:t>
+        <w:t xml:space="preserve">La liquidación de </w:t>
+      </w:r>
+      <w:proofErr w:type="spellStart"/>
+      <w:r>
+        <w:t>Anses</w:t>
+      </w:r>
+      <w:proofErr w:type="spellEnd"/>
+      <w:r>
+        <w:t xml:space="preserve"> adolece de los siguientes errores, que tornan invalida toda la liquidación. {%</w:t>
+      </w:r>
+      <w:proofErr w:type="spellStart"/>
+      <w:r>
+        <w:t>if</w:t>
+      </w:r>
+      <w:proofErr w:type="spellEnd"/>
+      <w:r>
+        <w:t xml:space="preserve"> </w:t>
+      </w:r>
+      <w:proofErr w:type="spellStart"/>
+      <w:r>
+        <w:t>no_reajusta_pbu</w:t>
+      </w:r>
+      <w:proofErr w:type="spellEnd"/>
+      <w:r>
+        <w:t>%}</w:t>
       </w:r>
     </w:p>
     <w:p>
@@ -946,7 +1418,31 @@
         <w:t>No reajusta PBU por lo cual toda la liquidación deviene errónea.</w:t>
       </w:r>
       <w:r>
-        <w:t xml:space="preserve"> {% endif %} {%if corta_intereses_tres_meses%}</w:t>
+        <w:t xml:space="preserve"> {% </w:t>
+      </w:r>
+      <w:proofErr w:type="spellStart"/>
+      <w:r>
+        <w:t>endif</w:t>
+      </w:r>
+      <w:proofErr w:type="spellEnd"/>
+      <w:r>
+        <w:t xml:space="preserve"> %} {%</w:t>
+      </w:r>
+      <w:proofErr w:type="spellStart"/>
+      <w:r>
+        <w:t>if</w:t>
+      </w:r>
+      <w:proofErr w:type="spellEnd"/>
+      <w:r>
+        <w:t xml:space="preserve"> </w:t>
+      </w:r>
+      <w:proofErr w:type="spellStart"/>
+      <w:r>
+        <w:t>corta_intereses_tres_meses</w:t>
+      </w:r>
+      <w:proofErr w:type="spellEnd"/>
+      <w:r>
+        <w:t>%}</w:t>
       </w:r>
     </w:p>
     <w:p>
@@ -968,7 +1464,31 @@
         <w:t>Corta los intereses tres meses antes del cierre de la liquidación.</w:t>
       </w:r>
       <w:r>
-        <w:t xml:space="preserve"> {% endif %} {%if reajusta_haber%}</w:t>
+        <w:t xml:space="preserve"> {% </w:t>
+      </w:r>
+      <w:proofErr w:type="spellStart"/>
+      <w:r>
+        <w:t>endif</w:t>
+      </w:r>
+      <w:proofErr w:type="spellEnd"/>
+      <w:r>
+        <w:t xml:space="preserve"> %} {%</w:t>
+      </w:r>
+      <w:proofErr w:type="spellStart"/>
+      <w:r>
+        <w:t>if</w:t>
+      </w:r>
+      <w:proofErr w:type="spellEnd"/>
+      <w:r>
+        <w:t xml:space="preserve"> </w:t>
+      </w:r>
+      <w:proofErr w:type="spellStart"/>
+      <w:r>
+        <w:t>reajusta_haber</w:t>
+      </w:r>
+      <w:proofErr w:type="spellEnd"/>
+      <w:r>
+        <w:t>%}</w:t>
       </w:r>
     </w:p>
     <w:p>
@@ -991,7 +1511,31 @@
         <w:t>Reajusta el haber de mi mandante utilizando solamente movilidad de la ley general.</w:t>
       </w:r>
       <w:r>
-        <w:t xml:space="preserve"> {% endif %} {%if no_toma_sumas_rem%}</w:t>
+        <w:t xml:space="preserve"> {% </w:t>
+      </w:r>
+      <w:proofErr w:type="spellStart"/>
+      <w:r>
+        <w:t>endif</w:t>
+      </w:r>
+      <w:proofErr w:type="spellEnd"/>
+      <w:r>
+        <w:t xml:space="preserve"> %} {%</w:t>
+      </w:r>
+      <w:proofErr w:type="spellStart"/>
+      <w:r>
+        <w:t>if</w:t>
+      </w:r>
+      <w:proofErr w:type="spellEnd"/>
+      <w:r>
+        <w:t xml:space="preserve"> </w:t>
+      </w:r>
+      <w:proofErr w:type="spellStart"/>
+      <w:r>
+        <w:t>no_toma_sumas_rem</w:t>
+      </w:r>
+      <w:proofErr w:type="spellEnd"/>
+      <w:r>
+        <w:t>%}</w:t>
       </w:r>
     </w:p>
     <w:p>
@@ -1013,7 +1557,31 @@
         <w:t>No se procedió a la incorporación de las sumas no remunerativas para el recalculo del haber inicial, conforme lo ordena sentencia de fecha (fecha de juzgado)</w:t>
       </w:r>
       <w:r>
-        <w:t xml:space="preserve"> {% endif %} {%if no_corrige_error_material%}</w:t>
+        <w:t xml:space="preserve"> {% </w:t>
+      </w:r>
+      <w:proofErr w:type="spellStart"/>
+      <w:r>
+        <w:t>endif</w:t>
+      </w:r>
+      <w:proofErr w:type="spellEnd"/>
+      <w:r>
+        <w:t xml:space="preserve"> %} {%</w:t>
+      </w:r>
+      <w:proofErr w:type="spellStart"/>
+      <w:r>
+        <w:t>if</w:t>
+      </w:r>
+      <w:proofErr w:type="spellEnd"/>
+      <w:r>
+        <w:t xml:space="preserve"> </w:t>
+      </w:r>
+      <w:proofErr w:type="spellStart"/>
+      <w:r>
+        <w:t>no_corrige_error_material</w:t>
+      </w:r>
+      <w:proofErr w:type="spellEnd"/>
+      <w:r>
+        <w:t>%}</w:t>
       </w:r>
     </w:p>
     <w:p>
@@ -1031,14 +1599,35 @@
           <w:bCs/>
         </w:rPr>
       </w:pPr>
-      <w:r>
-        <w:t>Anses no rectifico las remuneraciones por el período (periodo del error material), conforme lo ordena la sentencia de fecha (fecha de juzgado), en cuanto existía un error material en el cálculo del haber inicial.</w:t>
-      </w:r>
-      <w:r>
-        <w:t xml:space="preserve"> {% endif %}</w:t>
-      </w:r>
-      <w:r>
-        <w:t xml:space="preserve"> {% endif %}</w:t>
+      <w:proofErr w:type="spellStart"/>
+      <w:r>
+        <w:t>Anses</w:t>
+      </w:r>
+      <w:proofErr w:type="spellEnd"/>
+      <w:r>
+        <w:t xml:space="preserve"> no rectifico las remuneraciones por el período (periodo del error material), conforme lo ordena la sentencia de fecha (fecha de juzgado), en cuanto existía un error material en el cálculo del haber inicial.</w:t>
+      </w:r>
+      <w:r>
+        <w:t xml:space="preserve"> {% </w:t>
+      </w:r>
+      <w:proofErr w:type="spellStart"/>
+      <w:r>
+        <w:t>endif</w:t>
+      </w:r>
+      <w:proofErr w:type="spellEnd"/>
+      <w:r>
+        <w:t xml:space="preserve"> %}</w:t>
+      </w:r>
+      <w:r>
+        <w:t xml:space="preserve"> {% </w:t>
+      </w:r>
+      <w:proofErr w:type="spellStart"/>
+      <w:r>
+        <w:t>endif</w:t>
+      </w:r>
+      <w:proofErr w:type="spellEnd"/>
+      <w:r>
+        <w:t xml:space="preserve"> %}</w:t>
       </w:r>
     </w:p>
     <w:p>
@@ -1125,19 +1714,85 @@
         <w:jc w:val="both"/>
       </w:pPr>
       <w:r>
-        <w:t xml:space="preserve">Que vengo por el presente a promover ejecución de sentencia por las diferencias de haberes previsionales e intereses adeudados por la ANSeS correspondientes al período </w:t>
-      </w:r>
-      <w:r>
-        <w:t>{{ fecha_inicial_de_pago }}</w:t>
+        <w:t xml:space="preserve">Que vengo por el presente a promover ejecución de sentencia por las diferencias de haberes previsionales e intereses adeudados por la </w:t>
+      </w:r>
+      <w:proofErr w:type="spellStart"/>
+      <w:r>
+        <w:t>ANSeS</w:t>
+      </w:r>
+      <w:proofErr w:type="spellEnd"/>
+      <w:r>
+        <w:t xml:space="preserve"> correspondientes al período </w:t>
+      </w:r>
+      <w:proofErr w:type="gramStart"/>
+      <w:r>
+        <w:t xml:space="preserve">{{ </w:t>
+      </w:r>
+      <w:proofErr w:type="spellStart"/>
+      <w:r>
+        <w:t>fecha</w:t>
+      </w:r>
+      <w:proofErr w:type="gramEnd"/>
+      <w:r>
+        <w:t>_inicial_de_</w:t>
+      </w:r>
+      <w:proofErr w:type="gramStart"/>
+      <w:r>
+        <w:t>pago</w:t>
+      </w:r>
+      <w:proofErr w:type="spellEnd"/>
+      <w:r>
+        <w:t xml:space="preserve"> }</w:t>
+      </w:r>
+      <w:proofErr w:type="gramEnd"/>
+      <w:r>
+        <w:t>}</w:t>
       </w:r>
       <w:r>
         <w:t xml:space="preserve"> al </w:t>
       </w:r>
-      <w:r>
-        <w:t>{{ fecha_de_cierre }}</w:t>
-      </w:r>
-      <w:r>
-        <w:t>, en razón de no haber sido redeterminado el haber de mi mandante conforme la sentencia firme recaída en autos.</w:t>
+      <w:proofErr w:type="gramStart"/>
+      <w:r>
+        <w:t xml:space="preserve">{{ </w:t>
+      </w:r>
+      <w:proofErr w:type="spellStart"/>
+      <w:r>
+        <w:t>fecha</w:t>
+      </w:r>
+      <w:proofErr w:type="gramEnd"/>
+      <w:r>
+        <w:t>_de_</w:t>
+      </w:r>
+      <w:proofErr w:type="gramStart"/>
+      <w:r>
+        <w:t>cierre</w:t>
+      </w:r>
+      <w:proofErr w:type="spellEnd"/>
+      <w:r>
+        <w:t xml:space="preserve"> }</w:t>
+      </w:r>
+      <w:proofErr w:type="gramEnd"/>
+      <w:r>
+        <w:t>}</w:t>
+      </w:r>
+      <w:r>
+        <w:t xml:space="preserve">, </w:t>
+      </w:r>
+      <w:proofErr w:type="gramStart"/>
+      <w:r>
+        <w:t>en razón de</w:t>
+      </w:r>
+      <w:proofErr w:type="gramEnd"/>
+      <w:r>
+        <w:t xml:space="preserve"> no haber sido </w:t>
+      </w:r>
+      <w:proofErr w:type="spellStart"/>
+      <w:r>
+        <w:t>redeterminado</w:t>
+      </w:r>
+      <w:proofErr w:type="spellEnd"/>
+      <w:r>
+        <w:t xml:space="preserve"> el haber de mi mandante conforme la sentencia firme recaída en autos.</w:t>
       </w:r>
     </w:p>
     <w:p>
@@ -1157,20 +1812,57 @@
       <w:r>
         <w:t xml:space="preserve"> al </w:t>
       </w:r>
-      <w:r>
-        <w:t>{{ fecha_haber_reclamado }}</w:t>
+      <w:proofErr w:type="gramStart"/>
+      <w:r>
+        <w:t xml:space="preserve">{{ </w:t>
+      </w:r>
+      <w:proofErr w:type="spellStart"/>
+      <w:r>
+        <w:t>fecha</w:t>
+      </w:r>
+      <w:proofErr w:type="gramEnd"/>
+      <w:r>
+        <w:t>_haber_</w:t>
+      </w:r>
+      <w:proofErr w:type="gramStart"/>
+      <w:r>
+        <w:t>reclamado</w:t>
+      </w:r>
+      <w:proofErr w:type="spellEnd"/>
+      <w:r>
+        <w:t xml:space="preserve"> }</w:t>
+      </w:r>
+      <w:proofErr w:type="gramEnd"/>
+      <w:r>
+        <w:t>}</w:t>
       </w:r>
       <w:r>
         <w:t xml:space="preserve"> ($</w:t>
       </w:r>
       <w:r>
-        <w:t>{{haber_reclamado}}</w:t>
+        <w:t>{{</w:t>
+      </w:r>
+      <w:proofErr w:type="spellStart"/>
+      <w:r>
+        <w:t>haber_reclamado</w:t>
+      </w:r>
+      <w:proofErr w:type="spellEnd"/>
+      <w:r>
+        <w:t>}}</w:t>
       </w:r>
       <w:r>
         <w:t>), siendo el haber percibido a dicha fecha $</w:t>
       </w:r>
       <w:r>
-        <w:t>{{haber_percibido}}</w:t>
+        <w:t>{{</w:t>
+      </w:r>
+      <w:proofErr w:type="spellStart"/>
+      <w:r>
+        <w:t>haber_percibido</w:t>
+      </w:r>
+      <w:proofErr w:type="spellEnd"/>
+      <w:r>
+        <w:t>}}</w:t>
       </w:r>
       <w:r>
         <w:t>. A partir de esa base uniforme, se proyecta mes a mes la evolución del haber conforme el índice de movilidad aplicado en cada opción, determinándose las diferencias y sus intereses hasta la fecha de corte.</w:t>
@@ -1206,13 +1898,34 @@
         <w:t xml:space="preserve"> </w:t>
       </w:r>
       <w:r>
-        <w:t>{%if reparación_historica%}</w:t>
+        <w:t>{%</w:t>
+      </w:r>
+      <w:proofErr w:type="spellStart"/>
+      <w:r>
+        <w:t>if</w:t>
+      </w:r>
+      <w:proofErr w:type="spellEnd"/>
+      <w:r>
+        <w:t xml:space="preserve"> </w:t>
+      </w:r>
+      <w:proofErr w:type="spellStart"/>
+      <w:r>
+        <w:t>reparación_historica</w:t>
+      </w:r>
+      <w:proofErr w:type="spellEnd"/>
+      <w:proofErr w:type="gramStart"/>
+      <w:r>
+        <w:t>%}</w:t>
       </w:r>
       <w:r>
         <w:t>S</w:t>
       </w:r>
       <w:r>
-        <w:t xml:space="preserve">e computó </w:t>
+        <w:t>e</w:t>
+      </w:r>
+      <w:proofErr w:type="gramEnd"/>
+      <w:r>
+        <w:t xml:space="preserve"> computó </w:t>
       </w:r>
       <w:r>
         <w:t xml:space="preserve">el concepto de </w:t>
@@ -1230,8 +1943,13 @@
         <w:t xml:space="preserve"> </w:t>
       </w:r>
       <w:r>
-        <w:t>no asi</w:t>
-      </w:r>
+        <w:t xml:space="preserve">no </w:t>
+      </w:r>
+      <w:proofErr w:type="spellStart"/>
+      <w:r>
+        <w:t>asi</w:t>
+      </w:r>
+      <w:proofErr w:type="spellEnd"/>
       <w:r>
         <w:t xml:space="preserve"> suplementos no percibidos</w:t>
       </w:r>
@@ -1239,7 +1957,15 @@
         <w:t xml:space="preserve"> y no se aplicó quita por confiscatoriedad.</w:t>
       </w:r>
       <w:r>
-        <w:t xml:space="preserve"> {% endif %}</w:t>
+        <w:t xml:space="preserve"> {% </w:t>
+      </w:r>
+      <w:proofErr w:type="spellStart"/>
+      <w:r>
+        <w:t>endif</w:t>
+      </w:r>
+      <w:proofErr w:type="spellEnd"/>
+      <w:r>
+        <w:t xml:space="preserve"> %}</w:t>
       </w:r>
     </w:p>
     <w:p>
@@ -1254,7 +1980,15 @@
         <w:t>La variación de resultados obedece únicamente al índice de movilidad considerado, siendo los cálculos matemáticamente verificables por la contraria.</w:t>
       </w:r>
       <w:r>
-        <w:t xml:space="preserve"> {%if opción_1%} </w:t>
+        <w:t xml:space="preserve"> {%</w:t>
+      </w:r>
+      <w:proofErr w:type="spellStart"/>
+      <w:r>
+        <w:t>if</w:t>
+      </w:r>
+      <w:proofErr w:type="spellEnd"/>
+      <w:r>
+        <w:t xml:space="preserve"> opción_1%} </w:t>
       </w:r>
     </w:p>
     <w:p>
@@ -1290,7 +2024,23 @@
           <w:b/>
           <w:bCs/>
         </w:rPr>
-        <w:t xml:space="preserve"> {%if tope_9_opcion_1%}</w:t>
+        <w:t xml:space="preserve"> {%</w:t>
+      </w:r>
+      <w:proofErr w:type="spellStart"/>
+      <w:r>
+        <w:rPr>
+          <w:b/>
+          <w:bCs/>
+        </w:rPr>
+        <w:t>if</w:t>
+      </w:r>
+      <w:proofErr w:type="spellEnd"/>
+      <w:r>
+        <w:rPr>
+          <w:b/>
+          <w:bCs/>
+        </w:rPr>
+        <w:t xml:space="preserve"> tope_9_opcion_1%}</w:t>
       </w:r>
     </w:p>
     <w:p>
@@ -1326,13 +2076,49 @@
         <w:rPr>
           <w:lang w:val="es-AR"/>
         </w:rPr>
-        <w:t>El tope del haber máximo Art.9 inc.3 Ley 24463 se actualizó desde Enero de 2002 según la movilidad del fallo Badaro</w:t>
-      </w:r>
-      <w:r>
-        <w:rPr>
-          <w:lang w:val="es-AR"/>
-        </w:rPr>
-        <w:t>. {% endif %}</w:t>
+        <w:t xml:space="preserve">El tope del haber máximo Art.9 inc.3 Ley 24463 se actualizó desde </w:t>
+      </w:r>
+      <w:proofErr w:type="gramStart"/>
+      <w:r>
+        <w:rPr>
+          <w:lang w:val="es-AR"/>
+        </w:rPr>
+        <w:t>Enero</w:t>
+      </w:r>
+      <w:proofErr w:type="gramEnd"/>
+      <w:r>
+        <w:rPr>
+          <w:lang w:val="es-AR"/>
+        </w:rPr>
+        <w:t xml:space="preserve"> de 2002 según la movilidad del fallo </w:t>
+      </w:r>
+      <w:proofErr w:type="spellStart"/>
+      <w:r>
+        <w:rPr>
+          <w:lang w:val="es-AR"/>
+        </w:rPr>
+        <w:t>Badaro</w:t>
+      </w:r>
+      <w:proofErr w:type="spellEnd"/>
+      <w:r>
+        <w:rPr>
+          <w:lang w:val="es-AR"/>
+        </w:rPr>
+        <w:t xml:space="preserve">. {% </w:t>
+      </w:r>
+      <w:proofErr w:type="spellStart"/>
+      <w:r>
+        <w:rPr>
+          <w:lang w:val="es-AR"/>
+        </w:rPr>
+        <w:t>endif</w:t>
+      </w:r>
+      <w:proofErr w:type="spellEnd"/>
+      <w:r>
+        <w:rPr>
+          <w:lang w:val="es-AR"/>
+        </w:rPr>
+        <w:t xml:space="preserve"> %}</w:t>
       </w:r>
     </w:p>
     <w:p>
@@ -1361,7 +2147,15 @@
         <w:t xml:space="preserve">se calcularon hasta el </w:t>
       </w:r>
       <w:r>
-        <w:t>{{fecha_intereses}}</w:t>
+        <w:t>{{</w:t>
+      </w:r>
+      <w:proofErr w:type="spellStart"/>
+      <w:r>
+        <w:t>fecha_intereses</w:t>
+      </w:r>
+      <w:proofErr w:type="spellEnd"/>
+      <w:r>
+        <w:t>}}</w:t>
       </w:r>
       <w:r>
         <w:t xml:space="preserve"> </w:t>
@@ -1398,8 +2192,37 @@
         </w:rPr>
         <w:t xml:space="preserve">Movilidad: </w:t>
       </w:r>
-      <w:r>
-        <w:t>{{ movilidad_opcion_1 }} {%if tuvo_pagos%}</w:t>
+      <w:proofErr w:type="gramStart"/>
+      <w:r>
+        <w:t>{{ movilidad</w:t>
+      </w:r>
+      <w:proofErr w:type="gramEnd"/>
+      <w:r>
+        <w:t>_opcion_</w:t>
+      </w:r>
+      <w:proofErr w:type="gramStart"/>
+      <w:r>
+        <w:t>1 }</w:t>
+      </w:r>
+      <w:proofErr w:type="gramEnd"/>
+      <w:r>
+        <w:t>} {%</w:t>
+      </w:r>
+      <w:proofErr w:type="spellStart"/>
+      <w:r>
+        <w:t>if</w:t>
+      </w:r>
+      <w:proofErr w:type="spellEnd"/>
+      <w:r>
+        <w:t xml:space="preserve"> </w:t>
+      </w:r>
+      <w:proofErr w:type="spellStart"/>
+      <w:r>
+        <w:t>tuvo_pagos</w:t>
+      </w:r>
+      <w:proofErr w:type="spellEnd"/>
+      <w:r>
+        <w:t>%}</w:t>
       </w:r>
     </w:p>
     <w:p>
@@ -1424,14 +2247,43 @@
       <w:r>
         <w:t xml:space="preserve">: </w:t>
       </w:r>
-      <w:r>
-        <w:t>{{ parrafo_descuentos }}</w:t>
+      <w:proofErr w:type="gramStart"/>
+      <w:r>
+        <w:t xml:space="preserve">{{ </w:t>
+      </w:r>
+      <w:proofErr w:type="spellStart"/>
+      <w:r>
+        <w:t>parrafo</w:t>
+      </w:r>
+      <w:proofErr w:type="gramEnd"/>
+      <w:r>
+        <w:t>_</w:t>
+      </w:r>
+      <w:proofErr w:type="gramStart"/>
+      <w:r>
+        <w:t>descuentos</w:t>
+      </w:r>
+      <w:proofErr w:type="spellEnd"/>
+      <w:r>
+        <w:t xml:space="preserve"> }</w:t>
+      </w:r>
+      <w:proofErr w:type="gramEnd"/>
+      <w:r>
+        <w:t>}</w:t>
       </w:r>
       <w:r>
         <w:t xml:space="preserve"> </w:t>
       </w:r>
       <w:r>
-        <w:t>{% endif %}</w:t>
+        <w:t xml:space="preserve">{% </w:t>
+      </w:r>
+      <w:proofErr w:type="spellStart"/>
+      <w:r>
+        <w:t>endif</w:t>
+      </w:r>
+      <w:proofErr w:type="spellEnd"/>
+      <w:r>
+        <w:t xml:space="preserve"> %}</w:t>
       </w:r>
     </w:p>
     <w:p>
@@ -1456,8 +2308,29 @@
       <w:r>
         <w:t xml:space="preserve"> al </w:t>
       </w:r>
-      <w:r>
-        <w:t>{{ fecha_de_cierre }}</w:t>
+      <w:proofErr w:type="gramStart"/>
+      <w:r>
+        <w:t xml:space="preserve">{{ </w:t>
+      </w:r>
+      <w:proofErr w:type="spellStart"/>
+      <w:r>
+        <w:t>fecha</w:t>
+      </w:r>
+      <w:proofErr w:type="gramEnd"/>
+      <w:r>
+        <w:t>_de_</w:t>
+      </w:r>
+      <w:proofErr w:type="gramStart"/>
+      <w:r>
+        <w:t>cierre</w:t>
+      </w:r>
+      <w:proofErr w:type="spellEnd"/>
+      <w:r>
+        <w:t xml:space="preserve"> }</w:t>
+      </w:r>
+      <w:proofErr w:type="gramEnd"/>
+      <w:r>
+        <w:t>}</w:t>
       </w:r>
       <w:r>
         <w:rPr>
@@ -1470,7 +2343,15 @@
         <w:t>asciende a $</w:t>
       </w:r>
       <w:r>
-        <w:t>{{haber_de_alta}}</w:t>
+        <w:t>{{</w:t>
+      </w:r>
+      <w:proofErr w:type="spellStart"/>
+      <w:r>
+        <w:t>haber_de_alta</w:t>
+      </w:r>
+      <w:proofErr w:type="spellEnd"/>
+      <w:r>
+        <w:t>}}</w:t>
       </w:r>
       <w:r>
         <w:t>.</w:t>
@@ -1503,13 +2384,42 @@
         <w:t xml:space="preserve"> exigible al </w:t>
       </w:r>
       <w:r>
-        <w:t>{{fecha_intereses}}</w:t>
+        <w:t>{{</w:t>
+      </w:r>
+      <w:proofErr w:type="spellStart"/>
+      <w:r>
+        <w:t>fecha_intereses</w:t>
+      </w:r>
+      <w:proofErr w:type="spellEnd"/>
+      <w:r>
+        <w:t>}}</w:t>
       </w:r>
       <w:r>
         <w:t xml:space="preserve"> determinado por el periodo </w:t>
       </w:r>
-      <w:r>
-        <w:t>{{ fecha_inicial_de_pago }}</w:t>
+      <w:proofErr w:type="gramStart"/>
+      <w:r>
+        <w:t xml:space="preserve">{{ </w:t>
+      </w:r>
+      <w:proofErr w:type="spellStart"/>
+      <w:r>
+        <w:t>fecha</w:t>
+      </w:r>
+      <w:proofErr w:type="gramEnd"/>
+      <w:r>
+        <w:t>_inicial_de_</w:t>
+      </w:r>
+      <w:proofErr w:type="gramStart"/>
+      <w:r>
+        <w:t>pago</w:t>
+      </w:r>
+      <w:proofErr w:type="spellEnd"/>
+      <w:r>
+        <w:t xml:space="preserve"> }</w:t>
+      </w:r>
+      <w:proofErr w:type="gramEnd"/>
+      <w:r>
+        <w:t>}</w:t>
       </w:r>
       <w:r>
         <w:t xml:space="preserve"> </w:t>
@@ -1524,20 +2434,70 @@
       <w:r>
         <w:t xml:space="preserve">al </w:t>
       </w:r>
-      <w:r>
-        <w:t>{{ fecha_de_cierre }}</w:t>
+      <w:proofErr w:type="gramStart"/>
+      <w:r>
+        <w:t xml:space="preserve">{{ </w:t>
+      </w:r>
+      <w:proofErr w:type="spellStart"/>
+      <w:r>
+        <w:t>fecha</w:t>
+      </w:r>
+      <w:proofErr w:type="gramEnd"/>
+      <w:r>
+        <w:t>_de_</w:t>
+      </w:r>
+      <w:proofErr w:type="gramStart"/>
+      <w:r>
+        <w:t>cierre</w:t>
+      </w:r>
+      <w:proofErr w:type="spellEnd"/>
+      <w:r>
+        <w:t xml:space="preserve"> }</w:t>
+      </w:r>
+      <w:proofErr w:type="gramEnd"/>
+      <w:r>
+        <w:t>}</w:t>
       </w:r>
       <w:r>
         <w:t xml:space="preserve"> en concepto de Capital resulta en $</w:t>
       </w:r>
       <w:r>
-        <w:t xml:space="preserve"> {{ capital_opcion_1 }}</w:t>
+        <w:t xml:space="preserve"> </w:t>
+      </w:r>
+      <w:proofErr w:type="gramStart"/>
+      <w:r>
+        <w:t>{{ capital</w:t>
+      </w:r>
+      <w:proofErr w:type="gramEnd"/>
+      <w:r>
+        <w:t>_opcion_</w:t>
+      </w:r>
+      <w:proofErr w:type="gramStart"/>
+      <w:r>
+        <w:t>1 }</w:t>
+      </w:r>
+      <w:proofErr w:type="gramEnd"/>
+      <w:r>
+        <w:t>}</w:t>
       </w:r>
       <w:r>
         <w:t xml:space="preserve"> concepto de Intereses a $</w:t>
       </w:r>
-      <w:r>
-        <w:t xml:space="preserve">{{ intereses_opcion_1 }} </w:t>
+      <w:proofErr w:type="gramStart"/>
+      <w:r>
+        <w:t>{{ intereses</w:t>
+      </w:r>
+      <w:proofErr w:type="gramEnd"/>
+      <w:r>
+        <w:t>_opcion_</w:t>
+      </w:r>
+      <w:proofErr w:type="gramStart"/>
+      <w:r>
+        <w:t>1 }</w:t>
+      </w:r>
+      <w:proofErr w:type="gramEnd"/>
+      <w:r>
+        <w:t xml:space="preserve">} </w:t>
       </w:r>
       <w:r>
         <w:t>.</w:t>
@@ -1578,7 +2538,35 @@
         <w:rPr>
           <w:b/>
         </w:rPr>
-        <w:t>Monto adeudado por diferencias no abonadas de $ {{ total_opcion_1 }}</w:t>
+        <w:t xml:space="preserve">Monto adeudado por diferencias no abonadas de $ </w:t>
+      </w:r>
+      <w:proofErr w:type="gramStart"/>
+      <w:r>
+        <w:rPr>
+          <w:b/>
+        </w:rPr>
+        <w:t>{{ total</w:t>
+      </w:r>
+      <w:proofErr w:type="gramEnd"/>
+      <w:r>
+        <w:rPr>
+          <w:b/>
+        </w:rPr>
+        <w:t>_opcion_</w:t>
+      </w:r>
+      <w:proofErr w:type="gramStart"/>
+      <w:r>
+        <w:rPr>
+          <w:b/>
+        </w:rPr>
+        <w:t>1 }</w:t>
+      </w:r>
+      <w:proofErr w:type="gramEnd"/>
+      <w:r>
+        <w:rPr>
+          <w:b/>
+        </w:rPr>
+        <w:t>}</w:t>
       </w:r>
     </w:p>
     <w:p>
@@ -1599,7 +2587,25 @@
           <w:sz w:val="2"/>
           <w:szCs w:val="2"/>
         </w:rPr>
-        <w:t>{%p if opción_2 %}</w:t>
+        <w:t xml:space="preserve">{%p </w:t>
+      </w:r>
+      <w:proofErr w:type="spellStart"/>
+      <w:r>
+        <w:rPr>
+          <w:color w:val="FFFFFF"/>
+          <w:sz w:val="2"/>
+          <w:szCs w:val="2"/>
+        </w:rPr>
+        <w:t>if</w:t>
+      </w:r>
+      <w:proofErr w:type="spellEnd"/>
+      <w:r>
+        <w:rPr>
+          <w:color w:val="FFFFFF"/>
+          <w:sz w:val="2"/>
+          <w:szCs w:val="2"/>
+        </w:rPr>
+        <w:t xml:space="preserve"> opción_2 %}</w:t>
       </w:r>
     </w:p>
     <w:p>
@@ -1619,7 +2625,23 @@
           <w:b/>
           <w:bCs/>
         </w:rPr>
-        <w:t>Opción 2 {%if tope_9_opcion_2%}</w:t>
+        <w:t>Opción 2 {%</w:t>
+      </w:r>
+      <w:proofErr w:type="spellStart"/>
+      <w:r>
+        <w:rPr>
+          <w:b/>
+          <w:bCs/>
+        </w:rPr>
+        <w:t>if</w:t>
+      </w:r>
+      <w:proofErr w:type="spellEnd"/>
+      <w:r>
+        <w:rPr>
+          <w:b/>
+          <w:bCs/>
+        </w:rPr>
+        <w:t xml:space="preserve"> tope_9_opcion_2%}</w:t>
       </w:r>
     </w:p>
     <w:p>
@@ -1655,13 +2677,49 @@
         <w:rPr>
           <w:lang w:val="es-AR"/>
         </w:rPr>
-        <w:t>El tope del haber máximo Art.9 inc.3 Ley 24463 se actualizó desde Enero de 2002 según la movilidad del fallo Badaro</w:t>
-      </w:r>
-      <w:r>
-        <w:rPr>
-          <w:lang w:val="es-AR"/>
-        </w:rPr>
-        <w:t>. {% endif %}</w:t>
+        <w:t xml:space="preserve">El tope del haber máximo Art.9 inc.3 Ley 24463 se actualizó desde </w:t>
+      </w:r>
+      <w:proofErr w:type="gramStart"/>
+      <w:r>
+        <w:rPr>
+          <w:lang w:val="es-AR"/>
+        </w:rPr>
+        <w:t>Enero</w:t>
+      </w:r>
+      <w:proofErr w:type="gramEnd"/>
+      <w:r>
+        <w:rPr>
+          <w:lang w:val="es-AR"/>
+        </w:rPr>
+        <w:t xml:space="preserve"> de 2002 según la movilidad del fallo </w:t>
+      </w:r>
+      <w:proofErr w:type="spellStart"/>
+      <w:r>
+        <w:rPr>
+          <w:lang w:val="es-AR"/>
+        </w:rPr>
+        <w:t>Badaro</w:t>
+      </w:r>
+      <w:proofErr w:type="spellEnd"/>
+      <w:r>
+        <w:rPr>
+          <w:lang w:val="es-AR"/>
+        </w:rPr>
+        <w:t xml:space="preserve">. {% </w:t>
+      </w:r>
+      <w:proofErr w:type="spellStart"/>
+      <w:r>
+        <w:rPr>
+          <w:lang w:val="es-AR"/>
+        </w:rPr>
+        <w:t>endif</w:t>
+      </w:r>
+      <w:proofErr w:type="spellEnd"/>
+      <w:r>
+        <w:rPr>
+          <w:lang w:val="es-AR"/>
+        </w:rPr>
+        <w:t xml:space="preserve"> %}</w:t>
       </w:r>
     </w:p>
     <w:p>
@@ -1690,7 +2748,15 @@
         <w:t xml:space="preserve">se calcularon hasta el </w:t>
       </w:r>
       <w:r>
-        <w:t>{{fecha_intereses}} aplicando para ello la Tasa</w:t>
+        <w:t>{{</w:t>
+      </w:r>
+      <w:proofErr w:type="spellStart"/>
+      <w:r>
+        <w:t>fecha_intereses</w:t>
+      </w:r>
+      <w:proofErr w:type="spellEnd"/>
+      <w:r>
+        <w:t>}} aplicando para ello la Tasa</w:t>
       </w:r>
       <w:r>
         <w:t xml:space="preserve"> Pasiva para uso de la Justicia (Com. 14290 BCRA)</w:t>
@@ -1718,8 +2784,37 @@
         </w:rPr>
         <w:t xml:space="preserve">Movilidad: </w:t>
       </w:r>
-      <w:r>
-        <w:t>{{ movilidad_opcion_2 }} {%if tuvo_pagos%}</w:t>
+      <w:proofErr w:type="gramStart"/>
+      <w:r>
+        <w:t>{{ movilidad</w:t>
+      </w:r>
+      <w:proofErr w:type="gramEnd"/>
+      <w:r>
+        <w:t>_opcion_</w:t>
+      </w:r>
+      <w:proofErr w:type="gramStart"/>
+      <w:r>
+        <w:t>2 }</w:t>
+      </w:r>
+      <w:proofErr w:type="gramEnd"/>
+      <w:r>
+        <w:t>} {%</w:t>
+      </w:r>
+      <w:proofErr w:type="spellStart"/>
+      <w:r>
+        <w:t>if</w:t>
+      </w:r>
+      <w:proofErr w:type="spellEnd"/>
+      <w:r>
+        <w:t xml:space="preserve"> </w:t>
+      </w:r>
+      <w:proofErr w:type="spellStart"/>
+      <w:r>
+        <w:t>tuvo_pagos</w:t>
+      </w:r>
+      <w:proofErr w:type="spellEnd"/>
+      <w:r>
+        <w:t>%}</w:t>
       </w:r>
     </w:p>
     <w:p>
@@ -1744,11 +2839,40 @@
       <w:r>
         <w:t xml:space="preserve">: </w:t>
       </w:r>
-      <w:r>
-        <w:t>{{ parrafo_descuentos }}</w:t>
-      </w:r>
-      <w:r>
-        <w:t>{% endif %}</w:t>
+      <w:proofErr w:type="gramStart"/>
+      <w:r>
+        <w:t xml:space="preserve">{{ </w:t>
+      </w:r>
+      <w:proofErr w:type="spellStart"/>
+      <w:r>
+        <w:t>parrafo</w:t>
+      </w:r>
+      <w:proofErr w:type="gramEnd"/>
+      <w:r>
+        <w:t>_</w:t>
+      </w:r>
+      <w:proofErr w:type="gramStart"/>
+      <w:r>
+        <w:t>descuentos</w:t>
+      </w:r>
+      <w:proofErr w:type="spellEnd"/>
+      <w:r>
+        <w:t xml:space="preserve"> }}</w:t>
+      </w:r>
+      <w:r>
+        <w:t>{</w:t>
+      </w:r>
+      <w:proofErr w:type="gramEnd"/>
+      <w:r>
+        <w:t xml:space="preserve">% </w:t>
+      </w:r>
+      <w:proofErr w:type="spellStart"/>
+      <w:r>
+        <w:t>endif</w:t>
+      </w:r>
+      <w:proofErr w:type="spellEnd"/>
+      <w:r>
+        <w:t xml:space="preserve"> %}</w:t>
       </w:r>
     </w:p>
     <w:p>
@@ -1773,8 +2897,29 @@
       <w:r>
         <w:t xml:space="preserve"> al </w:t>
       </w:r>
-      <w:r>
-        <w:t>{{ fecha_de_cierre }}</w:t>
+      <w:proofErr w:type="gramStart"/>
+      <w:r>
+        <w:t xml:space="preserve">{{ </w:t>
+      </w:r>
+      <w:proofErr w:type="spellStart"/>
+      <w:r>
+        <w:t>fecha</w:t>
+      </w:r>
+      <w:proofErr w:type="gramEnd"/>
+      <w:r>
+        <w:t>_de_</w:t>
+      </w:r>
+      <w:proofErr w:type="gramStart"/>
+      <w:r>
+        <w:t>cierre</w:t>
+      </w:r>
+      <w:proofErr w:type="spellEnd"/>
+      <w:r>
+        <w:t xml:space="preserve"> }</w:t>
+      </w:r>
+      <w:proofErr w:type="gramEnd"/>
+      <w:r>
+        <w:t>}</w:t>
       </w:r>
       <w:r>
         <w:rPr>
@@ -1787,7 +2932,15 @@
         <w:t>asciende a $</w:t>
       </w:r>
       <w:r>
-        <w:t>{{haber_de_alta}}</w:t>
+        <w:t>{{</w:t>
+      </w:r>
+      <w:proofErr w:type="spellStart"/>
+      <w:r>
+        <w:t>haber_de_alta</w:t>
+      </w:r>
+      <w:proofErr w:type="spellEnd"/>
+      <w:r>
+        <w:t>}}</w:t>
       </w:r>
       <w:r>
         <w:t>.</w:t>
@@ -1819,13 +2972,42 @@
         <w:t xml:space="preserve"> exigible al </w:t>
       </w:r>
       <w:r>
-        <w:t>{{fecha_intereses}}</w:t>
+        <w:t>{{</w:t>
+      </w:r>
+      <w:proofErr w:type="spellStart"/>
+      <w:r>
+        <w:t>fecha_intereses</w:t>
+      </w:r>
+      <w:proofErr w:type="spellEnd"/>
+      <w:r>
+        <w:t>}}</w:t>
       </w:r>
       <w:r>
         <w:t xml:space="preserve"> determinado por el periodo </w:t>
       </w:r>
-      <w:r>
-        <w:t>{{ fecha_inicial_de_pago }}</w:t>
+      <w:proofErr w:type="gramStart"/>
+      <w:r>
+        <w:t xml:space="preserve">{{ </w:t>
+      </w:r>
+      <w:proofErr w:type="spellStart"/>
+      <w:r>
+        <w:t>fecha</w:t>
+      </w:r>
+      <w:proofErr w:type="gramEnd"/>
+      <w:r>
+        <w:t>_inicial_de_</w:t>
+      </w:r>
+      <w:proofErr w:type="gramStart"/>
+      <w:r>
+        <w:t>pago</w:t>
+      </w:r>
+      <w:proofErr w:type="spellEnd"/>
+      <w:r>
+        <w:t xml:space="preserve"> }</w:t>
+      </w:r>
+      <w:proofErr w:type="gramEnd"/>
+      <w:r>
+        <w:t>}</w:t>
       </w:r>
       <w:r>
         <w:t xml:space="preserve"> </w:t>
@@ -1840,20 +3022,70 @@
       <w:r>
         <w:t xml:space="preserve">al </w:t>
       </w:r>
-      <w:r>
-        <w:t>{{ fecha_de_cierre }}</w:t>
+      <w:proofErr w:type="gramStart"/>
+      <w:r>
+        <w:t xml:space="preserve">{{ </w:t>
+      </w:r>
+      <w:proofErr w:type="spellStart"/>
+      <w:r>
+        <w:t>fecha</w:t>
+      </w:r>
+      <w:proofErr w:type="gramEnd"/>
+      <w:r>
+        <w:t>_de_</w:t>
+      </w:r>
+      <w:proofErr w:type="gramStart"/>
+      <w:r>
+        <w:t>cierre</w:t>
+      </w:r>
+      <w:proofErr w:type="spellEnd"/>
+      <w:r>
+        <w:t xml:space="preserve"> }</w:t>
+      </w:r>
+      <w:proofErr w:type="gramEnd"/>
+      <w:r>
+        <w:t>}</w:t>
       </w:r>
       <w:r>
         <w:t xml:space="preserve"> en concepto de Capital resulta en $</w:t>
       </w:r>
       <w:r>
-        <w:t xml:space="preserve"> {{ capital_opcion_2 }}</w:t>
+        <w:t xml:space="preserve"> </w:t>
+      </w:r>
+      <w:proofErr w:type="gramStart"/>
+      <w:r>
+        <w:t>{{ capital</w:t>
+      </w:r>
+      <w:proofErr w:type="gramEnd"/>
+      <w:r>
+        <w:t>_opcion_</w:t>
+      </w:r>
+      <w:proofErr w:type="gramStart"/>
+      <w:r>
+        <w:t>2 }</w:t>
+      </w:r>
+      <w:proofErr w:type="gramEnd"/>
+      <w:r>
+        <w:t>}</w:t>
       </w:r>
       <w:r>
         <w:t xml:space="preserve"> concepto de Intereses a $</w:t>
       </w:r>
-      <w:r>
-        <w:t xml:space="preserve">{{ intereses_opcion_2 }} </w:t>
+      <w:proofErr w:type="gramStart"/>
+      <w:r>
+        <w:t>{{ intereses</w:t>
+      </w:r>
+      <w:proofErr w:type="gramEnd"/>
+      <w:r>
+        <w:t>_opcion_</w:t>
+      </w:r>
+      <w:proofErr w:type="gramStart"/>
+      <w:r>
+        <w:t>2 }</w:t>
+      </w:r>
+      <w:proofErr w:type="gramEnd"/>
+      <w:r>
+        <w:t xml:space="preserve">} </w:t>
       </w:r>
       <w:r>
         <w:t>.</w:t>
@@ -1921,7 +3153,39 @@
           <w:b/>
           <w:bCs/>
         </w:rPr>
-        <w:t xml:space="preserve"> {{ total_opcion_2 }}</w:t>
+        <w:t xml:space="preserve"> </w:t>
+      </w:r>
+      <w:proofErr w:type="gramStart"/>
+      <w:r>
+        <w:rPr>
+          <w:b/>
+          <w:bCs/>
+        </w:rPr>
+        <w:t>{{ total</w:t>
+      </w:r>
+      <w:proofErr w:type="gramEnd"/>
+      <w:r>
+        <w:rPr>
+          <w:b/>
+          <w:bCs/>
+        </w:rPr>
+        <w:t>_opcion_</w:t>
+      </w:r>
+      <w:proofErr w:type="gramStart"/>
+      <w:r>
+        <w:rPr>
+          <w:b/>
+          <w:bCs/>
+        </w:rPr>
+        <w:t>2 }</w:t>
+      </w:r>
+      <w:proofErr w:type="gramEnd"/>
+      <w:r>
+        <w:rPr>
+          <w:b/>
+          <w:bCs/>
+        </w:rPr>
+        <w:t>}</w:t>
       </w:r>
     </w:p>
     <w:p>
@@ -1945,7 +3209,25 @@
           <w:sz w:val="2"/>
           <w:szCs w:val="2"/>
         </w:rPr>
-        <w:t>{%p endif %}</w:t>
+        <w:t xml:space="preserve">{%p </w:t>
+      </w:r>
+      <w:proofErr w:type="spellStart"/>
+      <w:r>
+        <w:rPr>
+          <w:color w:val="FFFFFF"/>
+          <w:sz w:val="2"/>
+          <w:szCs w:val="2"/>
+        </w:rPr>
+        <w:t>endif</w:t>
+      </w:r>
+      <w:proofErr w:type="spellEnd"/>
+      <w:r>
+        <w:rPr>
+          <w:color w:val="FFFFFF"/>
+          <w:sz w:val="2"/>
+          <w:szCs w:val="2"/>
+        </w:rPr>
+        <w:t xml:space="preserve"> %}</w:t>
       </w:r>
     </w:p>
     <w:p>
@@ -1965,14 +3247,46 @@
           <w:b/>
           <w:bCs/>
         </w:rPr>
-        <w:t>{% endif %}</w:t>
-      </w:r>
-      <w:r>
-        <w:rPr>
-          <w:b/>
-          <w:bCs/>
-        </w:rPr>
-        <w:t xml:space="preserve"> {%if opción_3%}</w:t>
+        <w:t xml:space="preserve">{% </w:t>
+      </w:r>
+      <w:proofErr w:type="spellStart"/>
+      <w:r>
+        <w:rPr>
+          <w:b/>
+          <w:bCs/>
+        </w:rPr>
+        <w:t>endif</w:t>
+      </w:r>
+      <w:proofErr w:type="spellEnd"/>
+      <w:r>
+        <w:rPr>
+          <w:b/>
+          <w:bCs/>
+        </w:rPr>
+        <w:t xml:space="preserve"> %}</w:t>
+      </w:r>
+      <w:r>
+        <w:rPr>
+          <w:b/>
+          <w:bCs/>
+        </w:rPr>
+        <w:t xml:space="preserve"> {%</w:t>
+      </w:r>
+      <w:proofErr w:type="spellStart"/>
+      <w:r>
+        <w:rPr>
+          <w:b/>
+          <w:bCs/>
+        </w:rPr>
+        <w:t>if</w:t>
+      </w:r>
+      <w:proofErr w:type="spellEnd"/>
+      <w:r>
+        <w:rPr>
+          <w:b/>
+          <w:bCs/>
+        </w:rPr>
+        <w:t xml:space="preserve"> opción_3%}</w:t>
       </w:r>
     </w:p>
     <w:p>
@@ -2046,12 +3360,19 @@
         <w:rPr>
           <w:color w:val="000000"/>
         </w:rPr>
-        <w:t>s:</w:t>
-      </w:r>
+        <w:t>s</w:t>
+      </w:r>
+      <w:proofErr w:type="gramStart"/>
       <w:r>
         <w:rPr>
           <w:color w:val="000000"/>
         </w:rPr>
+        <w:t>:</w:t>
+      </w:r>
+      <w:r>
+        <w:rPr>
+          <w:color w:val="000000"/>
+        </w:rPr>
         <w:t xml:space="preserve"> </w:t>
       </w:r>
       <w:r>
@@ -2065,7 +3386,31 @@
           <w:b/>
           <w:bCs/>
         </w:rPr>
-        <w:t>{%if tope_9_opcion_3%}</w:t>
+        <w:t>{</w:t>
+      </w:r>
+      <w:proofErr w:type="gramEnd"/>
+      <w:r>
+        <w:rPr>
+          <w:b/>
+          <w:bCs/>
+        </w:rPr>
+        <w:t>%</w:t>
+      </w:r>
+      <w:proofErr w:type="spellStart"/>
+      <w:r>
+        <w:rPr>
+          <w:b/>
+          <w:bCs/>
+        </w:rPr>
+        <w:t>if</w:t>
+      </w:r>
+      <w:proofErr w:type="spellEnd"/>
+      <w:r>
+        <w:rPr>
+          <w:b/>
+          <w:bCs/>
+        </w:rPr>
+        <w:t xml:space="preserve"> tope_9_opcion_3%}</w:t>
       </w:r>
     </w:p>
     <w:p>
@@ -2101,13 +3446,49 @@
         <w:rPr>
           <w:lang w:val="es-AR"/>
         </w:rPr>
-        <w:t>El tope del haber máximo Art.9 inc.3 Ley 24463 se actualizó desde Enero de 2002 según la movilidad del fallo Badaro</w:t>
-      </w:r>
-      <w:r>
-        <w:rPr>
-          <w:lang w:val="es-AR"/>
-        </w:rPr>
-        <w:t>. {% endif %}</w:t>
+        <w:t xml:space="preserve">El tope del haber máximo Art.9 inc.3 Ley 24463 se actualizó desde </w:t>
+      </w:r>
+      <w:proofErr w:type="gramStart"/>
+      <w:r>
+        <w:rPr>
+          <w:lang w:val="es-AR"/>
+        </w:rPr>
+        <w:t>Enero</w:t>
+      </w:r>
+      <w:proofErr w:type="gramEnd"/>
+      <w:r>
+        <w:rPr>
+          <w:lang w:val="es-AR"/>
+        </w:rPr>
+        <w:t xml:space="preserve"> de 2002 según la movilidad del fallo </w:t>
+      </w:r>
+      <w:proofErr w:type="spellStart"/>
+      <w:r>
+        <w:rPr>
+          <w:lang w:val="es-AR"/>
+        </w:rPr>
+        <w:t>Badaro</w:t>
+      </w:r>
+      <w:proofErr w:type="spellEnd"/>
+      <w:r>
+        <w:rPr>
+          <w:lang w:val="es-AR"/>
+        </w:rPr>
+        <w:t xml:space="preserve">. {% </w:t>
+      </w:r>
+      <w:proofErr w:type="spellStart"/>
+      <w:r>
+        <w:rPr>
+          <w:lang w:val="es-AR"/>
+        </w:rPr>
+        <w:t>endif</w:t>
+      </w:r>
+      <w:proofErr w:type="spellEnd"/>
+      <w:r>
+        <w:rPr>
+          <w:lang w:val="es-AR"/>
+        </w:rPr>
+        <w:t xml:space="preserve"> %}</w:t>
       </w:r>
     </w:p>
     <w:p>
@@ -2136,7 +3517,23 @@
         <w:t>:</w:t>
       </w:r>
       <w:r>
-        <w:t xml:space="preserve"> {{ movilidad_opcion_3 }}</w:t>
+        <w:t xml:space="preserve"> </w:t>
+      </w:r>
+      <w:proofErr w:type="gramStart"/>
+      <w:r>
+        <w:t>{{ movilidad</w:t>
+      </w:r>
+      <w:proofErr w:type="gramEnd"/>
+      <w:r>
+        <w:t>_opcion_</w:t>
+      </w:r>
+      <w:proofErr w:type="gramStart"/>
+      <w:r>
+        <w:t>3 }</w:t>
+      </w:r>
+      <w:proofErr w:type="gramEnd"/>
+      <w:r>
+        <w:t>}</w:t>
       </w:r>
     </w:p>
     <w:p>
@@ -2165,7 +3562,15 @@
         <w:t xml:space="preserve"> exigible al </w:t>
       </w:r>
       <w:r>
-        <w:t>{{fecha_intereses}}</w:t>
+        <w:t>{{</w:t>
+      </w:r>
+      <w:proofErr w:type="spellStart"/>
+      <w:r>
+        <w:t>fecha_intereses</w:t>
+      </w:r>
+      <w:proofErr w:type="spellEnd"/>
+      <w:r>
+        <w:t>}}</w:t>
       </w:r>
       <w:r>
         <w:t xml:space="preserve"> </w:t>
@@ -2182,8 +3587,29 @@
       <w:r>
         <w:t xml:space="preserve"> </w:t>
       </w:r>
-      <w:r>
-        <w:t>{{ fecha_inicial_de_pago }}</w:t>
+      <w:proofErr w:type="gramStart"/>
+      <w:r>
+        <w:t xml:space="preserve">{{ </w:t>
+      </w:r>
+      <w:proofErr w:type="spellStart"/>
+      <w:r>
+        <w:t>fecha</w:t>
+      </w:r>
+      <w:proofErr w:type="gramEnd"/>
+      <w:r>
+        <w:t>_inicial_de_</w:t>
+      </w:r>
+      <w:proofErr w:type="gramStart"/>
+      <w:r>
+        <w:t>pago</w:t>
+      </w:r>
+      <w:proofErr w:type="spellEnd"/>
+      <w:r>
+        <w:t xml:space="preserve"> }</w:t>
+      </w:r>
+      <w:proofErr w:type="gramEnd"/>
+      <w:r>
+        <w:t>}</w:t>
       </w:r>
       <w:r>
         <w:t xml:space="preserve"> </w:t>
@@ -2191,8 +3617,29 @@
       <w:r>
         <w:t xml:space="preserve">al </w:t>
       </w:r>
-      <w:r>
-        <w:t>{{ fecha_de_cierre }}</w:t>
+      <w:proofErr w:type="gramStart"/>
+      <w:r>
+        <w:t xml:space="preserve">{{ </w:t>
+      </w:r>
+      <w:proofErr w:type="spellStart"/>
+      <w:r>
+        <w:t>fecha</w:t>
+      </w:r>
+      <w:proofErr w:type="gramEnd"/>
+      <w:r>
+        <w:t>_de_</w:t>
+      </w:r>
+      <w:proofErr w:type="gramStart"/>
+      <w:r>
+        <w:t>cierre</w:t>
+      </w:r>
+      <w:proofErr w:type="spellEnd"/>
+      <w:r>
+        <w:t xml:space="preserve"> }</w:t>
+      </w:r>
+      <w:proofErr w:type="gramEnd"/>
+      <w:r>
+        <w:t>}</w:t>
       </w:r>
       <w:r>
         <w:t xml:space="preserve"> en concepto de Capital resulta en $</w:t>
@@ -2200,8 +3647,21 @@
       <w:r>
         <w:t xml:space="preserve"> </w:t>
       </w:r>
-      <w:r>
-        <w:t>{{ capital_opcion_3 }}</w:t>
+      <w:proofErr w:type="gramStart"/>
+      <w:r>
+        <w:t>{{ capital</w:t>
+      </w:r>
+      <w:proofErr w:type="gramEnd"/>
+      <w:r>
+        <w:t>_opcion_</w:t>
+      </w:r>
+      <w:proofErr w:type="gramStart"/>
+      <w:r>
+        <w:t>3 }</w:t>
+      </w:r>
+      <w:proofErr w:type="gramEnd"/>
+      <w:r>
+        <w:t>}</w:t>
       </w:r>
       <w:r>
         <w:t xml:space="preserve"> </w:t>
@@ -2212,18 +3672,56 @@
       <w:r>
         <w:t>$</w:t>
       </w:r>
-      <w:r>
-        <w:t>{{ intereses_opcion_3 }}</w:t>
+      <w:proofErr w:type="gramStart"/>
+      <w:r>
+        <w:t>{{ intereses</w:t>
+      </w:r>
+      <w:proofErr w:type="gramEnd"/>
+      <w:r>
+        <w:t>_opcion_</w:t>
+      </w:r>
+      <w:proofErr w:type="gramStart"/>
+      <w:r>
+        <w:t>3 }</w:t>
+      </w:r>
+      <w:proofErr w:type="gramEnd"/>
+      <w:r>
+        <w:t>}</w:t>
       </w:r>
       <w:r>
         <w:t xml:space="preserve"> totalizando una deuda de $</w:t>
       </w:r>
-      <w:r>
-        <w:rPr>
-          <w:b/>
-          <w:bCs/>
-        </w:rPr>
-        <w:t>{{ total_opcion_3 }}</w:t>
+      <w:proofErr w:type="gramStart"/>
+      <w:r>
+        <w:rPr>
+          <w:b/>
+          <w:bCs/>
+        </w:rPr>
+        <w:t>{{ total</w:t>
+      </w:r>
+      <w:proofErr w:type="gramEnd"/>
+      <w:r>
+        <w:rPr>
+          <w:b/>
+          <w:bCs/>
+        </w:rPr>
+        <w:t>_opcion_</w:t>
+      </w:r>
+      <w:proofErr w:type="gramStart"/>
+      <w:r>
+        <w:rPr>
+          <w:b/>
+          <w:bCs/>
+        </w:rPr>
+        <w:t>3 }</w:t>
+      </w:r>
+      <w:proofErr w:type="gramEnd"/>
+      <w:r>
+        <w:rPr>
+          <w:b/>
+          <w:bCs/>
+        </w:rPr>
+        <w:t>}</w:t>
       </w:r>
       <w:r>
         <w:t>.</w:t>
@@ -2232,7 +3730,23 @@
         <w:t xml:space="preserve"> </w:t>
       </w:r>
       <w:r>
-        <w:t>{% endif %} {%if opción_4%}</w:t>
+        <w:t xml:space="preserve">{% </w:t>
+      </w:r>
+      <w:proofErr w:type="spellStart"/>
+      <w:r>
+        <w:t>endif</w:t>
+      </w:r>
+      <w:proofErr w:type="spellEnd"/>
+      <w:r>
+        <w:t xml:space="preserve"> %} {%</w:t>
+      </w:r>
+      <w:proofErr w:type="spellStart"/>
+      <w:r>
+        <w:t>if</w:t>
+      </w:r>
+      <w:proofErr w:type="spellEnd"/>
+      <w:r>
+        <w:t xml:space="preserve"> opción_4%}</w:t>
       </w:r>
     </w:p>
     <w:p>
@@ -2331,7 +3845,23 @@
           <w:b/>
           <w:bCs/>
         </w:rPr>
-        <w:t>{%if tope_9_opcion_4%}</w:t>
+        <w:t>{%</w:t>
+      </w:r>
+      <w:proofErr w:type="spellStart"/>
+      <w:r>
+        <w:rPr>
+          <w:b/>
+          <w:bCs/>
+        </w:rPr>
+        <w:t>if</w:t>
+      </w:r>
+      <w:proofErr w:type="spellEnd"/>
+      <w:r>
+        <w:rPr>
+          <w:b/>
+          <w:bCs/>
+        </w:rPr>
+        <w:t xml:space="preserve"> tope_9_opcion_4%}</w:t>
       </w:r>
     </w:p>
     <w:p>
@@ -2367,13 +3897,49 @@
         <w:rPr>
           <w:lang w:val="es-AR"/>
         </w:rPr>
-        <w:t>El tope del haber máximo Art.9 inc.3 Ley 24463 se actualizó desde Enero de 2002 según la movilidad del fallo Badaro</w:t>
-      </w:r>
-      <w:r>
-        <w:rPr>
-          <w:lang w:val="es-AR"/>
-        </w:rPr>
-        <w:t>. {% endif %}</w:t>
+        <w:t xml:space="preserve">El tope del haber máximo Art.9 inc.3 Ley 24463 se actualizó desde </w:t>
+      </w:r>
+      <w:proofErr w:type="gramStart"/>
+      <w:r>
+        <w:rPr>
+          <w:lang w:val="es-AR"/>
+        </w:rPr>
+        <w:t>Enero</w:t>
+      </w:r>
+      <w:proofErr w:type="gramEnd"/>
+      <w:r>
+        <w:rPr>
+          <w:lang w:val="es-AR"/>
+        </w:rPr>
+        <w:t xml:space="preserve"> de 2002 según la movilidad del fallo </w:t>
+      </w:r>
+      <w:proofErr w:type="spellStart"/>
+      <w:r>
+        <w:rPr>
+          <w:lang w:val="es-AR"/>
+        </w:rPr>
+        <w:t>Badaro</w:t>
+      </w:r>
+      <w:proofErr w:type="spellEnd"/>
+      <w:r>
+        <w:rPr>
+          <w:lang w:val="es-AR"/>
+        </w:rPr>
+        <w:t xml:space="preserve">. {% </w:t>
+      </w:r>
+      <w:proofErr w:type="spellStart"/>
+      <w:r>
+        <w:rPr>
+          <w:lang w:val="es-AR"/>
+        </w:rPr>
+        <w:t>endif</w:t>
+      </w:r>
+      <w:proofErr w:type="spellEnd"/>
+      <w:r>
+        <w:rPr>
+          <w:lang w:val="es-AR"/>
+        </w:rPr>
+        <w:t xml:space="preserve"> %}</w:t>
       </w:r>
     </w:p>
     <w:p>
@@ -2399,30 +3965,262 @@
         <w:t>Movilidad</w:t>
       </w:r>
       <w:r>
-        <w:t>: {{ movilidad_opcion_4 }}</w:t>
-      </w:r>
-    </w:p>
-    <w:p>
-      <w:pPr>
-        <w:autoSpaceDE w:val="0"/>
-        <w:autoSpaceDN w:val="0"/>
-        <w:adjustRightInd w:val="0"/>
-        <w:jc w:val="both"/>
-      </w:pPr>
-      <w:r>
-        <w:rPr>
-          <w:b/>
-          <w:bCs/>
-        </w:rPr>
-        <w:t xml:space="preserve">Retroactivo exigible al {{fecha_intereses}} determinado con estos índices de movilidad por el periodo {{ fecha_inicial_de_pago }} al {{ fecha_de_cierre }} en concepto de Capital resulta en $ {{ capital_opcion_4 }} concepto de </w:t>
-      </w:r>
-      <w:r>
-        <w:rPr>
-          <w:b/>
-          <w:bCs/>
-        </w:rPr>
-        <w:lastRenderedPageBreak/>
-        <w:t>Intereses a ${{ intereses_opcion_4}} totalizando una deuda de ${{ total_opcion_4 }}. {% endif %} {%if inconstitucionalidad_27426_si%}</w:t>
+        <w:t xml:space="preserve">: </w:t>
+      </w:r>
+      <w:proofErr w:type="gramStart"/>
+      <w:r>
+        <w:t>{{ movilidad</w:t>
+      </w:r>
+      <w:proofErr w:type="gramEnd"/>
+      <w:r>
+        <w:t>_opcion_</w:t>
+      </w:r>
+      <w:proofErr w:type="gramStart"/>
+      <w:r>
+        <w:t>4 }</w:t>
+      </w:r>
+      <w:proofErr w:type="gramEnd"/>
+      <w:r>
+        <w:t>}</w:t>
+      </w:r>
+    </w:p>
+    <w:p>
+      <w:pPr>
+        <w:autoSpaceDE w:val="0"/>
+        <w:autoSpaceDN w:val="0"/>
+        <w:adjustRightInd w:val="0"/>
+        <w:jc w:val="both"/>
+      </w:pPr>
+      <w:r>
+        <w:rPr>
+          <w:b/>
+          <w:bCs/>
+        </w:rPr>
+        <w:t>Retroactivo exigible al {{</w:t>
+      </w:r>
+      <w:proofErr w:type="spellStart"/>
+      <w:r>
+        <w:rPr>
+          <w:b/>
+          <w:bCs/>
+        </w:rPr>
+        <w:t>fecha_intereses</w:t>
+      </w:r>
+      <w:proofErr w:type="spellEnd"/>
+      <w:r>
+        <w:rPr>
+          <w:b/>
+          <w:bCs/>
+        </w:rPr>
+        <w:t xml:space="preserve">}} determinado con estos índices de movilidad por el periodo </w:t>
+      </w:r>
+      <w:proofErr w:type="gramStart"/>
+      <w:r>
+        <w:rPr>
+          <w:b/>
+          <w:bCs/>
+        </w:rPr>
+        <w:t xml:space="preserve">{{ </w:t>
+      </w:r>
+      <w:proofErr w:type="spellStart"/>
+      <w:r>
+        <w:rPr>
+          <w:b/>
+          <w:bCs/>
+        </w:rPr>
+        <w:t>fecha</w:t>
+      </w:r>
+      <w:proofErr w:type="gramEnd"/>
+      <w:r>
+        <w:rPr>
+          <w:b/>
+          <w:bCs/>
+        </w:rPr>
+        <w:t>_inicial_de_</w:t>
+      </w:r>
+      <w:proofErr w:type="gramStart"/>
+      <w:r>
+        <w:rPr>
+          <w:b/>
+          <w:bCs/>
+        </w:rPr>
+        <w:t>pago</w:t>
+      </w:r>
+      <w:proofErr w:type="spellEnd"/>
+      <w:r>
+        <w:rPr>
+          <w:b/>
+          <w:bCs/>
+        </w:rPr>
+        <w:t xml:space="preserve"> }</w:t>
+      </w:r>
+      <w:proofErr w:type="gramEnd"/>
+      <w:r>
+        <w:rPr>
+          <w:b/>
+          <w:bCs/>
+        </w:rPr>
+        <w:t xml:space="preserve">} al </w:t>
+      </w:r>
+      <w:proofErr w:type="gramStart"/>
+      <w:r>
+        <w:rPr>
+          <w:b/>
+          <w:bCs/>
+        </w:rPr>
+        <w:t xml:space="preserve">{{ </w:t>
+      </w:r>
+      <w:proofErr w:type="spellStart"/>
+      <w:r>
+        <w:rPr>
+          <w:b/>
+          <w:bCs/>
+        </w:rPr>
+        <w:t>fecha</w:t>
+      </w:r>
+      <w:proofErr w:type="gramEnd"/>
+      <w:r>
+        <w:rPr>
+          <w:b/>
+          <w:bCs/>
+        </w:rPr>
+        <w:t>_de_</w:t>
+      </w:r>
+      <w:proofErr w:type="gramStart"/>
+      <w:r>
+        <w:rPr>
+          <w:b/>
+          <w:bCs/>
+        </w:rPr>
+        <w:t>cierre</w:t>
+      </w:r>
+      <w:proofErr w:type="spellEnd"/>
+      <w:r>
+        <w:rPr>
+          <w:b/>
+          <w:bCs/>
+        </w:rPr>
+        <w:t xml:space="preserve"> }</w:t>
+      </w:r>
+      <w:proofErr w:type="gramEnd"/>
+      <w:r>
+        <w:rPr>
+          <w:b/>
+          <w:bCs/>
+        </w:rPr>
+        <w:t xml:space="preserve">} en concepto de Capital resulta en $ </w:t>
+      </w:r>
+      <w:proofErr w:type="gramStart"/>
+      <w:r>
+        <w:rPr>
+          <w:b/>
+          <w:bCs/>
+        </w:rPr>
+        <w:t>{{ capital</w:t>
+      </w:r>
+      <w:proofErr w:type="gramEnd"/>
+      <w:r>
+        <w:rPr>
+          <w:b/>
+          <w:bCs/>
+        </w:rPr>
+        <w:t>_opcion_</w:t>
+      </w:r>
+      <w:proofErr w:type="gramStart"/>
+      <w:r>
+        <w:rPr>
+          <w:b/>
+          <w:bCs/>
+        </w:rPr>
+        <w:t>4 }</w:t>
+      </w:r>
+      <w:proofErr w:type="gramEnd"/>
+      <w:r>
+        <w:rPr>
+          <w:b/>
+          <w:bCs/>
+        </w:rPr>
+        <w:t>} concepto de Intereses a $</w:t>
+      </w:r>
+      <w:proofErr w:type="gramStart"/>
+      <w:r>
+        <w:rPr>
+          <w:b/>
+          <w:bCs/>
+        </w:rPr>
+        <w:t>{{ intereses</w:t>
+      </w:r>
+      <w:proofErr w:type="gramEnd"/>
+      <w:r>
+        <w:rPr>
+          <w:b/>
+          <w:bCs/>
+        </w:rPr>
+        <w:t>_opcion_4}} totalizando una deuda de $</w:t>
+      </w:r>
+      <w:proofErr w:type="gramStart"/>
+      <w:r>
+        <w:rPr>
+          <w:b/>
+          <w:bCs/>
+        </w:rPr>
+        <w:t>{{ total</w:t>
+      </w:r>
+      <w:proofErr w:type="gramEnd"/>
+      <w:r>
+        <w:rPr>
+          <w:b/>
+          <w:bCs/>
+        </w:rPr>
+        <w:t>_opcion_</w:t>
+      </w:r>
+      <w:proofErr w:type="gramStart"/>
+      <w:r>
+        <w:rPr>
+          <w:b/>
+          <w:bCs/>
+        </w:rPr>
+        <w:t>4 }</w:t>
+      </w:r>
+      <w:proofErr w:type="gramEnd"/>
+      <w:r>
+        <w:rPr>
+          <w:b/>
+          <w:bCs/>
+        </w:rPr>
+        <w:t xml:space="preserve">}. {% </w:t>
+      </w:r>
+      <w:proofErr w:type="spellStart"/>
+      <w:r>
+        <w:rPr>
+          <w:b/>
+          <w:bCs/>
+        </w:rPr>
+        <w:t>endif</w:t>
+      </w:r>
+      <w:proofErr w:type="spellEnd"/>
+      <w:r>
+        <w:rPr>
+          <w:b/>
+          <w:bCs/>
+        </w:rPr>
+        <w:t xml:space="preserve"> %} {%</w:t>
+      </w:r>
+      <w:proofErr w:type="spellStart"/>
+      <w:r>
+        <w:rPr>
+          <w:b/>
+          <w:bCs/>
+        </w:rPr>
+        <w:t>if</w:t>
+      </w:r>
+      <w:proofErr w:type="spellEnd"/>
+      <w:r>
+        <w:rPr>
+          <w:b/>
+          <w:bCs/>
+        </w:rPr>
+        <w:t xml:space="preserve"> inconstitucionalidad_27426_si%}</w:t>
       </w:r>
       <w:bookmarkEnd w:id="1"/>
     </w:p>
@@ -2523,7 +4321,21 @@
         <w:rPr>
           <w:bCs/>
         </w:rPr>
-        <w:t>La constitucionalidad de una norma que fije nuevas pautas de movilidad reconoce un límite temporal que no puede ser infringido sin lesionar derechos constitucionales de los beneficiarios y afectando los s derechos de los jubilados por cuanto la norma pretende tener vigencia desde antes de su sanción, alterando la situación jurídica consolidada al amparo de una norma anterior. La incidencia del mismo en el haber de mi mandante afecta derechos constitucionales lo cual torna inconstitucional al art 2 de la ley 27.426.</w:t>
+        <w:t xml:space="preserve">La constitucionalidad de una norma que fije nuevas pautas de movilidad reconoce un límite temporal que no puede ser infringido sin lesionar derechos constitucionales de los beneficiarios y afectando los s derechos de los jubilados por cuanto la norma pretende tener vigencia desde antes de su sanción, alterando la situación jurídica consolidada al amparo de una norma anterior. La incidencia </w:t>
+      </w:r>
+      <w:proofErr w:type="gramStart"/>
+      <w:r>
+        <w:rPr>
+          <w:bCs/>
+        </w:rPr>
+        <w:t>del mismo</w:t>
+      </w:r>
+      <w:proofErr w:type="gramEnd"/>
+      <w:r>
+        <w:rPr>
+          <w:bCs/>
+        </w:rPr>
+        <w:t xml:space="preserve"> en el haber de mi mandante afecta derechos constitucionales lo cual torna inconstitucional al art 2 de la ley 27.426.</w:t>
       </w:r>
     </w:p>
     <w:p>
@@ -2567,7 +4379,25 @@
           <w:i/>
           <w:iCs/>
         </w:rPr>
-        <w:t>“a partir de su entrada en vigencia, las leyes se aplican a las consecuencias de las relaciones y situaciones jurídicas existentes. Las leyes no tienen efecto retroactivo, sean o no de orden público, excepto disposición en contrario. La retroactividad establecida por la ley no puede afectar derechos amparados por garantías constitucionales”.</w:t>
+        <w:t xml:space="preserve">“a partir de su </w:t>
+      </w:r>
+      <w:proofErr w:type="gramStart"/>
+      <w:r>
+        <w:rPr>
+          <w:bCs/>
+          <w:i/>
+          <w:iCs/>
+        </w:rPr>
+        <w:t>entrada en vigencia</w:t>
+      </w:r>
+      <w:proofErr w:type="gramEnd"/>
+      <w:r>
+        <w:rPr>
+          <w:bCs/>
+          <w:i/>
+          <w:iCs/>
+        </w:rPr>
+        <w:t>, las leyes se aplican a las consecuencias de las relaciones y situaciones jurídicas existentes. Las leyes no tienen efecto retroactivo, sean o no de orden público, excepto disposición en contrario. La retroactividad establecida por la ley no puede afectar derechos amparados por garantías constitucionales”.</w:t>
       </w:r>
     </w:p>
     <w:p>
@@ -2639,14 +4469,28 @@
         <w:rPr>
           <w:bCs/>
         </w:rPr>
-        <w:t xml:space="preserve">Por Resolución E 2/2018 de la S.S.S., el valor de la movilidad correspondiente al mes de marzo de 2018, fue establecido en un 5,71%, conforme </w:t>
+        <w:t xml:space="preserve">Por Resolución E 2/2018 de la S.S.S., el valor de la movilidad correspondiente al mes de marzo de </w:t>
+      </w:r>
+      <w:proofErr w:type="gramStart"/>
+      <w:r>
+        <w:rPr>
+          <w:bCs/>
+        </w:rPr>
+        <w:t>2018,</w:t>
+      </w:r>
+      <w:proofErr w:type="gramEnd"/>
+      <w:r>
+        <w:rPr>
+          <w:bCs/>
+        </w:rPr>
+        <w:t xml:space="preserve"> fue establecido en un 5,71%, conforme lo previsto en la Ley 27.426 cuando el porcentaje previsto conforme la fórmula de </w:t>
       </w:r>
       <w:r>
         <w:rPr>
           <w:bCs/>
         </w:rPr>
         <w:lastRenderedPageBreak/>
-        <w:t>lo previsto en la Ley 27.426 cuando el porcentaje previsto conforme la fórmula de la Ley 26.417, estaba estimado entre un 12% y 14% arrojando finalmente un aumento en marzo de 2018 de 14.06%.</w:t>
+        <w:t>la Ley 26.417, estaba estimado entre un 12% y 14% arrojando finalmente un aumento en marzo de 2018 de 14.06%.</w:t>
       </w:r>
     </w:p>
     <w:p>
@@ -2732,7 +4576,49 @@
         <w:rPr>
           <w:bCs/>
         </w:rPr>
-        <w:t xml:space="preserve">Solicito expresamente se declare la inconstitucionalidad del art 2 de la ley 27.426, y se ordene que la movilidad correspondiente al mes de marzo de 2018 sea determinada de conformidad con las pautas fijadas en la Ley 26.417, debiendo empezar a aplicarse la nueva movilidad establecida por Ley 27.426 a partir del incremento correspondiente al mensual septiembre 2018.{% endif %} {%if inconstitucionalidad_27541_si%} </w:t>
+        <w:t xml:space="preserve">Solicito expresamente se declare la inconstitucionalidad del art 2 de la ley 27.426, y se ordene que la movilidad correspondiente al mes de marzo de 2018 sea determinada de conformidad con las pautas fijadas en la Ley 26.417, debiendo empezar a aplicarse la nueva movilidad establecida por Ley 27.426 a partir del incremento correspondiente al mensual septiembre </w:t>
+      </w:r>
+      <w:proofErr w:type="gramStart"/>
+      <w:r>
+        <w:rPr>
+          <w:bCs/>
+        </w:rPr>
+        <w:t>2018.{</w:t>
+      </w:r>
+      <w:proofErr w:type="gramEnd"/>
+      <w:r>
+        <w:rPr>
+          <w:bCs/>
+        </w:rPr>
+        <w:t xml:space="preserve">% </w:t>
+      </w:r>
+      <w:proofErr w:type="spellStart"/>
+      <w:r>
+        <w:rPr>
+          <w:bCs/>
+        </w:rPr>
+        <w:t>endif</w:t>
+      </w:r>
+      <w:proofErr w:type="spellEnd"/>
+      <w:r>
+        <w:rPr>
+          <w:bCs/>
+        </w:rPr>
+        <w:t xml:space="preserve"> %} {%</w:t>
+      </w:r>
+      <w:proofErr w:type="spellStart"/>
+      <w:r>
+        <w:rPr>
+          <w:bCs/>
+        </w:rPr>
+        <w:t>if</w:t>
+      </w:r>
+      <w:proofErr w:type="spellEnd"/>
+      <w:r>
+        <w:rPr>
+          <w:bCs/>
+        </w:rPr>
+        <w:t xml:space="preserve"> inconstitucionalidad_27541_si%} </w:t>
       </w:r>
     </w:p>
     <w:p>
@@ -2800,14 +4686,28 @@
         <w:rPr>
           <w:bCs/>
         </w:rPr>
-        <w:t xml:space="preserve">Al haber visto que los aumentos de 2020 dados por decreto fueron muy inferiores a los que hubiera correspondido conforme ley 27.426, solicito se expida y declare la inconstitucionalidad de la ley 27.541, del art 1 en cuanto declara la emergencia previsional , del  art 2 inc. e, del art 55 y 56, como así también de los </w:t>
+        <w:t xml:space="preserve">Al haber visto que los aumentos de 2020 dados por decreto fueron muy inferiores a los que hubiera correspondido conforme ley 27.426, solicito se expida y declare la inconstitucionalidad de la ley 27.541, del art 1 en cuanto declara la emergencia previsional , del  art 2 inc. </w:t>
+      </w:r>
+      <w:proofErr w:type="spellStart"/>
+      <w:r>
+        <w:rPr>
+          <w:bCs/>
+        </w:rPr>
+        <w:t>e</w:t>
+      </w:r>
+      <w:proofErr w:type="spellEnd"/>
+      <w:r>
+        <w:rPr>
+          <w:bCs/>
+        </w:rPr>
+        <w:t xml:space="preserve">, del art 55 y 56, como así también de los decretos 163/2020, 495/2020 , el 542/2020, 692/2020, y 899/2020 , en cuanto </w:t>
       </w:r>
       <w:r>
         <w:rPr>
           <w:bCs/>
         </w:rPr>
         <w:lastRenderedPageBreak/>
-        <w:t xml:space="preserve">decretos 163/2020, 495/2020 , el 542/2020, 692/2020, y 899/2020 , en cuanto otorga aumentos insuficientes, extiende por 6 meses más la suspensión establecida por el art. 55 de la ley 27.541 respecto de la aplicación de la movilidad dispuesta por el art. 32 de la ley previsional 24.241 por ser confiscatoria, por violar el principio de igualdad y de razonabilidad de las leyes previsto en los art 16 y 28 de la CN y el principio de progresividad garantizado por la ley 27.360 que ratifica la convención interamericana de adultos mayores. </w:t>
+        <w:t xml:space="preserve">otorga aumentos insuficientes, extiende por 6 meses más la suspensión establecida por el art. 55 de la ley 27.541 respecto de la aplicación de la movilidad dispuesta por el art. 32 de la ley previsional 24.241 por ser confiscatoria, por violar el principio de igualdad y de razonabilidad de las leyes previsto en los art 16 y 28 de la CN y el principio de progresividad garantizado por la ley 27.360 que ratifica la convención interamericana de adultos mayores. </w:t>
       </w:r>
     </w:p>
     <w:p>
@@ -2924,7 +4824,21 @@
         <w:rPr>
           <w:bCs/>
         </w:rPr>
-        <w:t xml:space="preserve">No respeta las bases de la delegación del art 2 inc e. </w:t>
+        <w:t xml:space="preserve">No respeta las bases de la delegación del art 2 </w:t>
+      </w:r>
+      <w:proofErr w:type="spellStart"/>
+      <w:r>
+        <w:rPr>
+          <w:bCs/>
+        </w:rPr>
+        <w:t>inc</w:t>
+      </w:r>
+      <w:proofErr w:type="spellEnd"/>
+      <w:r>
+        <w:rPr>
+          <w:bCs/>
+        </w:rPr>
+        <w:t xml:space="preserve"> e. </w:t>
       </w:r>
     </w:p>
     <w:p>
@@ -3138,7 +5052,35 @@
         <w:rPr>
           <w:lang w:val="es-AR"/>
         </w:rPr>
-        <w:t xml:space="preserve">{% endif %} {%if inconstitucionalidad_27609_si%} </w:t>
+        <w:t xml:space="preserve">{% </w:t>
+      </w:r>
+      <w:proofErr w:type="spellStart"/>
+      <w:r>
+        <w:rPr>
+          <w:lang w:val="es-AR"/>
+        </w:rPr>
+        <w:t>endif</w:t>
+      </w:r>
+      <w:proofErr w:type="spellEnd"/>
+      <w:r>
+        <w:rPr>
+          <w:lang w:val="es-AR"/>
+        </w:rPr>
+        <w:t xml:space="preserve"> %} {%</w:t>
+      </w:r>
+      <w:proofErr w:type="spellStart"/>
+      <w:r>
+        <w:rPr>
+          <w:lang w:val="es-AR"/>
+        </w:rPr>
+        <w:t>if</w:t>
+      </w:r>
+      <w:proofErr w:type="spellEnd"/>
+      <w:r>
+        <w:rPr>
+          <w:lang w:val="es-AR"/>
+        </w:rPr>
+        <w:t xml:space="preserve"> inconstitucionalidad_27609_si%} </w:t>
       </w:r>
     </w:p>
     <w:p>
@@ -3188,8 +5130,28 @@
         <w:rPr>
           <w:lang w:eastAsia="en-US"/>
         </w:rPr>
+        <w:t xml:space="preserve">La Ley 27.609 ha demostrado ser manifiestamente insuficiente para preservar el poder adquisitivo del haber previsional de mi mandante, afectando de </w:t>
+      </w:r>
+      <w:r>
+        <w:rPr>
+          <w:lang w:eastAsia="en-US"/>
+        </w:rPr>
         <w:lastRenderedPageBreak/>
-        <w:t>La Ley 27.609 ha demostrado ser manifiestamente insuficiente para preservar el poder adquisitivo del haber previsional de mi mandante, afectando de manera directa derechos y garantías de jerarquía constitucional. En particular, vulnera la garantía de movilidad e integralidad del haber consagrada en el art. 14 bis de la Constitución Nacional, el derecho de propiedad (art. 17), el principio de razonabilidad (art. 28), el derecho al desarrollo humano y la protección especial de los adultos mayores reconocida en los arts. 75 incs. 22 y 23, y en definitiva el derecho a una vejez digna.</w:t>
+        <w:t xml:space="preserve">manera directa derechos y garantías de jerarquía constitucional. En particular, vulnera la garantía de movilidad e integralidad del haber consagrada en el art. 14 bis de la Constitución Nacional, el derecho de propiedad (art. 17), el principio de razonabilidad (art. 28), el derecho al desarrollo humano y la protección especial de los adultos mayores reconocida en los arts. 75 </w:t>
+      </w:r>
+      <w:proofErr w:type="spellStart"/>
+      <w:r>
+        <w:rPr>
+          <w:lang w:eastAsia="en-US"/>
+        </w:rPr>
+        <w:t>incs</w:t>
+      </w:r>
+      <w:proofErr w:type="spellEnd"/>
+      <w:r>
+        <w:rPr>
+          <w:lang w:eastAsia="en-US"/>
+        </w:rPr>
+        <w:t>. 22 y 23, y en definitiva el derecho a una vejez digna.</w:t>
       </w:r>
     </w:p>
     <w:p>
@@ -3291,14 +5253,28 @@
         <w:rPr>
           <w:lang w:eastAsia="en-US"/>
         </w:rPr>
-        <w:t xml:space="preserve">El propio Estado Nacional reconoció las falencias estructurales de la fórmula establecida por la Ley 27.609 al dictar el Decreto 274/24, admitiendo la pérdida de poder adquisitivo sufrida por los jubilados. Sin embargo, las soluciones adoptadas sólo proyectan efectos hacia el futuro, sin reparar el deterioro producido en el período anterior. La movilidad otorgada durante la vigencia de la Ley 27.609 quedó por debajo de la inflación, circunstancia que se acredita en autos y que </w:t>
+        <w:t xml:space="preserve">El propio Estado Nacional reconoció las falencias estructurales de la fórmula establecida por la Ley 27.609 al dictar el Decreto 274/24, admitiendo la pérdida de poder adquisitivo sufrida por los jubilados. Sin embargo, las soluciones adoptadas sólo proyectan efectos hacia el futuro, sin reparar el deterioro producido en el período anterior. La movilidad otorgada durante la vigencia de la Ley 27.609 quedó por debajo de la inflación, circunstancia que se acredita en autos y que resulta pública y notoria. Los bonos otorgados a jubilados que perciben la mínima, que llegaron a representar hasta un 55% del haber mensual, evidencian el fracaso </w:t>
       </w:r>
       <w:r>
         <w:rPr>
           <w:lang w:eastAsia="en-US"/>
         </w:rPr>
         <w:lastRenderedPageBreak/>
-        <w:t xml:space="preserve">resulta pública y notoria. Los bonos otorgados a jubilados que perciben la mínima, que llegaron a representar hasta un 55% del haber mensual, evidencian el fracaso del mecanismo de movilidad y colocan la situación en un plano comparable al que motivó el dictado del precedente “Badaro” (Fallos </w:t>
+        <w:t>del mecanismo de movilidad y colocan la situación en un plano comparable al que motivó el dictado del precedente “</w:t>
+      </w:r>
+      <w:proofErr w:type="spellStart"/>
+      <w:r>
+        <w:rPr>
+          <w:lang w:eastAsia="en-US"/>
+        </w:rPr>
+        <w:t>Badaro</w:t>
+      </w:r>
+      <w:proofErr w:type="spellEnd"/>
+      <w:r>
+        <w:rPr>
+          <w:lang w:eastAsia="en-US"/>
+        </w:rPr>
+        <w:t xml:space="preserve">” (Fallos </w:t>
       </w:r>
       <w:hyperlink r:id="rId9" w:history="1">
         <w:r>
@@ -3462,7 +5438,35 @@
         <w:rPr>
           <w:lang w:eastAsia="en-US"/>
         </w:rPr>
-        <w:t>Los adultos mayores constituyen un grupo especialmente vulnerable que merece tutela reforzada, tal como lo ha reconocido reiteradamente la Corte Suprema en precedentes como “Itzcovich”, “Sánchez”, “Badaro”, “Blanco”, “Giménez” y “Garay Corina”. En tiempos de crisis económica —ha dicho el Alto Tribunal— deben profundizarse las respuestas institucionales en favor de los grupos más débiles y postergados (</w:t>
+        <w:t>Los adultos mayores constituyen un grupo especialmente vulnerable que merece tutela reforzada, tal como lo ha reconocido reiteradamente la Corte Suprema en precedentes como “</w:t>
+      </w:r>
+      <w:proofErr w:type="spellStart"/>
+      <w:r>
+        <w:rPr>
+          <w:lang w:eastAsia="en-US"/>
+        </w:rPr>
+        <w:t>Itzcovich</w:t>
+      </w:r>
+      <w:proofErr w:type="spellEnd"/>
+      <w:r>
+        <w:rPr>
+          <w:lang w:eastAsia="en-US"/>
+        </w:rPr>
+        <w:t>”, “Sánchez”, “</w:t>
+      </w:r>
+      <w:proofErr w:type="spellStart"/>
+      <w:r>
+        <w:rPr>
+          <w:lang w:eastAsia="en-US"/>
+        </w:rPr>
+        <w:t>Badaro</w:t>
+      </w:r>
+      <w:proofErr w:type="spellEnd"/>
+      <w:r>
+        <w:rPr>
+          <w:lang w:eastAsia="en-US"/>
+        </w:rPr>
+        <w:t>”, “Blanco”, “Giménez” y “Garay Corina”. En tiempos de crisis económica —ha dicho el Alto Tribunal— deben profundizarse las respuestas institucionales en favor de los grupos más débiles y postergados (</w:t>
       </w:r>
       <w:hyperlink r:id="rId14" w:history="1">
         <w:r>
@@ -3488,11 +5492,11 @@
         <w:jc w:val="both"/>
       </w:pPr>
       <w:r>
-        <w:t xml:space="preserve">No puede diferirse indefinidamente el control de constitucionalidad cuando el daño se encuentra acreditado en forma concreta en autos y cuando ambas Salas de esta jurisdicción ya han reconocido la afectación producida por la Ley 27.609, difiriendo su tratamiento precisamente para esta etapa ejecutoria. Esta </w:t>
+        <w:t xml:space="preserve">No puede diferirse indefinidamente el control de constitucionalidad cuando el daño se encuentra acreditado en forma concreta en autos y cuando ambas Salas de esta jurisdicción ya han reconocido la afectación producida por la Ley 27.609, difiriendo su tratamiento precisamente para esta etapa ejecutoria. Esta es la instancia procesal en la que el perjuicio se torna mensurable, verificable y jurídicamente exigible. Postergar nuevamente su análisis implicaría convalidar </w:t>
       </w:r>
       <w:r>
         <w:lastRenderedPageBreak/>
-        <w:t>es la instancia procesal en la que el perjuicio se torna mensurable, verificable y jurídicamente exigible. Postergar nuevamente su análisis implicaría convalidar una lesión continuada al derecho de movilidad, consolidando una pérdida patrimonial incompatible con el mandato del art. 14 bis de la Constitución Nacional y con la doctrina de la Corte Suprema que impone a los jueces el deber de hacer prevalecer la supremacía constitucional cuando una norma legal desvirtúa derechos fundamentales.</w:t>
+        <w:t>una lesión continuada al derecho de movilidad, consolidando una pérdida patrimonial incompatible con el mandato del art. 14 bis de la Constitución Nacional y con la doctrina de la Corte Suprema que impone a los jueces el deber de hacer prevalecer la supremacía constitucional cuando una norma legal desvirtúa derechos fundamentales.</w:t>
       </w:r>
     </w:p>
     <w:p>
@@ -3514,7 +5518,23 @@
         <w:jc w:val="both"/>
       </w:pPr>
       <w:r>
-        <w:t xml:space="preserve">En consecuencia, corresponde que V.S. ejerza plenamente el control de constitucionalidad y disponga la recomposición integral del haber previsional para el período en debate, adoptando un criterio de movilidad que preserve efectivamente su poder adquisitivo y garantice la reparación del daño sufrido por mi mandante, en resguardo de la supremacía de la Constitución, del principio de progresividad y de la dignidad humana que debe orientar toda decisión jurisdiccional en materia previsional. {% endif %} {%if inconstitucionalidad_decreto_274_si%} </w:t>
+        <w:t xml:space="preserve">En consecuencia, corresponde que V.S. ejerza plenamente el control de constitucionalidad y disponga la recomposición integral del haber previsional para el período en debate, adoptando un criterio de movilidad que preserve efectivamente su poder adquisitivo y garantice la reparación del daño sufrido por mi mandante, en resguardo de la supremacía de la Constitución, del principio de progresividad y de la dignidad humana que debe orientar toda decisión jurisdiccional en materia previsional. {% </w:t>
+      </w:r>
+      <w:proofErr w:type="spellStart"/>
+      <w:r>
+        <w:t>endif</w:t>
+      </w:r>
+      <w:proofErr w:type="spellEnd"/>
+      <w:r>
+        <w:t xml:space="preserve"> %} {%</w:t>
+      </w:r>
+      <w:proofErr w:type="spellStart"/>
+      <w:r>
+        <w:t>if</w:t>
+      </w:r>
+      <w:proofErr w:type="spellEnd"/>
+      <w:r>
+        <w:t xml:space="preserve"> inconstitucionalidad_decreto_274_si%} </w:t>
       </w:r>
     </w:p>
     <w:p>
@@ -3590,11 +5610,28 @@
         <w:jc w:val="both"/>
       </w:pPr>
       <w:r>
-        <w:t xml:space="preserve">En el mencionado voto disidente de los autos “Cendan”, al analizar la aplicación de la fórmula de la Ley 27.609, se sostiene que la movilidad no puede concebirse como una mera actualización inflacionaria, sino que debe mantener una proporcionalidad razonable entre pasividad y actividad, conforme la doctrina de la Corte Suprema y la interpretación del principio de sustitutividad. En palabras de Bidart Campos, citadas por el magistrado, la movilidad implica mantener una </w:t>
-      </w:r>
+        <w:t xml:space="preserve">En el mencionado voto disidente de los autos “Cendan”, al analizar la aplicación de la fórmula de la Ley 27.609, se sostiene que la movilidad no puede concebirse como una mera actualización inflacionaria, sino que debe mantener una proporcionalidad razonable entre pasividad y actividad, conforme la doctrina de la Corte Suprema y la interpretación del principio de </w:t>
+      </w:r>
+      <w:proofErr w:type="spellStart"/>
+      <w:r>
+        <w:t>sustitutividad</w:t>
+      </w:r>
+      <w:proofErr w:type="spellEnd"/>
+      <w:r>
+        <w:t>. En palabras de Bidart Campos, citadas por el magistrado, la movilidad implica mantener una relación sustitutiva entre el haber de pasividad y el salario en actividad, no sólo su poder adquisitivo nominal.</w:t>
+      </w:r>
+    </w:p>
+    <w:p>
+      <w:pPr>
+        <w:autoSpaceDE w:val="0"/>
+        <w:autoSpaceDN w:val="0"/>
+        <w:adjustRightInd w:val="0"/>
+        <w:ind w:firstLine="1134"/>
+        <w:jc w:val="both"/>
+      </w:pPr>
       <w:r>
         <w:lastRenderedPageBreak/>
-        <w:t>relación sustitutiva entre el haber de pasividad y el salario en actividad, no sólo su poder adquisitivo nominal.</w:t>
+        <w:t>Asimismo, se descarta tanto un índice exclusivamente inflacionario como uno puramente salarial, y en su lugar propicia una pauta mixta, integrada en un 50% por variación de salarios (como el RIPTE) y otro 50% por evolución de precios (IPC), tal como fue admitido en el precedente “Caliva”.</w:t>
       </w:r>
     </w:p>
     <w:p>
@@ -3606,7 +5643,7 @@
         <w:jc w:val="both"/>
       </w:pPr>
       <w:r>
-        <w:t>Asimismo, se descarta tanto un índice exclusivamente inflacionario como uno puramente salarial, y en su lugar propicia una pauta mixta, integrada en un 50% por variación de salarios (como el RIPTE) y otro 50% por evolución de precios (IPC), tal como fue admitido en el precedente “Caliva”.</w:t>
+        <w:t>En ese marco, el nuevo régimen instaurado por el Decreto 274/24 desconoce la necesidad de incorporar el componente salarial en la determinación de la movilidad, con lo cual reproduce el vicio de inconstitucionalidad que afectó a la fórmula anterior, ahora bajo una nueva forma legal, lo que habilita su control judicial, dado que luego de un proceso inflacionario, que debe ser saneado, los salarios tienden a recuperar su poder adquisitivo.</w:t>
       </w:r>
     </w:p>
     <w:p>
@@ -3618,7 +5655,15 @@
         <w:jc w:val="both"/>
       </w:pPr>
       <w:r>
-        <w:t>En ese marco, el nuevo régimen instaurado por el Decreto 274/24 desconoce la necesidad de incorporar el componente salarial en la determinación de la movilidad, con lo cual reproduce el vicio de inconstitucionalidad que afectó a la fórmula anterior, ahora bajo una nueva forma legal, lo que habilita su control judicial, dado que luego de un proceso inflacionario, que debe ser saneado, los salarios tienden a recuperar su poder adquisitivo.</w:t>
+        <w:t xml:space="preserve">Por todo lo expuesto, y sin perjuicio del reconocimiento estatal del perjuicio generado por la Ley 27.609, se solicita que se declare la inconstitucionalidad del Decreto 274/24 en cuanto establece un régimen de movilidad jubilatoria basado exclusivamente en el IPC, por cuanto tal modalidad no garantiza el principio de </w:t>
+      </w:r>
+      <w:proofErr w:type="spellStart"/>
+      <w:r>
+        <w:t>sustitutividad</w:t>
+      </w:r>
+      <w:proofErr w:type="spellEnd"/>
+      <w:r>
+        <w:t>, vulnera la integralidad del haber previsional el cual se aleja del salario real del jubilado y no mantiene su poder en el tiempo y además,  desconoce el estándar mínimo de una movilidad razonable, progresiva y proporcional, conforme surge de los principios de raigambre constitucional, los tratados internacionales con jerarquía constitucional (art. 75 inc. 22 CN), y la doctrina consolidada de la Corte Suprema de Justicia de la Nación.</w:t>
       </w:r>
     </w:p>
     <w:p>
@@ -3628,9 +5673,17 @@
         <w:adjustRightInd w:val="0"/>
         <w:ind w:firstLine="1134"/>
         <w:jc w:val="both"/>
-      </w:pPr>
-      <w:r>
-        <w:t>Por todo lo expuesto, y sin perjuicio del reconocimiento estatal del perjuicio generado por la Ley 27.609, se solicita que se declare la inconstitucionalidad del Decreto 274/24 en cuanto establece un régimen de movilidad jubilatoria basado exclusivamente en el IPC, por cuanto tal modalidad no garantiza el principio de sustitutividad, vulnera la integralidad del haber previsional el cual se aleja del salario real del jubilado y no mantiene su poder en el tiempo y además,  desconoce el estándar mínimo de una movilidad razonable, progresiva y proporcional, conforme surge de los principios de raigambre constitucional, los tratados internacionales con jerarquía constitucional (art. 75 inc. 22 CN), y la doctrina consolidada de la Corte Suprema de Justicia de la Nación.</w:t>
+        <w:rPr>
+          <w:b/>
+          <w:bCs/>
+        </w:rPr>
+      </w:pPr>
+      <w:r>
+        <w:rPr>
+          <w:b/>
+          <w:bCs/>
+        </w:rPr>
+        <w:t>Movilidad Futura</w:t>
       </w:r>
     </w:p>
     <w:p>
@@ -3640,29 +5693,17 @@
         <w:adjustRightInd w:val="0"/>
         <w:ind w:firstLine="1134"/>
         <w:jc w:val="both"/>
-        <w:rPr>
-          <w:b/>
-          <w:bCs/>
-        </w:rPr>
-      </w:pPr>
-      <w:r>
-        <w:rPr>
-          <w:b/>
-          <w:bCs/>
-        </w:rPr>
-        <w:t>Movilidad Futura</w:t>
-      </w:r>
-    </w:p>
-    <w:p>
-      <w:pPr>
-        <w:autoSpaceDE w:val="0"/>
-        <w:autoSpaceDN w:val="0"/>
-        <w:adjustRightInd w:val="0"/>
-        <w:ind w:firstLine="1134"/>
-        <w:jc w:val="both"/>
-      </w:pPr>
-      <w:r>
-        <w:t>Mientras tramito el proceso se suspendió la ley 27.426, se dictó la ley N° 27.609, luego aquella se derogó y se dictó en DNU 274/24. Por lo que ahora la movilidad de los haberes jubilatorios se está dando por DNU, relacionados con la inflación, no siendo esa una facultad del Poder Ejecutivo.</w:t>
+      </w:pPr>
+      <w:r>
+        <w:t xml:space="preserve">Mientras tramito el proceso se suspendió la ley 27.426, se dictó la ley </w:t>
+      </w:r>
+      <w:proofErr w:type="spellStart"/>
+      <w:r>
+        <w:t>N°</w:t>
+      </w:r>
+      <w:proofErr w:type="spellEnd"/>
+      <w:r>
+        <w:t xml:space="preserve"> 27.609, luego aquella se derogó y se dictó en DNU 274/24. Por lo que ahora la movilidad de los haberes jubilatorios se está dando por DNU, relacionados con la inflación, no siendo esa una facultad del Poder Ejecutivo.</w:t>
       </w:r>
     </w:p>
     <w:p>
@@ -3725,10 +5766,42 @@
         <w:t>En consecuencia, corresponde que V.S. ejerza plenamente el control de constitucionalidad y disponga la recomposición integral del haber previsional para el período en debate, adoptando un criterio de movilidad que preserve efectivamente su poder adquisitivo y garantice la reparación del daño sufrido por mi mandante, en resguardo de la supremacía de la Constitución, del principio de progresividad y de la dignidad humana que debe orientar toda decisión jurisdiccional en materia previsional.</w:t>
       </w:r>
       <w:r>
-        <w:t xml:space="preserve"> {% endif %}</w:t>
-      </w:r>
-      <w:r>
-        <w:t>{%if inconstitucionalidad_si%}</w:t>
+        <w:t xml:space="preserve"> {% </w:t>
+      </w:r>
+      <w:proofErr w:type="spellStart"/>
+      <w:r>
+        <w:t>endif</w:t>
+      </w:r>
+      <w:proofErr w:type="spellEnd"/>
+      <w:r>
+        <w:t xml:space="preserve"> </w:t>
+      </w:r>
+      <w:proofErr w:type="gramStart"/>
+      <w:r>
+        <w:t>%}</w:t>
+      </w:r>
+      <w:r>
+        <w:t>{</w:t>
+      </w:r>
+      <w:proofErr w:type="gramEnd"/>
+      <w:r>
+        <w:t>%</w:t>
+      </w:r>
+      <w:proofErr w:type="spellStart"/>
+      <w:r>
+        <w:t>if</w:t>
+      </w:r>
+      <w:proofErr w:type="spellEnd"/>
+      <w:r>
+        <w:t xml:space="preserve"> </w:t>
+      </w:r>
+      <w:proofErr w:type="spellStart"/>
+      <w:r>
+        <w:t>inconstitucionalidad_si</w:t>
+      </w:r>
+      <w:proofErr w:type="spellEnd"/>
+      <w:r>
+        <w:t>%}</w:t>
       </w:r>
     </w:p>
     <w:p>
@@ -4044,7 +6117,55 @@
           <w:lang w:val="es-AR"/>
         </w:rPr>
         <w:lastRenderedPageBreak/>
-        <w:t>Juzgado Federal de Salta N° 2, en “ABRAHAM, RUBÉN DARÍO c/ ANSES s/ Reajustes Varios” (19/10/2022, Expte. N° FSA 25000393/2010), sostuvo que el análisis de las leyes 27.426, 27.541 y 27.609 deviene ineludible cuando incide en la determinación de la movilidad aplicable al haber en ejecución, aclarando que ello no implica exceso jurisdiccional sino aplicación del derecho vigente al momento de resolver.</w:t>
+        <w:t xml:space="preserve">Juzgado Federal de Salta </w:t>
+      </w:r>
+      <w:proofErr w:type="spellStart"/>
+      <w:r>
+        <w:rPr>
+          <w:bCs/>
+          <w:lang w:val="es-AR"/>
+        </w:rPr>
+        <w:t>N°</w:t>
+      </w:r>
+      <w:proofErr w:type="spellEnd"/>
+      <w:r>
+        <w:rPr>
+          <w:bCs/>
+          <w:lang w:val="es-AR"/>
+        </w:rPr>
+        <w:t xml:space="preserve"> 2, en “ABRAHAM, RUBÉN DARÍO c/ ANSES s/ Reajustes Varios” (19/10/2022, </w:t>
+      </w:r>
+      <w:proofErr w:type="spellStart"/>
+      <w:r>
+        <w:rPr>
+          <w:bCs/>
+          <w:lang w:val="es-AR"/>
+        </w:rPr>
+        <w:t>Expte</w:t>
+      </w:r>
+      <w:proofErr w:type="spellEnd"/>
+      <w:r>
+        <w:rPr>
+          <w:bCs/>
+          <w:lang w:val="es-AR"/>
+        </w:rPr>
+        <w:t xml:space="preserve">. </w:t>
+      </w:r>
+      <w:proofErr w:type="spellStart"/>
+      <w:r>
+        <w:rPr>
+          <w:bCs/>
+          <w:lang w:val="es-AR"/>
+        </w:rPr>
+        <w:t>N°</w:t>
+      </w:r>
+      <w:proofErr w:type="spellEnd"/>
+      <w:r>
+        <w:rPr>
+          <w:bCs/>
+          <w:lang w:val="es-AR"/>
+        </w:rPr>
+        <w:t xml:space="preserve"> FSA 25000393/2010), sostuvo que el análisis de las leyes 27.426, 27.541 y 27.609 deviene ineludible cuando incide en la determinación de la movilidad aplicable al haber en ejecución, aclarando que ello no implica exceso jurisdiccional sino aplicación del derecho vigente al momento de resolver.</w:t>
       </w:r>
     </w:p>
     <w:p>
@@ -4064,7 +6185,23 @@
           <w:bCs/>
           <w:lang w:val="es-AR"/>
         </w:rPr>
-        <w:t>La Sala II de la Cámara Federal de Salta, en “GAMARRA, MARÍA DEL HUERTO DOLORES c/ ANSES s/ Reajustes Varios” (26/04/2016), precisó que la cosa juzgada no impide resolver nuevas cuestiones surgidas con posterioridad, sino únicamente el reiterado juzgamiento de las mismas cuestiones ya decididas, destacando que es en la etapa de ejecución (arts. 499 y ccs. CPCCN) donde puede evaluarse la razonabilidad de la aplicación de normas que inciden en la cuantía del haber.</w:t>
+        <w:t xml:space="preserve">La Sala II de la Cámara Federal de Salta, en “GAMARRA, MARÍA DEL HUERTO DOLORES c/ ANSES s/ Reajustes Varios” (26/04/2016), precisó que la cosa juzgada no impide resolver nuevas cuestiones surgidas con posterioridad, sino únicamente el reiterado juzgamiento de las mismas cuestiones ya decididas, destacando que es en la etapa de ejecución (arts. 499 y </w:t>
+      </w:r>
+      <w:proofErr w:type="spellStart"/>
+      <w:r>
+        <w:rPr>
+          <w:bCs/>
+          <w:lang w:val="es-AR"/>
+        </w:rPr>
+        <w:t>ccs</w:t>
+      </w:r>
+      <w:proofErr w:type="spellEnd"/>
+      <w:r>
+        <w:rPr>
+          <w:bCs/>
+          <w:lang w:val="es-AR"/>
+        </w:rPr>
+        <w:t>. CPCCN) donde puede evaluarse la razonabilidad de la aplicación de normas que inciden en la cuantía del haber.</w:t>
       </w:r>
     </w:p>
     <w:p>
@@ -4104,7 +6241,39 @@
           <w:bCs/>
           <w:lang w:val="es-AR"/>
         </w:rPr>
-        <w:t>Finalmente, la Sala II en “Campos Toranzos, Marcos Aurelio c/ ANSES s/ Reajustes Varios” (14/02/2023, Expte. N° 15100257/2012) confirmó la facultad judicial de determinar criterios de movilidad en etapa de ejecución respecto de períodos no contemplados en el pronunciamiento definitivo por razones temporales, con fundamento en la obligación de resolver conforme a las circunstancias actuales, en la naturaleza alimentaria de la prestación y en razones de economía procesal.</w:t>
+        <w:t xml:space="preserve">Finalmente, la Sala II en “Campos Toranzos, Marcos Aurelio c/ ANSES s/ Reajustes Varios” (14/02/2023, </w:t>
+      </w:r>
+      <w:proofErr w:type="spellStart"/>
+      <w:r>
+        <w:rPr>
+          <w:bCs/>
+          <w:lang w:val="es-AR"/>
+        </w:rPr>
+        <w:t>Expte</w:t>
+      </w:r>
+      <w:proofErr w:type="spellEnd"/>
+      <w:r>
+        <w:rPr>
+          <w:bCs/>
+          <w:lang w:val="es-AR"/>
+        </w:rPr>
+        <w:t xml:space="preserve">. </w:t>
+      </w:r>
+      <w:proofErr w:type="spellStart"/>
+      <w:r>
+        <w:rPr>
+          <w:bCs/>
+          <w:lang w:val="es-AR"/>
+        </w:rPr>
+        <w:t>N°</w:t>
+      </w:r>
+      <w:proofErr w:type="spellEnd"/>
+      <w:r>
+        <w:rPr>
+          <w:bCs/>
+          <w:lang w:val="es-AR"/>
+        </w:rPr>
+        <w:t xml:space="preserve"> 15100257/2012) confirmó la facultad judicial de determinar criterios de movilidad en etapa de ejecución respecto de períodos no contemplados en el pronunciamiento definitivo por razones temporales, con fundamento en la obligación de resolver conforme a las circunstancias actuales, en la naturaleza alimentaria de la prestación y en razones de economía procesal.</w:t>
       </w:r>
     </w:p>
     <w:p>
@@ -4169,7 +6338,23 @@
           <w:bCs/>
           <w:lang w:val="es-AR"/>
         </w:rPr>
-        <w:t xml:space="preserve"> {% endif %}</w:t>
+        <w:t xml:space="preserve"> {% </w:t>
+      </w:r>
+      <w:proofErr w:type="spellStart"/>
+      <w:r>
+        <w:rPr>
+          <w:bCs/>
+          <w:lang w:val="es-AR"/>
+        </w:rPr>
+        <w:t>endif</w:t>
+      </w:r>
+      <w:proofErr w:type="spellEnd"/>
+      <w:r>
+        <w:rPr>
+          <w:bCs/>
+          <w:lang w:val="es-AR"/>
+        </w:rPr>
+        <w:t xml:space="preserve"> %}</w:t>
       </w:r>
       <w:r>
         <w:rPr>
@@ -4182,7 +6367,35 @@
         <w:rPr>
           <w:bCs/>
         </w:rPr>
-        <w:t>{% if Tope_Haber_Maximo_Si %}</w:t>
+        <w:t xml:space="preserve">{% </w:t>
+      </w:r>
+      <w:proofErr w:type="spellStart"/>
+      <w:r>
+        <w:rPr>
+          <w:bCs/>
+        </w:rPr>
+        <w:t>if</w:t>
+      </w:r>
+      <w:proofErr w:type="spellEnd"/>
+      <w:r>
+        <w:rPr>
+          <w:bCs/>
+        </w:rPr>
+        <w:t xml:space="preserve"> </w:t>
+      </w:r>
+      <w:proofErr w:type="spellStart"/>
+      <w:r>
+        <w:rPr>
+          <w:bCs/>
+        </w:rPr>
+        <w:t>Tope_Haber_Maximo_Si</w:t>
+      </w:r>
+      <w:proofErr w:type="spellEnd"/>
+      <w:r>
+        <w:rPr>
+          <w:bCs/>
+        </w:rPr>
+        <w:t xml:space="preserve"> %}</w:t>
       </w:r>
     </w:p>
     <w:p>
@@ -4255,11 +6468,25 @@
         <w:t>Note VS El tope del art 9 inc. 3 de la ley 24463 es a</w:t>
       </w:r>
       <w:r>
-        <w:t>l {{</w:t>
-      </w:r>
-      <w:r>
-        <w:t xml:space="preserve"> Fecha_de_cierre_de_intereses</w:t>
-      </w:r>
+        <w:t xml:space="preserve">l </w:t>
+      </w:r>
+      <w:proofErr w:type="gramStart"/>
+      <w:r>
+        <w:t>{{</w:t>
+      </w:r>
+      <w:r>
+        <w:t xml:space="preserve"> </w:t>
+      </w:r>
+      <w:proofErr w:type="spellStart"/>
+      <w:r>
+        <w:t>Fecha</w:t>
+      </w:r>
+      <w:proofErr w:type="gramEnd"/>
+      <w:r>
+        <w:t>_de_cierre_de_intereses</w:t>
+      </w:r>
+      <w:proofErr w:type="spellEnd"/>
+      <w:proofErr w:type="gramStart"/>
       <w:r>
         <w:t xml:space="preserve">}} </w:t>
       </w:r>
@@ -4270,80 +6497,108 @@
         <w:rPr>
           <w:b/>
         </w:rPr>
+        <w:t>{</w:t>
+      </w:r>
+      <w:proofErr w:type="gramEnd"/>
+      <w:r>
+        <w:rPr>
+          <w:b/>
+        </w:rPr>
+        <w:t>{</w:t>
+      </w:r>
+      <w:proofErr w:type="spellStart"/>
+      <w:r>
+        <w:rPr>
+          <w:b/>
+        </w:rPr>
+        <w:t>tope_anses</w:t>
+      </w:r>
+      <w:proofErr w:type="spellEnd"/>
+      <w:r>
+        <w:rPr>
+          <w:b/>
+        </w:rPr>
+        <w:t>}}</w:t>
+      </w:r>
+    </w:p>
+    <w:p>
+      <w:pPr>
+        <w:jc w:val="both"/>
+        <w:rPr>
+          <w:b/>
+        </w:rPr>
+      </w:pPr>
+      <w:r>
+        <w:t>Si se tuviera en cuenta que los $3.100 representaban el 82% de la remuneración máxima sujeta a aportes que era $3.780 (60 ampo de $63), y trajéramos el mismo criterio a hoy, nos daría que el tope del haber máximo debiera ser a</w:t>
+      </w:r>
+      <w:r>
+        <w:t>l</w:t>
+      </w:r>
+      <w:r>
+        <w:t xml:space="preserve"> </w:t>
+      </w:r>
+      <w:proofErr w:type="gramStart"/>
+      <w:r>
         <w:t>{{</w:t>
       </w:r>
       <w:r>
-        <w:rPr>
-          <w:b/>
-        </w:rPr>
-        <w:t>tope_anses</w:t>
-      </w:r>
+        <w:t xml:space="preserve"> </w:t>
+      </w:r>
+      <w:proofErr w:type="spellStart"/>
+      <w:r>
+        <w:t>Fecha</w:t>
+      </w:r>
+      <w:proofErr w:type="gramEnd"/>
+      <w:r>
+        <w:t>_de_cierre_de_intereses</w:t>
+      </w:r>
+      <w:proofErr w:type="spellEnd"/>
+      <w:proofErr w:type="gramStart"/>
+      <w:r>
+        <w:t xml:space="preserve">}} </w:t>
+      </w:r>
+      <w:r>
+        <w:t xml:space="preserve"> del</w:t>
+      </w:r>
+      <w:proofErr w:type="gramEnd"/>
+      <w:r>
+        <w:t xml:space="preserve"> 82% de la remuneración máxima</w:t>
+      </w:r>
+      <w:r>
+        <w:t xml:space="preserve"> es decir</w:t>
+      </w:r>
+      <w:r>
+        <w:rPr>
+          <w:b/>
+        </w:rPr>
+        <w:t xml:space="preserve"> {{</w:t>
+      </w:r>
+      <w:proofErr w:type="spellStart"/>
+      <w:r>
+        <w:rPr>
+          <w:b/>
+        </w:rPr>
+        <w:t>tope_ocheintados_rem_max</w:t>
+      </w:r>
+      <w:proofErr w:type="spellEnd"/>
       <w:r>
         <w:rPr>
           <w:b/>
         </w:rPr>
         <w:t>}}</w:t>
       </w:r>
-    </w:p>
-    <w:p>
-      <w:pPr>
-        <w:jc w:val="both"/>
-        <w:rPr>
-          <w:b/>
-        </w:rPr>
-      </w:pPr>
-      <w:r>
-        <w:t>Si se tuviera en cuenta que los $3.100 representaban el 82% de la remuneración máxima sujeta a aportes que era $3.780 (60 ampo de $63), y trajéramos el mismo criterio a hoy, nos daría que el tope del haber máximo debiera ser a</w:t>
-      </w:r>
-      <w:r>
-        <w:t>l</w:t>
-      </w:r>
-      <w:r>
-        <w:t xml:space="preserve"> </w:t>
-      </w:r>
-      <w:r>
-        <w:t>{{</w:t>
-      </w:r>
-      <w:r>
-        <w:t xml:space="preserve"> Fecha_de_cierre_de_intereses</w:t>
-      </w:r>
+      <w:r>
+        <w:t xml:space="preserve"> un {{</w:t>
+      </w:r>
+      <w:proofErr w:type="spellStart"/>
+      <w:r>
+        <w:t>dif_ocheintados_rem_max_anses</w:t>
+      </w:r>
+      <w:proofErr w:type="spellEnd"/>
       <w:r>
         <w:t xml:space="preserve">}} </w:t>
       </w:r>
       <w:r>
-        <w:t xml:space="preserve"> del 82% de la remuneración máxima</w:t>
-      </w:r>
-      <w:r>
-        <w:t xml:space="preserve"> es decir</w:t>
-      </w:r>
-      <w:r>
-        <w:rPr>
-          <w:b/>
-        </w:rPr>
-        <w:t xml:space="preserve"> {{</w:t>
-      </w:r>
-      <w:r>
-        <w:rPr>
-          <w:b/>
-        </w:rPr>
-        <w:t>tope_ocheintados_rem_max</w:t>
-      </w:r>
-      <w:r>
-        <w:rPr>
-          <w:b/>
-        </w:rPr>
-        <w:t>}}</w:t>
-      </w:r>
-      <w:r>
-        <w:t xml:space="preserve"> un {{</w:t>
-      </w:r>
-      <w:r>
-        <w:t>dif_ocheintados_rem_max_anses</w:t>
-      </w:r>
-      <w:r>
-        <w:t xml:space="preserve">}} </w:t>
-      </w:r>
-      <w:r>
         <w:rPr>
           <w:b/>
         </w:rPr>
@@ -4370,7 +6625,7 @@
           <w:noProof/>
         </w:rPr>
         <w:drawing>
-          <wp:inline distT="0" distB="0" distL="0" distR="0" wp14:anchorId="0A6F4340" wp14:editId="630BDF27">
+          <wp:inline distT="0" distB="0" distL="0" distR="0" wp14:anchorId="0A6F4340" wp14:editId="222C5EAB">
             <wp:extent cx="3710940" cy="3179171"/>
             <wp:effectExtent l="0" t="0" r="3810" b="2540"/>
             <wp:docPr id="507230546" name="Imagen 2" descr="Gráfico, Gráfico de barrasDescripción generada automáticamente con confianza media"/>
@@ -4449,6 +6704,7 @@
         </w:rPr>
         <w:t>{{</w:t>
       </w:r>
+      <w:proofErr w:type="spellStart"/>
       <w:r>
         <w:rPr>
           <w:b/>
@@ -4456,6 +6712,7 @@
         </w:rPr>
         <w:t>dif_haber_reclamado_anses</w:t>
       </w:r>
+      <w:proofErr w:type="spellEnd"/>
       <w:r>
         <w:rPr>
           <w:b/>
@@ -4468,15 +6725,32 @@
           <w:b/>
           <w:u w:val="single"/>
         </w:rPr>
-        <w:t xml:space="preserve">conforme el tope de Anses, es decir un </w:t>
-      </w:r>
+        <w:t xml:space="preserve">conforme el tope de </w:t>
+      </w:r>
+      <w:proofErr w:type="spellStart"/>
       <w:r>
         <w:rPr>
           <w:b/>
           <w:u w:val="single"/>
         </w:rPr>
+        <w:t>Anses</w:t>
+      </w:r>
+      <w:proofErr w:type="spellEnd"/>
+      <w:r>
+        <w:rPr>
+          <w:b/>
+          <w:u w:val="single"/>
+        </w:rPr>
+        <w:t xml:space="preserve">, es decir un </w:t>
+      </w:r>
+      <w:r>
+        <w:rPr>
+          <w:b/>
+          <w:u w:val="single"/>
+        </w:rPr>
         <w:t>{{</w:t>
       </w:r>
+      <w:proofErr w:type="spellStart"/>
       <w:r>
         <w:rPr>
           <w:b/>
@@ -4484,6 +6758,7 @@
         </w:rPr>
         <w:t>porc_haber_reclamado_anses</w:t>
       </w:r>
+      <w:proofErr w:type="spellEnd"/>
       <w:r>
         <w:rPr>
           <w:b/>
@@ -4563,7 +6838,15 @@
         <w:t>S</w:t>
       </w:r>
       <w:r>
-        <w:t>i a los $3.100, que eran a 01/2002, lo actualizamos con las mismas pautas de “Badaro” y aumentos generales de ANSES el tope hoy sería notablemente superior</w:t>
+        <w:t>i a los $3.100, que eran a 01/2002, lo actualizamos con las mismas pautas de “</w:t>
+      </w:r>
+      <w:proofErr w:type="spellStart"/>
+      <w:r>
+        <w:t>Badaro</w:t>
+      </w:r>
+      <w:proofErr w:type="spellEnd"/>
+      <w:r>
+        <w:t>” y aumentos generales de ANSES el tope hoy sería notablemente superior</w:t>
       </w:r>
       <w:r>
         <w:t xml:space="preserve"> $ 2.776.554,87.</w:t>
@@ -4574,7 +6857,15 @@
         <w:jc w:val="both"/>
       </w:pPr>
       <w:r>
-        <w:t>Acá se cuestiona el monto del haber máximo, como así también la quita que se produce tanto por su inadecuada movilidad y como por su aplicación, provocando un daño notorio en el haber, por cuanto si tengo que realizar una quita del 15% sobre un haber máximo no actualizado desde 1995 que se dictó la ley 24463, a mayo de 2006 que se incrementó con el Decreto Nº 764/06, un 11%, resultando el mismo de $3.441. Los aumentos posteriores otorgados a las prestaciones previsionales mediante la Ley 26.198, los Decretos 1346/07, 279/08 y posteriormente en virtud de la ley de movilidad 26.417, se reflejaron en el haber máximo. Pero de 2002 al 05-2006 NO, causando un perjuicio enorme a mi mandante en caso de ser alcanzado por el mismo.</w:t>
+        <w:t xml:space="preserve">Acá se cuestiona el monto del haber máximo, como así también la quita que se produce tanto por su inadecuada movilidad y como por su aplicación, provocando un daño notorio en el haber, por cuanto si tengo que realizar una quita del 15% sobre un haber máximo no actualizado desde 1995 que se dictó la ley 24463, a mayo de 2006 que se incrementó con el Decreto </w:t>
+      </w:r>
+      <w:proofErr w:type="spellStart"/>
+      <w:r>
+        <w:t>Nº</w:t>
+      </w:r>
+      <w:proofErr w:type="spellEnd"/>
+      <w:r>
+        <w:t xml:space="preserve"> 764/06, un 11%, resultando el mismo de $3.441. Los aumentos posteriores otorgados a las prestaciones previsionales mediante la Ley 26.198, los Decretos 1346/07, 279/08 y posteriormente en virtud de la ley de movilidad 26.417, se reflejaron en el haber máximo. Pero de 2002 al 05-2006 NO, causando un perjuicio enorme a mi mandante en caso de ser alcanzado por el mismo.</w:t>
       </w:r>
     </w:p>
     <w:p>
@@ -4588,16 +6879,56 @@
         <w:t xml:space="preserve"> y así se resolvió en “</w:t>
       </w:r>
       <w:r>
-        <w:t>LEONARDUZZI, ROBERTO ATILIO c/ ANSES s/REAJUSTES POR MOVILIDAD” Expte. N° FSA 8762/2022</w:t>
+        <w:t xml:space="preserve">LEONARDUZZI, ROBERTO ATILIO c/ ANSES s/REAJUSTES POR MOVILIDAD” </w:t>
+      </w:r>
+      <w:proofErr w:type="spellStart"/>
+      <w:r>
+        <w:t>Expte</w:t>
+      </w:r>
+      <w:proofErr w:type="spellEnd"/>
+      <w:r>
+        <w:t xml:space="preserve">. </w:t>
+      </w:r>
+      <w:proofErr w:type="spellStart"/>
+      <w:r>
+        <w:t>N°</w:t>
+      </w:r>
+      <w:proofErr w:type="spellEnd"/>
+      <w:r>
+        <w:t xml:space="preserve"> FSA 8762/2022</w:t>
       </w:r>
       <w:r>
         <w:t xml:space="preserve"> e </w:t>
       </w:r>
       <w:r>
-        <w:t>“INCHAURRONDO, JOSE LUIS c/ ANSES s/ REAJUSTES VARIOS” Expte. Nº FSA 379/2020</w:t>
-      </w:r>
-      <w:r>
-        <w:t>, a cuyo fundamentos me remito.</w:t>
+        <w:t xml:space="preserve">“INCHAURRONDO, JOSE LUIS c/ ANSES s/ REAJUSTES VARIOS” </w:t>
+      </w:r>
+      <w:proofErr w:type="spellStart"/>
+      <w:r>
+        <w:t>Expte</w:t>
+      </w:r>
+      <w:proofErr w:type="spellEnd"/>
+      <w:r>
+        <w:t xml:space="preserve">. </w:t>
+      </w:r>
+      <w:proofErr w:type="spellStart"/>
+      <w:r>
+        <w:t>Nº</w:t>
+      </w:r>
+      <w:proofErr w:type="spellEnd"/>
+      <w:r>
+        <w:t xml:space="preserve"> FSA 379/2020</w:t>
+      </w:r>
+      <w:r>
+        <w:t xml:space="preserve">, a </w:t>
+      </w:r>
+      <w:proofErr w:type="gramStart"/>
+      <w:r>
+        <w:t>cuyo fundamentos</w:t>
+      </w:r>
+      <w:proofErr w:type="gramEnd"/>
+      <w:r>
+        <w:t xml:space="preserve"> me remito.</w:t>
       </w:r>
     </w:p>
     <w:p>
@@ -4609,7 +6940,15 @@
         <w:jc w:val="both"/>
       </w:pPr>
       <w:r>
-        <w:t>{% endif %}</w:t>
+        <w:t xml:space="preserve">{% </w:t>
+      </w:r>
+      <w:proofErr w:type="spellStart"/>
+      <w:r>
+        <w:t>endif</w:t>
+      </w:r>
+      <w:proofErr w:type="spellEnd"/>
+      <w:r>
+        <w:t xml:space="preserve"> %}</w:t>
       </w:r>
     </w:p>
     <w:p>
@@ -4711,7 +7050,21 @@
         <w:rPr>
           <w:lang w:val="es-AR"/>
         </w:rPr>
-        <w:t>Asimismo, requiero que dicha intimación se efectúe bajo apercibimiento de aplicar astreintes por cada día de demora en el cumplimiento de la manda judicial, conforme las facultades ordenatorias y disciplinarias conferidas a V.S. por el art. 37 del Código Procesal Civil y Comercial de la Nación, a fin de asegurar la eficacia real de la sentencia y evitar dilaciones indebidas en la percepción de un crédito de naturaleza alimentaria.</w:t>
+        <w:t xml:space="preserve">Asimismo, requiero que dicha intimación se efectúe bajo apercibimiento de aplicar astreintes por cada día de demora en el cumplimiento de la manda judicial, conforme las facultades </w:t>
+      </w:r>
+      <w:proofErr w:type="spellStart"/>
+      <w:r>
+        <w:rPr>
+          <w:lang w:val="es-AR"/>
+        </w:rPr>
+        <w:t>ordenatorias</w:t>
+      </w:r>
+      <w:proofErr w:type="spellEnd"/>
+      <w:r>
+        <w:rPr>
+          <w:lang w:val="es-AR"/>
+        </w:rPr>
+        <w:t xml:space="preserve"> y disciplinarias conferidas a V.S. por el art. 37 del Código Procesal Civil y Comercial de la Nación, a fin de asegurar la eficacia real de la sentencia y evitar dilaciones indebidas en la percepción de un crédito de naturaleza alimentaria.</w:t>
       </w:r>
     </w:p>
     <w:p>
@@ -4878,51 +7231,67 @@
         <w:autoSpaceDE w:val="0"/>
         <w:autoSpaceDN w:val="0"/>
         <w:adjustRightInd w:val="0"/>
+        <w:jc w:val="both"/>
+      </w:pPr>
+    </w:p>
+    <w:p>
+      <w:pPr>
+        <w:autoSpaceDE w:val="0"/>
+        <w:autoSpaceDN w:val="0"/>
+        <w:adjustRightInd w:val="0"/>
+        <w:jc w:val="both"/>
+      </w:pPr>
+      <w:proofErr w:type="gramStart"/>
+      <w:r>
+        <w:t xml:space="preserve">{{ </w:t>
+      </w:r>
+      <w:proofErr w:type="spellStart"/>
+      <w:r>
+        <w:t>cuadro</w:t>
+      </w:r>
+      <w:proofErr w:type="gramEnd"/>
+      <w:r>
+        <w:t>_</w:t>
+      </w:r>
+      <w:proofErr w:type="gramStart"/>
+      <w:r>
+        <w:t>honorarios</w:t>
+      </w:r>
+      <w:proofErr w:type="spellEnd"/>
+      <w:r>
+        <w:t xml:space="preserve"> }</w:t>
+      </w:r>
+      <w:proofErr w:type="gramEnd"/>
+      <w:r>
+        <w:t>}</w:t>
+      </w:r>
+    </w:p>
+    <w:p>
+      <w:pPr>
+        <w:autoSpaceDE w:val="0"/>
+        <w:autoSpaceDN w:val="0"/>
+        <w:adjustRightInd w:val="0"/>
+        <w:jc w:val="both"/>
+      </w:pPr>
+    </w:p>
+    <w:p>
+      <w:pPr>
+        <w:autoSpaceDE w:val="0"/>
+        <w:autoSpaceDN w:val="0"/>
+        <w:adjustRightInd w:val="0"/>
         <w:ind w:firstLine="1134"/>
         <w:jc w:val="both"/>
         <w:rPr>
           <w:lang w:val="es-AR"/>
         </w:rPr>
       </w:pPr>
-    </w:p>
-    <w:p>
-      <w:pPr>
-        <w:autoSpaceDE w:val="0"/>
-        <w:autoSpaceDN w:val="0"/>
-        <w:adjustRightInd w:val="0"/>
-        <w:jc w:val="both"/>
-      </w:pPr>
-      <w:r>
-        <w:t>Cuadro_Uma</w:t>
-      </w:r>
-    </w:p>
-    <w:p>
-      <w:pPr>
-        <w:autoSpaceDE w:val="0"/>
-        <w:autoSpaceDN w:val="0"/>
-        <w:adjustRightInd w:val="0"/>
-        <w:jc w:val="both"/>
-      </w:pPr>
-    </w:p>
-    <w:p>
-      <w:pPr>
-        <w:autoSpaceDE w:val="0"/>
-        <w:autoSpaceDN w:val="0"/>
-        <w:adjustRightInd w:val="0"/>
-        <w:jc w:val="both"/>
-      </w:pPr>
-      <w:r>
+      <w:r>
+        <w:rPr>
+          <w:lang w:val="es-AR"/>
+        </w:rPr>
         <w:lastRenderedPageBreak/>
-        <w:t>{{ cuadro_honorarios }}</w:t>
-      </w:r>
-    </w:p>
-    <w:p>
-      <w:pPr>
-        <w:autoSpaceDE w:val="0"/>
-        <w:autoSpaceDN w:val="0"/>
-        <w:adjustRightInd w:val="0"/>
-        <w:jc w:val="both"/>
-      </w:pPr>
+        <w:t>Solicito expresamente que se respete el honorario mínimo previsto en el art. 16, último párrafo, de la Ley 27.423, norma de orden público de la cual los magistrados no pueden apartarse.</w:t>
+      </w:r>
     </w:p>
     <w:p>
       <w:pPr>
@@ -4939,7 +7308,7 @@
         <w:rPr>
           <w:lang w:val="es-AR"/>
         </w:rPr>
-        <w:t>Solicito expresamente que se respete el honorario mínimo previsto en el art. 16, último párrafo, de la Ley 27.423, norma de orden público de la cual los magistrados no pueden apartarse.</w:t>
+        <w:t>De conformidad con el art. 51 del mismo cuerpo legal, la regulación deberá expresarse en moneda de curso legal y en la cantidad de UMAs que dicho monto represente a la fecha de la resolución, dejándose establecido que el pago será definitivo y cancelatorio únicamente si se abona el equivalente en moneda de curso legal al valor vigente de la UMA al momento del efectivo pago.</w:t>
       </w:r>
     </w:p>
     <w:p>
@@ -4957,7 +7326,7 @@
         <w:rPr>
           <w:lang w:val="es-AR"/>
         </w:rPr>
-        <w:t>De conformidad con el art. 51 del mismo cuerpo legal, la regulación deberá expresarse en moneda de curso legal y en la cantidad de UMAs que dicho monto represente a la fecha de la resolución, dejándose establecido que el pago será definitivo y cancelatorio únicamente si se abona el equivalente en moneda de curso legal al valor vigente de la UMA al momento del efectivo pago.</w:t>
+        <w:t>Cabe recordar que los honorarios profesionales revisten carácter alimentario y gozan de protección constitucional como derivación del derecho de propiedad (art. 17 CN), por lo que su regulación oportuna integra también la tutela judicial efectiva.</w:t>
       </w:r>
     </w:p>
     <w:p>
@@ -4975,25 +7344,21 @@
         <w:rPr>
           <w:lang w:val="es-AR"/>
         </w:rPr>
-        <w:t>Cabe recordar que los honorarios profesionales revisten carácter alimentario y gozan de protección constitucional como derivación del derecho de propiedad (art. 17 CN), por lo que su regulación oportuna integra también la tutela judicial efectiva.</w:t>
-      </w:r>
-    </w:p>
-    <w:p>
-      <w:pPr>
-        <w:autoSpaceDE w:val="0"/>
-        <w:autoSpaceDN w:val="0"/>
-        <w:adjustRightInd w:val="0"/>
-        <w:ind w:firstLine="1134"/>
-        <w:jc w:val="both"/>
-        <w:rPr>
-          <w:lang w:val="es-AR"/>
-        </w:rPr>
-      </w:pPr>
-      <w:r>
-        <w:rPr>
-          <w:lang w:val="es-AR"/>
-        </w:rPr>
-        <w:t>En consecuencia, solicito se regulen los honorarios en esta etapa, conjuntamente con la aprobación del monto, conforme la normativa aplicable.</w:t>
+        <w:t xml:space="preserve">En consecuencia, solicito se regulen los honorarios en esta etapa, </w:t>
+      </w:r>
+      <w:proofErr w:type="gramStart"/>
+      <w:r>
+        <w:rPr>
+          <w:lang w:val="es-AR"/>
+        </w:rPr>
+        <w:t>conjuntamente con</w:t>
+      </w:r>
+      <w:proofErr w:type="gramEnd"/>
+      <w:r>
+        <w:rPr>
+          <w:lang w:val="es-AR"/>
+        </w:rPr>
+        <w:t xml:space="preserve"> la aprobación del monto, conforme la normativa aplicable.</w:t>
       </w:r>
     </w:p>
     <w:p>
@@ -5114,8 +7479,11 @@
         <w:jc w:val="both"/>
       </w:pPr>
       <w:r>
+        <w:t xml:space="preserve">En consecuencia, una vez impuesta y cuantificada dicha obligación, solicito se corra vista a la Caja de Abogados y Procuradores de la Provincia de Salta, a través de la plataforma DEOX, a efectos de que proceda a la verificación </w:t>
+      </w:r>
+      <w:r>
         <w:lastRenderedPageBreak/>
-        <w:t>En consecuencia, una vez impuesta y cuantificada dicha obligación, solicito se corra vista a la Caja de Abogados y Procuradores de la Provincia de Salta, a través de la plataforma DEOX, a efectos de que proceda a la verificación y control del aporte conforme lo establecido en los arts. 51, 53 y 56 del Decreto Ley 15/75 y sus modificatorios.</w:t>
+        <w:t>y control del aporte conforme lo establecido en los arts. 51, 53 y 56 del Decreto Ley 15/75 y sus modificatorios.</w:t>
       </w:r>
     </w:p>
     <w:p>
@@ -5214,7 +7582,15 @@
         <w:jc w:val="both"/>
       </w:pPr>
       <w:r>
-        <w:t>La Corte Suprema ha reconocido que normas originariamente válidas pueden devenir inconstitucionales por el cambio de circunstancias (Fallos “Itzcovich”, “Giménez”), doctrina plenamente aplicable cuando su aplicación concreta compromete derechos fundamentales y vacía de contenido el derecho reconocido.</w:t>
+        <w:t>La Corte Suprema ha reconocido que normas originariamente válidas pueden devenir inconstitucionales por el cambio de circunstancias (Fallos “</w:t>
+      </w:r>
+      <w:proofErr w:type="spellStart"/>
+      <w:r>
+        <w:t>Itzcovich</w:t>
+      </w:r>
+      <w:proofErr w:type="spellEnd"/>
+      <w:r>
+        <w:t>”, “Giménez”), doctrina plenamente aplicable cuando su aplicación concreta compromete derechos fundamentales y vacía de contenido el derecho reconocido.</w:t>
       </w:r>
     </w:p>
     <w:p>
@@ -5225,11 +7601,11 @@
         <w:jc w:val="both"/>
       </w:pPr>
       <w:r>
-        <w:t xml:space="preserve">Aun en el supuesto de que no se admita la actualización plena del capital, corresponde al menos revisar el parámetro de intereses aplicado. En tal sentido, solicito se declare la inaplicabilidad de la denominada “tasa pasiva para </w:t>
+        <w:t xml:space="preserve">Aun en el supuesto de que no se admita la actualización plena del capital, corresponde al menos revisar el parámetro de intereses aplicado. En tal sentido, solicito se declare la inaplicabilidad de la denominada “tasa pasiva para uso de la justicia” (Comunicado BCRA 14290). La propia autoridad emisora —el Banco Central de la República Argentina— reconoció en su Resolución 1/2026 que dicha tasa generó rendimientos reales negativos durante años, que produjo </w:t>
       </w:r>
       <w:r>
         <w:lastRenderedPageBreak/>
-        <w:t>uso de la justicia” (Comunicado BCRA 14290). La propia autoridad emisora —el Banco Central de la República Argentina— reconoció en su Resolución 1/2026 que dicha tasa generó rendimientos reales negativos durante años, que produjo montos sustancialmente inferiores a los que surgen de actualizar valores conforme la inflación, que no preserva el poder adquisitivo y que no cumple adecuadamente la función resarcitoria del interés moratorio. Asimismo, reconoció que fue diseñada bajo un régimen económico completamente distinto y que su metodología quedó desactualizada, motivo por el cual dispuso la publicación de una nueva serie denominada Tasa de Intereses Moratorios (TIM).</w:t>
+        <w:t>montos sustancialmente inferiores a los que surgen de actualizar valores conforme la inflación, que no preserva el poder adquisitivo y que no cumple adecuadamente la función resarcitoria del interés moratorio. Asimismo, reconoció que fue diseñada bajo un régimen económico completamente distinto y que su metodología quedó desactualizada, motivo por el cual dispuso la publicación de una nueva serie denominada Tasa de Intereses Moratorios (TIM).</w:t>
       </w:r>
     </w:p>
     <w:p>
@@ -5427,31 +7803,31 @@
         <w:rPr>
           <w:lang w:val="es-AR"/>
         </w:rPr>
+        <w:t xml:space="preserve">Igualmente, en caso de que VS considere, </w:t>
+      </w:r>
+      <w:r>
+        <w:rPr>
+          <w:lang w:val="es-AR"/>
+        </w:rPr>
+        <w:t>se intime a la demandada a adjuntar el RUB histórico completo de mi mandante, a fin de posibilitar el adecuado control de los pagos efectuados y la correcta determinación de las diferencias reclamadas.</w:t>
+      </w:r>
+    </w:p>
+    <w:p>
+      <w:pPr>
+        <w:autoSpaceDE w:val="0"/>
+        <w:autoSpaceDN w:val="0"/>
+        <w:adjustRightInd w:val="0"/>
+        <w:ind w:firstLine="1134"/>
+        <w:jc w:val="both"/>
+        <w:rPr>
+          <w:lang w:val="es-AR"/>
+        </w:rPr>
+      </w:pPr>
+      <w:r>
+        <w:rPr>
+          <w:lang w:val="es-AR"/>
+        </w:rPr>
         <w:lastRenderedPageBreak/>
-        <w:t xml:space="preserve">Igualmente, en caso de que VS considere, </w:t>
-      </w:r>
-      <w:r>
-        <w:rPr>
-          <w:lang w:val="es-AR"/>
-        </w:rPr>
-        <w:t>se intime a la demandada a adjuntar el RUB histórico completo de mi mandante, a fin de posibilitar el adecuado control de los pagos efectuados y la correcta determinación de las diferencias reclamadas.</w:t>
-      </w:r>
-    </w:p>
-    <w:p>
-      <w:pPr>
-        <w:autoSpaceDE w:val="0"/>
-        <w:autoSpaceDN w:val="0"/>
-        <w:adjustRightInd w:val="0"/>
-        <w:ind w:firstLine="1134"/>
-        <w:jc w:val="both"/>
-        <w:rPr>
-          <w:lang w:val="es-AR"/>
-        </w:rPr>
-      </w:pPr>
-      <w:r>
-        <w:rPr>
-          <w:lang w:val="es-AR"/>
-        </w:rPr>
         <w:t>Finalmente, requiero se ordene a la demandada crear y activar la correspondiente secuencia de ejecución de sentencia en sede administrativa, conforme la sentencia interlocutoria recaída en autos, a fin de asegurar la efectiva implementación del reajuste y evitar dilaciones indebidas.</w:t>
       </w:r>
     </w:p>
@@ -5621,19 +7997,61 @@
         <w:rPr>
           <w:lang w:val="en-US"/>
         </w:rPr>
-        <w:t>Por to</w:t>
-      </w:r>
+        <w:t xml:space="preserve">Por </w:t>
+      </w:r>
+      <w:proofErr w:type="spellStart"/>
       <w:r>
         <w:rPr>
           <w:lang w:val="en-US"/>
         </w:rPr>
-        <w:t xml:space="preserve">do </w:t>
+        <w:t>to</w:t>
       </w:r>
       <w:r>
         <w:rPr>
           <w:lang w:val="en-US"/>
         </w:rPr>
-        <w:t>lo expuesto, a V.S. solicito:</w:t>
+        <w:t>do</w:t>
+      </w:r>
+      <w:proofErr w:type="spellEnd"/>
+      <w:r>
+        <w:rPr>
+          <w:lang w:val="en-US"/>
+        </w:rPr>
+        <w:t xml:space="preserve"> </w:t>
+      </w:r>
+      <w:r>
+        <w:rPr>
+          <w:lang w:val="en-US"/>
+        </w:rPr>
+        <w:t xml:space="preserve">lo </w:t>
+      </w:r>
+      <w:proofErr w:type="spellStart"/>
+      <w:r>
+        <w:rPr>
+          <w:lang w:val="en-US"/>
+        </w:rPr>
+        <w:t>expuesto</w:t>
+      </w:r>
+      <w:proofErr w:type="spellEnd"/>
+      <w:r>
+        <w:rPr>
+          <w:lang w:val="en-US"/>
+        </w:rPr>
+        <w:t xml:space="preserve">, a V.S. </w:t>
+      </w:r>
+      <w:proofErr w:type="spellStart"/>
+      <w:r>
+        <w:rPr>
+          <w:lang w:val="en-US"/>
+        </w:rPr>
+        <w:t>solicito</w:t>
+      </w:r>
+      <w:proofErr w:type="spellEnd"/>
+      <w:r>
+        <w:rPr>
+          <w:lang w:val="en-US"/>
+        </w:rPr>
+        <w:t>:</w:t>
       </w:r>
     </w:p>
     <w:p>
@@ -5721,7 +8139,6 @@
         <w:rPr>
           <w:lang w:val="es-AR"/>
         </w:rPr>
-        <w:lastRenderedPageBreak/>
         <w:t>Se ordene a la demandada crear y activar la correspondiente secuencia de ejecución de sentencia en sede administrativa, conforme la sentencia interlocutoria recaída en autos.</w:t>
       </w:r>
     </w:p>
@@ -5744,13 +8161,119 @@
         <w:rPr>
           <w:lang w:val="en-US"/>
         </w:rPr>
-        <w:t>Se intime a la demandada a adjuntar el RUB histórico completo de mi mandante.</w:t>
-      </w:r>
+        <w:t xml:space="preserve">Se intime a la </w:t>
+      </w:r>
+      <w:proofErr w:type="spellStart"/>
       <w:r>
         <w:rPr>
           <w:lang w:val="en-US"/>
         </w:rPr>
-        <w:t>{%if inconstitucionalidad_si%}</w:t>
+        <w:t>demandada</w:t>
+      </w:r>
+      <w:proofErr w:type="spellEnd"/>
+      <w:r>
+        <w:rPr>
+          <w:lang w:val="en-US"/>
+        </w:rPr>
+        <w:t xml:space="preserve"> </w:t>
+      </w:r>
+      <w:proofErr w:type="gramStart"/>
+      <w:r>
+        <w:rPr>
+          <w:lang w:val="en-US"/>
+        </w:rPr>
+        <w:t>a</w:t>
+      </w:r>
+      <w:proofErr w:type="gramEnd"/>
+      <w:r>
+        <w:rPr>
+          <w:lang w:val="en-US"/>
+        </w:rPr>
+        <w:t xml:space="preserve"> </w:t>
+      </w:r>
+      <w:proofErr w:type="spellStart"/>
+      <w:r>
+        <w:rPr>
+          <w:lang w:val="en-US"/>
+        </w:rPr>
+        <w:t>adjuntar</w:t>
+      </w:r>
+      <w:proofErr w:type="spellEnd"/>
+      <w:r>
+        <w:rPr>
+          <w:lang w:val="en-US"/>
+        </w:rPr>
+        <w:t xml:space="preserve"> </w:t>
+      </w:r>
+      <w:proofErr w:type="spellStart"/>
+      <w:r>
+        <w:rPr>
+          <w:lang w:val="en-US"/>
+        </w:rPr>
+        <w:t>el</w:t>
+      </w:r>
+      <w:proofErr w:type="spellEnd"/>
+      <w:r>
+        <w:rPr>
+          <w:lang w:val="en-US"/>
+        </w:rPr>
+        <w:t xml:space="preserve"> RUB histórico </w:t>
+      </w:r>
+      <w:proofErr w:type="spellStart"/>
+      <w:r>
+        <w:rPr>
+          <w:lang w:val="en-US"/>
+        </w:rPr>
+        <w:t>completo</w:t>
+      </w:r>
+      <w:proofErr w:type="spellEnd"/>
+      <w:r>
+        <w:rPr>
+          <w:lang w:val="en-US"/>
+        </w:rPr>
+        <w:t xml:space="preserve"> de mi </w:t>
+      </w:r>
+      <w:proofErr w:type="spellStart"/>
+      <w:proofErr w:type="gramStart"/>
+      <w:r>
+        <w:rPr>
+          <w:lang w:val="en-US"/>
+        </w:rPr>
+        <w:t>mandante</w:t>
+      </w:r>
+      <w:proofErr w:type="spellEnd"/>
+      <w:r>
+        <w:rPr>
+          <w:lang w:val="en-US"/>
+        </w:rPr>
+        <w:t>.</w:t>
+      </w:r>
+      <w:r>
+        <w:rPr>
+          <w:lang w:val="en-US"/>
+        </w:rPr>
+        <w:t>{</w:t>
+      </w:r>
+      <w:proofErr w:type="gramEnd"/>
+      <w:r>
+        <w:rPr>
+          <w:lang w:val="en-US"/>
+        </w:rPr>
+        <w:t xml:space="preserve">%if </w:t>
+      </w:r>
+      <w:proofErr w:type="spellStart"/>
+      <w:r>
+        <w:rPr>
+          <w:lang w:val="en-US"/>
+        </w:rPr>
+        <w:t>inconstitucionalidad_si</w:t>
+      </w:r>
+      <w:proofErr w:type="spellEnd"/>
+      <w:r>
+        <w:rPr>
+          <w:lang w:val="en-US"/>
+        </w:rPr>
+        <w:t>%}</w:t>
       </w:r>
     </w:p>
     <w:p>
@@ -5765,16 +8288,169 @@
         <w:ind w:left="0" w:firstLine="1134"/>
         <w:jc w:val="both"/>
         <w:rPr>
-          <w:highlight w:val="yellow"/>
-          <w:lang w:val="es-AR"/>
-        </w:rPr>
-      </w:pPr>
-      <w:r>
-        <w:rPr>
-          <w:highlight w:val="yellow"/>
-          <w:lang w:val="es-AR"/>
-        </w:rPr>
-        <w:t>Se declare la inconstitucionalidad {%if inconstitucionalidad_27426_si%} de la Ley 27.426, {% endif %} {%if inconstitucionalidad_27541_si%} Ley 27.541, {% endif %} {%if inconstitucionalidad_27609%} 27.609 {% endif %} {%if inconstitucionalidad_decreto_274_si%}  del Decreto 274/24  {% endif %} para el período en debate, disponiendo una movilidad que preserve efectivamente el poder adquisitivo del haber previsional. {% endif %}</w:t>
+          <w:lang w:val="es-AR"/>
+        </w:rPr>
+      </w:pPr>
+      <w:r>
+        <w:rPr>
+          <w:lang w:val="es-AR"/>
+        </w:rPr>
+        <w:lastRenderedPageBreak/>
+        <w:t>Se declare la inconstitucionalidad {%</w:t>
+      </w:r>
+      <w:proofErr w:type="spellStart"/>
+      <w:r>
+        <w:rPr>
+          <w:lang w:val="es-AR"/>
+        </w:rPr>
+        <w:t>if</w:t>
+      </w:r>
+      <w:proofErr w:type="spellEnd"/>
+      <w:r>
+        <w:rPr>
+          <w:lang w:val="es-AR"/>
+        </w:rPr>
+        <w:t xml:space="preserve"> inconstitucionalidad_27426_si%} de la Ley 27.426, {% </w:t>
+      </w:r>
+      <w:proofErr w:type="spellStart"/>
+      <w:r>
+        <w:rPr>
+          <w:lang w:val="es-AR"/>
+        </w:rPr>
+        <w:t>endif</w:t>
+      </w:r>
+      <w:proofErr w:type="spellEnd"/>
+      <w:r>
+        <w:rPr>
+          <w:lang w:val="es-AR"/>
+        </w:rPr>
+        <w:t xml:space="preserve"> %} {%</w:t>
+      </w:r>
+      <w:proofErr w:type="spellStart"/>
+      <w:r>
+        <w:rPr>
+          <w:lang w:val="es-AR"/>
+        </w:rPr>
+        <w:t>if</w:t>
+      </w:r>
+      <w:proofErr w:type="spellEnd"/>
+      <w:r>
+        <w:rPr>
+          <w:lang w:val="es-AR"/>
+        </w:rPr>
+        <w:t xml:space="preserve"> inconstitucionalidad_27541_si%} Ley 27.541, {% </w:t>
+      </w:r>
+      <w:proofErr w:type="spellStart"/>
+      <w:r>
+        <w:rPr>
+          <w:lang w:val="es-AR"/>
+        </w:rPr>
+        <w:t>endif</w:t>
+      </w:r>
+      <w:proofErr w:type="spellEnd"/>
+      <w:r>
+        <w:rPr>
+          <w:lang w:val="es-AR"/>
+        </w:rPr>
+        <w:t xml:space="preserve"> %} {%</w:t>
+      </w:r>
+      <w:proofErr w:type="spellStart"/>
+      <w:r>
+        <w:rPr>
+          <w:lang w:val="es-AR"/>
+        </w:rPr>
+        <w:t>if</w:t>
+      </w:r>
+      <w:proofErr w:type="spellEnd"/>
+      <w:r>
+        <w:rPr>
+          <w:lang w:val="es-AR"/>
+        </w:rPr>
+        <w:t xml:space="preserve"> inconstitucionalidad_27609%} 27.609 {% </w:t>
+      </w:r>
+      <w:proofErr w:type="spellStart"/>
+      <w:r>
+        <w:rPr>
+          <w:lang w:val="es-AR"/>
+        </w:rPr>
+        <w:t>endif</w:t>
+      </w:r>
+      <w:proofErr w:type="spellEnd"/>
+      <w:r>
+        <w:rPr>
+          <w:lang w:val="es-AR"/>
+        </w:rPr>
+        <w:t xml:space="preserve"> %} {%</w:t>
+      </w:r>
+      <w:proofErr w:type="spellStart"/>
+      <w:r>
+        <w:rPr>
+          <w:lang w:val="es-AR"/>
+        </w:rPr>
+        <w:t>if</w:t>
+      </w:r>
+      <w:proofErr w:type="spellEnd"/>
+      <w:r>
+        <w:rPr>
+          <w:lang w:val="es-AR"/>
+        </w:rPr>
+        <w:t xml:space="preserve"> inconstitucionalidad_decreto_274_si</w:t>
+      </w:r>
+      <w:proofErr w:type="gramStart"/>
+      <w:r>
+        <w:rPr>
+          <w:lang w:val="es-AR"/>
+        </w:rPr>
+        <w:t>%}  del</w:t>
+      </w:r>
+      <w:proofErr w:type="gramEnd"/>
+      <w:r>
+        <w:rPr>
+          <w:lang w:val="es-AR"/>
+        </w:rPr>
+        <w:t xml:space="preserve"> Decreto 274/</w:t>
+      </w:r>
+      <w:proofErr w:type="gramStart"/>
+      <w:r>
+        <w:rPr>
+          <w:lang w:val="es-AR"/>
+        </w:rPr>
+        <w:t>24  {</w:t>
+      </w:r>
+      <w:proofErr w:type="gramEnd"/>
+      <w:r>
+        <w:rPr>
+          <w:lang w:val="es-AR"/>
+        </w:rPr>
+        <w:t xml:space="preserve">% </w:t>
+      </w:r>
+      <w:proofErr w:type="spellStart"/>
+      <w:r>
+        <w:rPr>
+          <w:lang w:val="es-AR"/>
+        </w:rPr>
+        <w:t>endif</w:t>
+      </w:r>
+      <w:proofErr w:type="spellEnd"/>
+      <w:r>
+        <w:rPr>
+          <w:lang w:val="es-AR"/>
+        </w:rPr>
+        <w:t xml:space="preserve"> %} para el período en debate, disponiendo una movilidad que preserve efectivamente el poder adquisitivo del haber previsional. {% </w:t>
+      </w:r>
+      <w:proofErr w:type="spellStart"/>
+      <w:r>
+        <w:rPr>
+          <w:lang w:val="es-AR"/>
+        </w:rPr>
+        <w:t>endif</w:t>
+      </w:r>
+      <w:proofErr w:type="spellEnd"/>
+      <w:r>
+        <w:rPr>
+          <w:lang w:val="es-AR"/>
+        </w:rPr>
+        <w:t xml:space="preserve"> %}</w:t>
       </w:r>
     </w:p>
     <w:p>
@@ -5799,7 +8475,21 @@
         <w:rPr>
           <w:lang w:val="es-AR"/>
         </w:rPr>
-        <w:t>Se regulen los honorarios profesionales correspondientes a esta etapa, conjuntamente con la aprobación del monto, conforme lo dispuesto por los arts. 16, 22, 23, 24, 51 y 52 de la Ley 27.423.</w:t>
+        <w:t xml:space="preserve">Se regulen los honorarios profesionales correspondientes a esta etapa, </w:t>
+      </w:r>
+      <w:proofErr w:type="gramStart"/>
+      <w:r>
+        <w:rPr>
+          <w:lang w:val="es-AR"/>
+        </w:rPr>
+        <w:t>conjuntamente con</w:t>
+      </w:r>
+      <w:proofErr w:type="gramEnd"/>
+      <w:r>
+        <w:rPr>
+          <w:lang w:val="es-AR"/>
+        </w:rPr>
+        <w:t xml:space="preserve"> la aprobación del monto, conforme lo dispuesto por los arts. 16, 22, 23, 24, 51 y 52 de la Ley 27.423.</w:t>
       </w:r>
     </w:p>
     <w:p>

</xml_diff>